<commit_message>
Review rounds 6-7: correct ablation direction, compact stats, data-driven claims, figure fixes
Co-Authored-By: Claude Opus 5.5 <noreply@anthropic.com>
Claude-Session: https://claude.ai/code/session_01N37jqkuXFqBzMgdEb5bNnp
</commit_message>
<xml_diff>
--- a/Target_Journal_Submission/manuscript/Final_Manuscript.docx
+++ b/Target_Journal_Submission/manuscript/Final_Manuscript.docx
@@ -8261,7 +8261,7 @@
         <w:pStyle w:val="FirstParagraph"/>
       </w:pPr>
       <w:r>
-        <w:t xml:space="preserve">Table 3 compares LOOM with five-member ensembles and the two raw-series probabilistic classifiers on the official split. On clean data LOOM is worse than PreVal, 5-seed ensemble (W/D/L 31/0/83; Δ = -0.020 [-0.030, -0.012]; r_rb = -0.46; p &lt; 0.001), better than QUANT (W/D/L 69/0/43; Δ = +0.028 [+0.004, +0.062]; r_rb = 0.31; p = 0.005) and better than Arsenal (W/D/L 92/0/19; Δ = +1.404 [+0.923, +1.981]; r_rb = 0.93; p &lt; 0.001). Under corruption (severity-3 conditions for the Arsenal, all 18 for the others), LOOM is better than PreVal, 5-seed ensemble (W/D/L 95/0/19; Δ = +0.255 [+0.183, +0.431]; r_rb = 0.86; p &lt; 0.001), not significantly different from QUANT (W/D/L 46/0/66; Δ = -0.030 [-0.070, +0.001]; r_rb = -0.15; p = 0.181) and better than Arsenal (W/D/L 110/0/1; Δ = +6.301 [+5.364, +7.223]; r_rb = 1.00; p &lt; 0.001). Averaging five LOOM models gives a median clean NLL of 0.329 and a corrupted NLL of 0.785.</w:t>
+        <w:t xml:space="preserve">Table 3 compares LOOM with five-member ensembles and the two raw-series probabilistic classifiers on the official split. On clean data LOOM is worse than PreVal, 5-seed ensemble (W/D/L 31/0/83; Δ = -0.020 [-0.030, -0.012]; r_rb = -0.46; p &lt; 0.001), better than QUANT (W/D/L 69/0/43; Δ = +0.028 [+0.004, +0.062]; r_rb = 0.31; p = 0.005) and better than Arsenal (W/D/L 92/0/19; Δ = +1.404 [+0.923, +1.981]; r_rb = 0.93; p &lt; 0.001). Under corruption (severity-3 conditions for the Arsenal, all 18 for the others), LOOM is better than PreVal, 5-seed ensemble (W/D/L 95/0/19; Δ = +0.255 [+0.183, +0.431]; r_rb = 0.86; p &lt; 0.001), not significantly different from QUANT (W/D/L 46/0/66; Δ = -0.030 [-0.070, +0.001]; r_rb = -0.15; p = 0.181) and better than Arsenal (W/D/L 110/0/1; Δ = +6.301 [+5.364, +7.223]; r_rb = 1.00; p &lt; 0.001). The overall parity with QUANT hides a dependence on the corruption type (Fig. 4): at severity 3, QUANT has the lower median NLL for baseline wander, missing segments and spikes, and LOOM for Gaussian noise, time warping and circular shifts. We did not investigate the cause of this difference; it concerns the feature representation (raw-series quantiles versus random convolutions) rather than the readout, so LOOM-style moderation of a QUANT-like model is a possible extension. Averaging five LOOM models gives a median clean NLL of 0.329 and a corrupted NLL of 0.785.</w:t>
       </w:r>
     </w:p>
     <w:p>
@@ -9674,7 +9674,7 @@
       <w:r>
         <w:drawing>
           <wp:inline>
-            <wp:extent cx="5753100" cy="2281925"/>
+            <wp:extent cx="5753100" cy="2278646"/>
             <wp:effectExtent b="0" l="0" r="0" t="0"/>
             <wp:docPr descr="Fig. 7 Ablation: median paired NLL difference (variant − LOOM) with bootstrap 95 % confidence intervals on clean data (left) and under corruption (right); positive values mean the variant is worse" title="" id="62" name="Picture"/>
             <a:graphic>
@@ -9695,7 +9695,7 @@
                   <pic:spPr bwMode="auto">
                     <a:xfrm>
                       <a:off x="0" y="0"/>
-                      <a:ext cx="5753100" cy="2281925"/>
+                      <a:ext cx="5753100" cy="2278646"/>
                     </a:xfrm>
                     <a:prstGeom prst="rect">
                       <a:avLst/>
@@ -9757,7 +9757,7 @@
         <w:t xml:space="preserve"> </w:t>
       </w:r>
       <w:r>
-        <w:t xml:space="preserve">With MultiRocket features (official split, clean and severity-3 conditions), LOOM is better than PreVal (W/D/L 40/0/2; Δ = +5.668 [+3.798, +8.530]; r_rb = 0.99; p &lt; 0.001) under corruption and not significantly different from PreVal (W/D/L 20/0/22; Δ = -0.001 [-0.009, +0.007]; r_rb = -0.02; p = 0.902) on clean data. With Hydra features the corresponding comparisons are better than PreVal (W/D/L 41/0/0; Δ = +7.913 [+1.565, +9.061]; r_rb = 1.00; p &lt; 0.001) and not significantly different from PreVal (W/D/L 20/0/21; Δ = -0.001 [-0.005, +0.008]; r_rb = 0.05; p = 0.788).</w:t>
+        <w:t xml:space="preserve">With MultiRocket features (official split, clean and severity-3 conditions), LOOM is better than PreVal (W/D/L 42/0/2; Δ = +6.137 [+4.047, +8.291]; r_rb = 0.99; p &lt; 0.001) under corruption and not significantly different from PreVal (W/D/L 20/0/24; Δ = -0.002 [-0.009, +0.006]; r_rb = -0.06; p = 0.733) on clean data. With Hydra features the corresponding comparisons are better than PreVal (W/D/L 43/0/0; Δ = +7.913 [+1.565, +9.061]; r_rb = 1.00; p &lt; 0.001) and not significantly different from PreVal (W/D/L 22/0/21; Δ = +0.004 [-0.004, +0.009]; r_rb = 0.13; p = 0.476).</w:t>
       </w:r>
     </w:p>
     <w:p>
@@ -12227,7 +12227,7 @@
         <w:t xml:space="preserve">(Dempster et al. 2025)</w:t>
       </w:r>
       <w:r>
-        <w:t xml:space="preserve">, and our in-distribution results agree: the two are statistically indistinguishable in NLL on clean data. The difference appears when the test data move. A global scale factor keeps the confidence of a corrupted series at the level appropriate for clean data, so its NLL deteriorates quickly (median 1.728 averaged over the corruptions). LOOM uses the second exact LOO quantity, the held-out leverage, to put each prediction on the scale of its own predictive uncertainty. Its median NLL under corruption is 0.738, and its confidence separates corrupted from clean inputs better than any other readout and than QUANT (median shift AUROC 0.765 vs 0.711 for QUANT, the strongest competitor). Under corruption, QUANT, a tree ensemble on raw-series quantile features, reaches a similar NLL (0.716; not significantly different from LOOM), but at a higher clean NLL and 8.8 times the median fit time (Tables 1 and 5). The ablation attributes the gain to the leverage moderation: PreVal with the same target smoothing remains far behind under corruption. It also shows that the exact LOO pairs matter, since fitting the same calibrator on in-sample pairs or on a hold-out split is clearly worse.</w:t>
+        <w:t xml:space="preserve">, and our in-distribution results agree: the two are statistically indistinguishable in NLL on clean data. The difference appears when the test data move. A global scale factor keeps the confidence of a corrupted series at the level appropriate for clean data, so its NLL deteriorates quickly (median 1.728 averaged over the corruptions). LOOM uses the second exact LOO quantity, the held-out leverage, to put each prediction on the scale of its own predictive uncertainty. Its median NLL under corruption is 0.738, and its confidence separates corrupted from clean inputs better than any other readout and than QUANT (median shift AUROC 0.765 vs 0.711 for QUANT, the strongest competitor). Under corruption, QUANT, a tree ensemble on raw-series quantile features, reaches a similar NLL (0.716; not significantly different from LOOM), but at a higher clean NLL and about 4.0 times the median end-to-end fit time of LOOM including the MiniRocket transform (Tables 1 and 5). The ablation attributes the gain to the leverage moderation: PreVal with the same target smoothing remains far behind under corruption. It also shows that the exact LOO pairs matter, since fitting the same calibrator on in-sample pairs or on a hold-out split is clearly worse.</w:t>
       </w:r>
     </w:p>
     <w:p>

</xml_diff>

<commit_message>
Review round 8: like-for-like severity-3 comparison with Arsenal/QUANT, Brier score, honest QUANT result
Co-Authored-By: Claude Opus 5.5 <noreply@anthropic.com>
Claude-Session: https://claude.ai/code/session_01N37jqkuXFqBzMgdEb5bNnp
</commit_message>
<xml_diff>
--- a/Target_Journal_Submission/manuscript/Final_Manuscript.docx
+++ b/Target_Journal_Submission/manuscript/Final_Manuscript.docx
@@ -97,7 +97,7 @@
         <w:t xml:space="preserve"> </w:t>
       </w:r>
       <w:r>
-        <w:t xml:space="preserve">Random convolutional kernel classifiers such as MiniRocket are accurate and fast, but their ridge readout returns scores rather than probabilities, and existing calibrations apply one global transformation that remains confident when test data drift. We propose LOOM, a closed-form probabilistic readout that divides each ridge logit by the square root of its leverage, the predictive variance factor of the equivalent Bayesian linear model, and fits a single temperature and the ridge penalty on exact leave-one-out pairs of scores and held-out leverages. LOOM needs one thin singular value decomposition, no held-out data, no refitting and no ensembles. The same identities yield exact jackknife+ prediction sets without refitting. On 114 UCR datasets with five resamples and a pre-registered benchmark of 18 test-time corruptions, LOOM matches the strongest closed-form baseline on clean data in negative log-likelihood (NLL), although target smoothing raises its expected calibration error. Under corruption it lowers the median NLL from 1.73 to 0.74, is better on 108 of 114 datasets (Holm-adjusted Wilcoxon p &lt; 0.001), is on par with the tree-based QUANT classifier, and raises the AUROC for detecting corrupted inputs from 0.56 to 0.77. Under a natural cross-axis sensor shift that barely changes leverage, the gain is small. Its clean jackknife+ sets reach 0.90 coverage at a nominal 0.90 with smaller sets than split conformal prediction. Code and all results are publicly available.</w:t>
+        <w:t xml:space="preserve">Random convolutional kernel classifiers such as MiniRocket are accurate and fast, but their ridge readout returns scores rather than probabilities, and existing calibrations apply one global transformation that remains confident when test data drift. We propose LOOM, a closed-form probabilistic readout that divides each ridge logit by the square root of its leverage, the predictive variance factor of the equivalent Bayesian linear model, and fits a single temperature and the ridge penalty on exact leave-one-out pairs of scores and held-out leverages. LOOM needs one thin singular value decomposition, no held-out data, no refitting and no ensembles. The same identities yield exact jackknife+ prediction sets without refitting. On 114 UCR datasets with five resamples and a pre-registered benchmark of 18 test-time corruptions, LOOM matches the strongest closed-form baseline on clean data in negative log-likelihood (NLL), although target smoothing raises its expected calibration error. Under corruption it lowers the median NLL from 1.73 to 0.74, is better on 108 of 114 datasets (Holm-adjusted Wilcoxon p &lt; 0.001), is on par with the tree-based QUANT classifier on average but worse than it under the strongest corruptions, and raises the AUROC for detecting corrupted inputs from 0.56 to 0.77. Under a natural cross-axis sensor shift that barely changes leverage, the gain is small. Its clean jackknife+ sets reach 0.90 coverage at a nominal 0.90 with smaller sets than split conformal prediction. Code and all results are publicly available.</w:t>
       </w:r>
     </w:p>
     <w:p>
@@ -559,7 +559,7 @@
         <w:pStyle w:val="FirstParagraph"/>
       </w:pPr>
       <w:r>
-        <w:t xml:space="preserve">We also report where LOOM does not help: its in-distribution advantage is small, smoothing of the calibration targets costs some in-distribution calibration error, and LAC prediction sets can become empty under shift.</w:t>
+        <w:t xml:space="preserve">We also report where LOOM does not help: its in-distribution advantage is small, smoothing of the calibration targets costs some in-distribution calibration error, a tree-based raw-series classifier (QUANT) is more robust to the strongest corruptions, shifts that leave the random-kernel features in the span of the training data are not detected, and LAC prediction sets can become empty under shift.</w:t>
       </w:r>
     </w:p>
     <w:bookmarkEnd w:id="20"/>
@@ -3521,7 +3521,7 @@
       <w:r>
         <w:drawing>
           <wp:inline>
-            <wp:extent cx="5159173" cy="1807392"/>
+            <wp:extent cx="5159173" cy="1948069"/>
             <wp:effectExtent b="0" l="0" r="0" t="0"/>
             <wp:docPr descr="Fig. 1 Overview of LOOM. One thin SVD of the standardised random-kernel features gives, for every candidate penalty λ, the exact leave-one-out logits and held-out leverages; λ and the temperature a are fitted on these pairs. At test time the logits are divided by the square root of the relative leverage, and exact leave-one-out models give jackknife+ prediction sets" title="" id="32" name="Picture"/>
             <a:graphic>
@@ -3542,7 +3542,7 @@
                   <pic:spPr bwMode="auto">
                     <a:xfrm>
                       <a:off x="0" y="0"/>
-                      <a:ext cx="5159173" cy="1807392"/>
+                      <a:ext cx="5159173" cy="1948069"/>
                     </a:xfrm>
                     <a:prstGeom prst="rect">
                       <a:avLst/>
@@ -8124,7 +8124,7 @@
           <wp:inline>
             <wp:extent cx="5465445" cy="2480007"/>
             <wp:effectExtent b="0" l="0" r="0" t="0"/>
-            <wp:docPr descr="Fig. 5 Per-dataset NLL of LOOM versus PreVal on clean data (left) and averaged over the 18 corruption conditions (right); points below the diagonal favour LOOM" title="" id="54" name="Picture"/>
+            <wp:docPr descr="Fig. 5 Per-dataset NLL of LOOM versus PreVal on clean data (left) and averaged over the 18 corruption conditions (right); points below the diagonal favour LOOM. NLL values below 10⁻³ (datasets whose LOO predictions separate the classes perfectly, where unsmoothed PreVal becomes almost deterministic) are drawn at 10⁻³" title="" id="54" name="Picture"/>
             <a:graphic>
               <a:graphicData uri="http://schemas.openxmlformats.org/drawingml/2006/picture">
                 <pic:pic>
@@ -8177,7 +8177,7 @@
         <w:t xml:space="preserve"> </w:t>
       </w:r>
       <w:r>
-        <w:t xml:space="preserve">Per-dataset NLL of LOOM versus PreVal on clean data (left) and averaged over the 18 corruption conditions (right); points below the diagonal favour LOOM</w:t>
+        <w:t xml:space="preserve">Per-dataset NLL of LOOM versus PreVal on clean data (left) and averaged over the 18 corruption conditions (right); points below the diagonal favour LOOM. NLL values below 10⁻³ (datasets whose LOO predictions separate the classes perfectly, where unsmoothed PreVal becomes almost deterministic) are drawn at 10⁻³</w:t>
       </w:r>
     </w:p>
     <w:p>
@@ -8190,7 +8190,7 @@
           <wp:inline>
             <wp:extent cx="5465445" cy="2322879"/>
             <wp:effectExtent b="0" l="0" r="0" t="0"/>
-            <wp:docPr descr="Fig. 6 Reliability diagrams pooled over all datasets and resamples for clean test data (left) and severity-3 corruptions (right)" title="" id="57" name="Picture"/>
+            <wp:docPr descr="Fig. 6 Reliability diagrams pooled over all datasets and resamples for clean test data (left) and severity-3 corruptions (right). Bins with fewer than 200 pooled test predictions are not drawn; the pooled ECE in the legend uses all bins and differs from the per-dataset ECE medians of Tables 1–2" title="" id="57" name="Picture"/>
             <a:graphic>
               <a:graphicData uri="http://schemas.openxmlformats.org/drawingml/2006/picture">
                 <pic:pic>
@@ -8243,7 +8243,7 @@
         <w:t xml:space="preserve"> </w:t>
       </w:r>
       <w:r>
-        <w:t xml:space="preserve">Reliability diagrams pooled over all datasets and resamples for clean test data (left) and severity-3 corruptions (right)</w:t>
+        <w:t xml:space="preserve">Reliability diagrams pooled over all datasets and resamples for clean test data (left) and severity-3 corruptions (right). Bins with fewer than 200 pooled test predictions are not drawn; the pooled ECE in the legend uses all bins and differs from the per-dataset ECE medians of Tables 1–2</w:t>
       </w:r>
     </w:p>
     <w:bookmarkEnd w:id="59"/>
@@ -8261,7 +8261,7 @@
         <w:pStyle w:val="FirstParagraph"/>
       </w:pPr>
       <w:r>
-        <w:t xml:space="preserve">Table 3 compares LOOM with five-member ensembles and the two raw-series probabilistic classifiers on the official split. On clean data LOOM is worse than PreVal, 5-seed ensemble (W/D/L 31/0/83; Δ = -0.020 [-0.030, -0.012]; r_rb = -0.46; p &lt; 0.001), better than QUANT (W/D/L 69/0/43; Δ = +0.028 [+0.004, +0.062]; r_rb = 0.31; p = 0.005) and better than Arsenal (W/D/L 92/0/19; Δ = +1.404 [+0.923, +1.981]; r_rb = 0.93; p &lt; 0.001). Under corruption (severity-3 conditions for the Arsenal, all 18 for the others), LOOM is better than PreVal, 5-seed ensemble (W/D/L 95/0/19; Δ = +0.255 [+0.183, +0.431]; r_rb = 0.86; p &lt; 0.001), not significantly different from QUANT (W/D/L 46/0/66; Δ = -0.030 [-0.070, +0.001]; r_rb = -0.15; p = 0.181) and better than Arsenal (W/D/L 110/0/1; Δ = +6.301 [+5.364, +7.223]; r_rb = 1.00; p &lt; 0.001). The overall parity with QUANT hides a dependence on the corruption type (Fig. 4): at severity 3, QUANT has the lower median NLL for baseline wander, missing segments and spikes, and LOOM for Gaussian noise, time warping and circular shifts. We did not investigate the cause of this difference; it concerns the feature representation (raw-series quantiles versus random convolutions) rather than the readout, so LOOM-style moderation of a QUANT-like model is a possible extension. Averaging five LOOM models gives a median clean NLL of 0.329 and a corrupted NLL of 0.785.</w:t>
+        <w:t xml:space="preserve">Table 3 compares LOOM with five-member ensembles and the two raw-series probabilistic classifiers on the official split. On clean data LOOM is worse than PreVal, 5-seed ensemble (W/D/L 31/0/83; Δ = -0.020 [-0.030, -0.012]; r_rb = -0.46; p &lt; 0.001), better than QUANT (W/D/L 69/0/43; Δ = +0.028 [+0.004, +0.062]; r_rb = 0.31; p = 0.005) and better than Arsenal (W/D/L 92/0/19; Δ = +1.404 [+0.923, +1.981]; r_rb = 0.93; p &lt; 0.001). Because the Arsenal was evaluated on clean and severity-3 data only, the corrupted-data comparison in this section uses the six severity-3 conditions for every method (a correction made after the results were first inspected, when an earlier version had averaged the other methods over all 18 conditions; Online Resource 2). Under these strongest corruptions, LOOM is better than PreVal, 5-seed ensemble (W/D/L 104/0/10; Δ = +0.654 [+0.512, +0.784]; r_rb = 0.94; p &lt; 0.001), worse than QUANT (W/D/L 35/0/77; Δ = -0.050 [-0.093, -0.030]; r_rb = -0.23; p = 0.032) and better than Arsenal (W/D/L 108/0/3; Δ = +6.249 [+5.103, +6.941]; r_rb = 1.00; p &lt; 0.001). The Arsenal’s high NLL is largely caused by its vote-based probabilities, which often assign exactly zero probability to the true class: in the Brier score, which is bounded, the clean comparison is much closer (median 0.171 vs 0.163 for LOOM; LOOM is better than Arsenal (W/D/L 67/0/44; Δ = +0.007 [+0.002, +0.018]; r_rb = 0.43; p &lt; 0.001)), while under severity-3 corruption LOOM is better than Arsenal (W/D/L 94/0/17; Δ = +0.129 [+0.107, +0.150]; r_rb = 0.83; p &lt; 0.001) in Brier score. The comparison with QUANT depends on the corruption strength: averaged over all 18 conditions and five resamples (Table 2) the two are not significantly different, but at severity 3 LOOM is worse than QUANT (W/D/L 35/0/77; Δ = -0.050 [-0.093, -0.030]; r_rb = -0.23; p = 0.032) in NLL. The overall parity with QUANT hides a dependence on the corruption type (Fig. 4): at severity 3, QUANT has the lower median NLL for baseline wander, missing segments and spikes, and LOOM for Gaussian noise, time warping and circular shifts. We did not investigate the cause of this difference; it concerns the feature representation (raw-series quantiles versus random convolutions) rather than the readout, so LOOM-style moderation of a QUANT-like model is a possible extension. Averaging five LOOM models gives a median clean NLL of 0.329 and a corrupted NLL of 1.003.</w:t>
       </w:r>
     </w:p>
     <w:p>
@@ -8279,7 +8279,7 @@
         <w:t xml:space="preserve"> </w:t>
       </w:r>
       <w:r>
-        <w:t xml:space="preserve">Official split, under corruption (mean over the available corruption conditions, see text). Statistics as in Table 1 (NLL)</w:t>
+        <w:t xml:space="preserve">Official split, severity-3 corruptions (per-dataset mean over the six severity-3 conditions, then median over datasets). Statistics as in Table 1 (NLL)</w:t>
       </w:r>
     </w:p>
     <w:tbl>
@@ -8288,7 +8288,7 @@
         <w:tblW w:type="pct" w:w="5000"/>
         <w:tblLook w:firstRow="1" w:lastRow="0" w:firstColumn="0" w:lastColumn="0" w:noHBand="0" w:noVBand="0" w:val="0020"/>
         <w:jc w:val="start"/>
-        <w:tblCaption w:val="Table 3 Official split, under corruption (mean over the available corruption conditions, see text). Statistics as in Table 1 (NLL)"/>
+        <w:tblCaption w:val="Table 3 Official split, severity-3 corruptions (per-dataset mean over the six severity-3 conditions, then median over datasets). Statistics as in Table 1 (NLL)"/>
         <w:tblBorders>
           <w:top w:val="single" w:sz="8" w:color="000000"/>
           <w:bottom w:val="single" w:sz="8" w:color="000000"/>
@@ -8299,16 +8299,17 @@
         </w:tblBorders>
       </w:tblPr>
       <w:tblGrid>
-        <w:gridCol w:w="792"/>
-        <w:gridCol w:w="792"/>
-        <w:gridCol w:w="792"/>
-        <w:gridCol w:w="792"/>
-        <w:gridCol w:w="792"/>
-        <w:gridCol w:w="792"/>
-        <w:gridCol w:w="792"/>
-        <w:gridCol w:w="792"/>
-        <w:gridCol w:w="792"/>
-        <w:gridCol w:w="792"/>
+        <w:gridCol w:w="719"/>
+        <w:gridCol w:w="719"/>
+        <w:gridCol w:w="719"/>
+        <w:gridCol w:w="719"/>
+        <w:gridCol w:w="719"/>
+        <w:gridCol w:w="719"/>
+        <w:gridCol w:w="719"/>
+        <w:gridCol w:w="719"/>
+        <w:gridCol w:w="719"/>
+        <w:gridCol w:w="719"/>
+        <w:gridCol w:w="719"/>
       </w:tblGrid>
       <w:tr>
         <w:trPr>
@@ -8398,7 +8399,7 @@
                 <w:b/>
                 <w:sz w:val="16"/>
               </w:rPr>
-              <w:t xml:space="preserve">ECE</w:t>
+              <w:t xml:space="preserve">BRIER</w:t>
             </w:r>
           </w:p>
         </w:tc>
@@ -8420,7 +8421,7 @@
                 <w:b/>
                 <w:sz w:val="16"/>
               </w:rPr>
-              <w:t xml:space="preserve">ACC</w:t>
+              <w:t xml:space="preserve">ECE</w:t>
             </w:r>
           </w:p>
         </w:tc>
@@ -8442,7 +8443,7 @@
                 <w:b/>
                 <w:sz w:val="16"/>
               </w:rPr>
-              <w:t xml:space="preserve">Shift AUROC</w:t>
+              <w:t xml:space="preserve">ACC</w:t>
             </w:r>
           </w:p>
         </w:tc>
@@ -8464,7 +8465,7 @@
                 <w:b/>
                 <w:sz w:val="16"/>
               </w:rPr>
-              <w:t xml:space="preserve">Mean rank</w:t>
+              <w:t xml:space="preserve">Shift AUROC</w:t>
             </w:r>
           </w:p>
         </w:tc>
@@ -8486,7 +8487,7 @@
                 <w:b/>
                 <w:sz w:val="16"/>
               </w:rPr>
-              <w:t xml:space="preserve">W/D/L</w:t>
+              <w:t xml:space="preserve">Mean rank</w:t>
             </w:r>
           </w:p>
         </w:tc>
@@ -8508,7 +8509,7 @@
                 <w:b/>
                 <w:sz w:val="16"/>
               </w:rPr>
-              <w:t xml:space="preserve">r_rb</w:t>
+              <w:t xml:space="preserve">W/D/L</w:t>
             </w:r>
           </w:p>
         </w:tc>
@@ -8530,6 +8531,28 @@
                 <w:b/>
                 <w:sz w:val="16"/>
               </w:rPr>
+              <w:t xml:space="preserve">r_rb</w:t>
+            </w:r>
+          </w:p>
+        </w:tc>
+        <w:tc>
+          <w:tcPr>
+            <w:tcBorders>
+              <w:bottom w:val="single" w:sz="4" w:color="000000"/>
+            </w:tcBorders>
+          </w:tcPr>
+          <w:p>
+            <w:pPr>
+              <w:pStyle w:val="Compact"/>
+              <w:spacing w:after="0" w:line="240" w:lineRule="auto"/>
+              <w:jc w:val="left"/>
+            </w:pPr>
+            <w:r>
+              <w:rPr>
+                <w:rFonts w:ascii="Times New Roman" w:hAnsi="Times New Roman"/>
+                <w:b/>
+                <w:sz w:val="16"/>
+              </w:rPr>
               <w:t xml:space="preserve">p (Holm)</w:t>
             </w:r>
           </w:p>
@@ -8583,75 +8606,92 @@
                 <w:rFonts w:ascii="Times New Roman" w:hAnsi="Times New Roman"/>
                 <w:sz w:val="16"/>
               </w:rPr>
-              <w:t xml:space="preserve">0.791</w:t>
-            </w:r>
-          </w:p>
-        </w:tc>
-        <w:tc>
-          <w:tcPr/>
-          <w:p>
-            <w:pPr>
-              <w:pStyle w:val="Compact"/>
-              <w:spacing w:after="0" w:line="240" w:lineRule="auto"/>
-              <w:jc w:val="left"/>
-            </w:pPr>
-            <w:r>
-              <w:rPr>
-                <w:rFonts w:ascii="Times New Roman" w:hAnsi="Times New Roman"/>
-                <w:sz w:val="16"/>
-              </w:rPr>
-              <w:t xml:space="preserve">0.157</w:t>
-            </w:r>
-          </w:p>
-        </w:tc>
-        <w:tc>
-          <w:tcPr/>
-          <w:p>
-            <w:pPr>
-              <w:pStyle w:val="Compact"/>
-              <w:spacing w:after="0" w:line="240" w:lineRule="auto"/>
-              <w:jc w:val="left"/>
-            </w:pPr>
-            <w:r>
-              <w:rPr>
-                <w:rFonts w:ascii="Times New Roman" w:hAnsi="Times New Roman"/>
-                <w:sz w:val="16"/>
-              </w:rPr>
-              <w:t xml:space="preserve">0.676</w:t>
-            </w:r>
-          </w:p>
-        </w:tc>
-        <w:tc>
-          <w:tcPr/>
-          <w:p>
-            <w:pPr>
-              <w:pStyle w:val="Compact"/>
-              <w:spacing w:after="0" w:line="240" w:lineRule="auto"/>
-              <w:jc w:val="left"/>
-            </w:pPr>
-            <w:r>
-              <w:rPr>
-                <w:rFonts w:ascii="Times New Roman" w:hAnsi="Times New Roman"/>
-                <w:sz w:val="16"/>
-              </w:rPr>
-              <w:t xml:space="preserve">0.761</w:t>
-            </w:r>
-          </w:p>
-        </w:tc>
-        <w:tc>
-          <w:tcPr/>
-          <w:p>
-            <w:pPr>
-              <w:pStyle w:val="Compact"/>
-              <w:spacing w:after="0" w:line="240" w:lineRule="auto"/>
-              <w:jc w:val="left"/>
-            </w:pPr>
-            <w:r>
-              <w:rPr>
-                <w:rFonts w:ascii="Times New Roman" w:hAnsi="Times New Roman"/>
-                <w:sz w:val="16"/>
-              </w:rPr>
-              <w:t xml:space="preserve">1.96</w:t>
+              <w:t xml:space="preserve">1.020</w:t>
+            </w:r>
+          </w:p>
+        </w:tc>
+        <w:tc>
+          <w:tcPr/>
+          <w:p>
+            <w:pPr>
+              <w:pStyle w:val="Compact"/>
+              <w:spacing w:after="0" w:line="240" w:lineRule="auto"/>
+              <w:jc w:val="left"/>
+            </w:pPr>
+            <w:r>
+              <w:rPr>
+                <w:rFonts w:ascii="Times New Roman" w:hAnsi="Times New Roman"/>
+                <w:sz w:val="16"/>
+              </w:rPr>
+              <w:t xml:space="preserve">0.526</w:t>
+            </w:r>
+          </w:p>
+        </w:tc>
+        <w:tc>
+          <w:tcPr/>
+          <w:p>
+            <w:pPr>
+              <w:pStyle w:val="Compact"/>
+              <w:spacing w:after="0" w:line="240" w:lineRule="auto"/>
+              <w:jc w:val="left"/>
+            </w:pPr>
+            <w:r>
+              <w:rPr>
+                <w:rFonts w:ascii="Times New Roman" w:hAnsi="Times New Roman"/>
+                <w:sz w:val="16"/>
+              </w:rPr>
+              <w:t xml:space="preserve">0.167</w:t>
+            </w:r>
+          </w:p>
+        </w:tc>
+        <w:tc>
+          <w:tcPr/>
+          <w:p>
+            <w:pPr>
+              <w:pStyle w:val="Compact"/>
+              <w:spacing w:after="0" w:line="240" w:lineRule="auto"/>
+              <w:jc w:val="left"/>
+            </w:pPr>
+            <w:r>
+              <w:rPr>
+                <w:rFonts w:ascii="Times New Roman" w:hAnsi="Times New Roman"/>
+                <w:sz w:val="16"/>
+              </w:rPr>
+              <w:t xml:space="preserve">0.604</w:t>
+            </w:r>
+          </w:p>
+        </w:tc>
+        <w:tc>
+          <w:tcPr/>
+          <w:p>
+            <w:pPr>
+              <w:pStyle w:val="Compact"/>
+              <w:spacing w:after="0" w:line="240" w:lineRule="auto"/>
+              <w:jc w:val="left"/>
+            </w:pPr>
+            <w:r>
+              <w:rPr>
+                <w:rFonts w:ascii="Times New Roman" w:hAnsi="Times New Roman"/>
+                <w:sz w:val="16"/>
+              </w:rPr>
+              <w:t xml:space="preserve">0.845</w:t>
+            </w:r>
+          </w:p>
+        </w:tc>
+        <w:tc>
+          <w:tcPr/>
+          <w:p>
+            <w:pPr>
+              <w:pStyle w:val="Compact"/>
+              <w:spacing w:after="0" w:line="240" w:lineRule="auto"/>
+              <w:jc w:val="left"/>
+            </w:pPr>
+            <w:r>
+              <w:rPr>
+                <w:rFonts w:ascii="Times New Roman" w:hAnsi="Times New Roman"/>
+                <w:sz w:val="16"/>
+              </w:rPr>
+              <w:t xml:space="preserve">1.83</w:t>
             </w:r>
           </w:p>
         </w:tc>
@@ -8755,109 +8795,126 @@
                 <w:rFonts w:ascii="Times New Roman" w:hAnsi="Times New Roman"/>
                 <w:sz w:val="16"/>
               </w:rPr>
-              <w:t xml:space="preserve">0.785</w:t>
-            </w:r>
-          </w:p>
-        </w:tc>
-        <w:tc>
-          <w:tcPr/>
-          <w:p>
-            <w:pPr>
-              <w:pStyle w:val="Compact"/>
-              <w:spacing w:after="0" w:line="240" w:lineRule="auto"/>
-              <w:jc w:val="left"/>
-            </w:pPr>
-            <w:r>
-              <w:rPr>
-                <w:rFonts w:ascii="Times New Roman" w:hAnsi="Times New Roman"/>
-                <w:sz w:val="16"/>
-              </w:rPr>
-              <w:t xml:space="preserve">0.153</w:t>
-            </w:r>
-          </w:p>
-        </w:tc>
-        <w:tc>
-          <w:tcPr/>
-          <w:p>
-            <w:pPr>
-              <w:pStyle w:val="Compact"/>
-              <w:spacing w:after="0" w:line="240" w:lineRule="auto"/>
-              <w:jc w:val="left"/>
-            </w:pPr>
-            <w:r>
-              <w:rPr>
-                <w:rFonts w:ascii="Times New Roman" w:hAnsi="Times New Roman"/>
-                <w:sz w:val="16"/>
-              </w:rPr>
-              <w:t xml:space="preserve">0.672</w:t>
-            </w:r>
-          </w:p>
-        </w:tc>
-        <w:tc>
-          <w:tcPr/>
-          <w:p>
-            <w:pPr>
-              <w:pStyle w:val="Compact"/>
-              <w:spacing w:after="0" w:line="240" w:lineRule="auto"/>
-              <w:jc w:val="left"/>
-            </w:pPr>
-            <w:r>
-              <w:rPr>
-                <w:rFonts w:ascii="Times New Roman" w:hAnsi="Times New Roman"/>
-                <w:sz w:val="16"/>
-              </w:rPr>
-              <w:t xml:space="preserve">0.771</w:t>
-            </w:r>
-          </w:p>
-        </w:tc>
-        <w:tc>
-          <w:tcPr/>
-          <w:p>
-            <w:pPr>
-              <w:pStyle w:val="Compact"/>
-              <w:spacing w:after="0" w:line="240" w:lineRule="auto"/>
-              <w:jc w:val="left"/>
-            </w:pPr>
-            <w:r>
-              <w:rPr>
-                <w:rFonts w:ascii="Times New Roman" w:hAnsi="Times New Roman"/>
-                <w:sz w:val="16"/>
-              </w:rPr>
-              <w:t xml:space="preserve">1.61</w:t>
-            </w:r>
-          </w:p>
-        </w:tc>
-        <w:tc>
-          <w:tcPr/>
-          <w:p>
-            <w:pPr>
-              <w:pStyle w:val="Compact"/>
-              <w:spacing w:after="0" w:line="240" w:lineRule="auto"/>
-              <w:jc w:val="left"/>
-            </w:pPr>
-            <w:r>
-              <w:rPr>
-                <w:rFonts w:ascii="Times New Roman" w:hAnsi="Times New Roman"/>
-                <w:sz w:val="16"/>
-              </w:rPr>
-              <w:t xml:space="preserve">36/0/78</w:t>
-            </w:r>
-          </w:p>
-        </w:tc>
-        <w:tc>
-          <w:tcPr/>
-          <w:p>
-            <w:pPr>
-              <w:pStyle w:val="Compact"/>
-              <w:spacing w:after="0" w:line="240" w:lineRule="auto"/>
-              <w:jc w:val="left"/>
-            </w:pPr>
-            <w:r>
-              <w:rPr>
-                <w:rFonts w:ascii="Times New Roman" w:hAnsi="Times New Roman"/>
-                <w:sz w:val="16"/>
-              </w:rPr>
-              <w:t xml:space="preserve">-0.50</w:t>
+              <w:t xml:space="preserve">1.003</w:t>
+            </w:r>
+          </w:p>
+        </w:tc>
+        <w:tc>
+          <w:tcPr/>
+          <w:p>
+            <w:pPr>
+              <w:pStyle w:val="Compact"/>
+              <w:spacing w:after="0" w:line="240" w:lineRule="auto"/>
+              <w:jc w:val="left"/>
+            </w:pPr>
+            <w:r>
+              <w:rPr>
+                <w:rFonts w:ascii="Times New Roman" w:hAnsi="Times New Roman"/>
+                <w:sz w:val="16"/>
+              </w:rPr>
+              <w:t xml:space="preserve">0.519</w:t>
+            </w:r>
+          </w:p>
+        </w:tc>
+        <w:tc>
+          <w:tcPr/>
+          <w:p>
+            <w:pPr>
+              <w:pStyle w:val="Compact"/>
+              <w:spacing w:after="0" w:line="240" w:lineRule="auto"/>
+              <w:jc w:val="left"/>
+            </w:pPr>
+            <w:r>
+              <w:rPr>
+                <w:rFonts w:ascii="Times New Roman" w:hAnsi="Times New Roman"/>
+                <w:sz w:val="16"/>
+              </w:rPr>
+              <w:t xml:space="preserve">0.165</w:t>
+            </w:r>
+          </w:p>
+        </w:tc>
+        <w:tc>
+          <w:tcPr/>
+          <w:p>
+            <w:pPr>
+              <w:pStyle w:val="Compact"/>
+              <w:spacing w:after="0" w:line="240" w:lineRule="auto"/>
+              <w:jc w:val="left"/>
+            </w:pPr>
+            <w:r>
+              <w:rPr>
+                <w:rFonts w:ascii="Times New Roman" w:hAnsi="Times New Roman"/>
+                <w:sz w:val="16"/>
+              </w:rPr>
+              <w:t xml:space="preserve">0.614</w:t>
+            </w:r>
+          </w:p>
+        </w:tc>
+        <w:tc>
+          <w:tcPr/>
+          <w:p>
+            <w:pPr>
+              <w:pStyle w:val="Compact"/>
+              <w:spacing w:after="0" w:line="240" w:lineRule="auto"/>
+              <w:jc w:val="left"/>
+            </w:pPr>
+            <w:r>
+              <w:rPr>
+                <w:rFonts w:ascii="Times New Roman" w:hAnsi="Times New Roman"/>
+                <w:sz w:val="16"/>
+              </w:rPr>
+              <w:t xml:space="preserve">0.847</w:t>
+            </w:r>
+          </w:p>
+        </w:tc>
+        <w:tc>
+          <w:tcPr/>
+          <w:p>
+            <w:pPr>
+              <w:pStyle w:val="Compact"/>
+              <w:spacing w:after="0" w:line="240" w:lineRule="auto"/>
+              <w:jc w:val="left"/>
+            </w:pPr>
+            <w:r>
+              <w:rPr>
+                <w:rFonts w:ascii="Times New Roman" w:hAnsi="Times New Roman"/>
+                <w:sz w:val="16"/>
+              </w:rPr>
+              <w:t xml:space="preserve">1.49</w:t>
+            </w:r>
+          </w:p>
+        </w:tc>
+        <w:tc>
+          <w:tcPr/>
+          <w:p>
+            <w:pPr>
+              <w:pStyle w:val="Compact"/>
+              <w:spacing w:after="0" w:line="240" w:lineRule="auto"/>
+              <w:jc w:val="left"/>
+            </w:pPr>
+            <w:r>
+              <w:rPr>
+                <w:rFonts w:ascii="Times New Roman" w:hAnsi="Times New Roman"/>
+                <w:sz w:val="16"/>
+              </w:rPr>
+              <w:t xml:space="preserve">38/0/76</w:t>
+            </w:r>
+          </w:p>
+        </w:tc>
+        <w:tc>
+          <w:tcPr/>
+          <w:p>
+            <w:pPr>
+              <w:pStyle w:val="Compact"/>
+              <w:spacing w:after="0" w:line="240" w:lineRule="auto"/>
+              <w:jc w:val="left"/>
+            </w:pPr>
+            <w:r>
+              <w:rPr>
+                <w:rFonts w:ascii="Times New Roman" w:hAnsi="Times New Roman"/>
+                <w:sz w:val="16"/>
+              </w:rPr>
+              <w:t xml:space="preserve">-0.48</w:t>
             </w:r>
           </w:p>
         </w:tc>
@@ -8927,109 +8984,126 @@
                 <w:rFonts w:ascii="Times New Roman" w:hAnsi="Times New Roman"/>
                 <w:sz w:val="16"/>
               </w:rPr>
-              <w:t xml:space="preserve">1.486</w:t>
-            </w:r>
-          </w:p>
-        </w:tc>
-        <w:tc>
-          <w:tcPr/>
-          <w:p>
-            <w:pPr>
-              <w:pStyle w:val="Compact"/>
-              <w:spacing w:after="0" w:line="240" w:lineRule="auto"/>
-              <w:jc w:val="left"/>
-            </w:pPr>
-            <w:r>
-              <w:rPr>
-                <w:rFonts w:ascii="Times New Roman" w:hAnsi="Times New Roman"/>
-                <w:sz w:val="16"/>
-              </w:rPr>
-              <w:t xml:space="preserve">0.185</w:t>
-            </w:r>
-          </w:p>
-        </w:tc>
-        <w:tc>
-          <w:tcPr/>
-          <w:p>
-            <w:pPr>
-              <w:pStyle w:val="Compact"/>
-              <w:spacing w:after="0" w:line="240" w:lineRule="auto"/>
-              <w:jc w:val="left"/>
-            </w:pPr>
-            <w:r>
-              <w:rPr>
-                <w:rFonts w:ascii="Times New Roman" w:hAnsi="Times New Roman"/>
-                <w:sz w:val="16"/>
-              </w:rPr>
-              <w:t xml:space="preserve">0.683</w:t>
-            </w:r>
-          </w:p>
-        </w:tc>
-        <w:tc>
-          <w:tcPr/>
-          <w:p>
-            <w:pPr>
-              <w:pStyle w:val="Compact"/>
-              <w:spacing w:after="0" w:line="240" w:lineRule="auto"/>
-              <w:jc w:val="left"/>
-            </w:pPr>
-            <w:r>
-              <w:rPr>
-                <w:rFonts w:ascii="Times New Roman" w:hAnsi="Times New Roman"/>
-                <w:sz w:val="16"/>
-              </w:rPr>
-              <w:t xml:space="preserve">0.544</w:t>
-            </w:r>
-          </w:p>
-        </w:tc>
-        <w:tc>
-          <w:tcPr/>
-          <w:p>
-            <w:pPr>
-              <w:pStyle w:val="Compact"/>
-              <w:spacing w:after="0" w:line="240" w:lineRule="auto"/>
-              <w:jc w:val="left"/>
-            </w:pPr>
-            <w:r>
-              <w:rPr>
-                <w:rFonts w:ascii="Times New Roman" w:hAnsi="Times New Roman"/>
-                <w:sz w:val="16"/>
-              </w:rPr>
-              <w:t xml:space="preserve">3.62</w:t>
-            </w:r>
-          </w:p>
-        </w:tc>
-        <w:tc>
-          <w:tcPr/>
-          <w:p>
-            <w:pPr>
-              <w:pStyle w:val="Compact"/>
-              <w:spacing w:after="0" w:line="240" w:lineRule="auto"/>
-              <w:jc w:val="left"/>
-            </w:pPr>
-            <w:r>
-              <w:rPr>
-                <w:rFonts w:ascii="Times New Roman" w:hAnsi="Times New Roman"/>
-                <w:sz w:val="16"/>
-              </w:rPr>
-              <w:t xml:space="preserve">101/0/13</w:t>
-            </w:r>
-          </w:p>
-        </w:tc>
-        <w:tc>
-          <w:tcPr/>
-          <w:p>
-            <w:pPr>
-              <w:pStyle w:val="Compact"/>
-              <w:spacing w:after="0" w:line="240" w:lineRule="auto"/>
-              <w:jc w:val="left"/>
-            </w:pPr>
-            <w:r>
-              <w:rPr>
-                <w:rFonts w:ascii="Times New Roman" w:hAnsi="Times New Roman"/>
-                <w:sz w:val="16"/>
-              </w:rPr>
-              <w:t xml:space="preserve">0.92</w:t>
+              <w:t xml:space="preserve">2.260</w:t>
+            </w:r>
+          </w:p>
+        </w:tc>
+        <w:tc>
+          <w:tcPr/>
+          <w:p>
+            <w:pPr>
+              <w:pStyle w:val="Compact"/>
+              <w:spacing w:after="0" w:line="240" w:lineRule="auto"/>
+              <w:jc w:val="left"/>
+            </w:pPr>
+            <w:r>
+              <w:rPr>
+                <w:rFonts w:ascii="Times New Roman" w:hAnsi="Times New Roman"/>
+                <w:sz w:val="16"/>
+              </w:rPr>
+              <w:t xml:space="preserve">0.673</w:t>
+            </w:r>
+          </w:p>
+        </w:tc>
+        <w:tc>
+          <w:tcPr/>
+          <w:p>
+            <w:pPr>
+              <w:pStyle w:val="Compact"/>
+              <w:spacing w:after="0" w:line="240" w:lineRule="auto"/>
+              <w:jc w:val="left"/>
+            </w:pPr>
+            <w:r>
+              <w:rPr>
+                <w:rFonts w:ascii="Times New Roman" w:hAnsi="Times New Roman"/>
+                <w:sz w:val="16"/>
+              </w:rPr>
+              <w:t xml:space="preserve">0.257</w:t>
+            </w:r>
+          </w:p>
+        </w:tc>
+        <w:tc>
+          <w:tcPr/>
+          <w:p>
+            <w:pPr>
+              <w:pStyle w:val="Compact"/>
+              <w:spacing w:after="0" w:line="240" w:lineRule="auto"/>
+              <w:jc w:val="left"/>
+            </w:pPr>
+            <w:r>
+              <w:rPr>
+                <w:rFonts w:ascii="Times New Roman" w:hAnsi="Times New Roman"/>
+                <w:sz w:val="16"/>
+              </w:rPr>
+              <w:t xml:space="preserve">0.613</w:t>
+            </w:r>
+          </w:p>
+        </w:tc>
+        <w:tc>
+          <w:tcPr/>
+          <w:p>
+            <w:pPr>
+              <w:pStyle w:val="Compact"/>
+              <w:spacing w:after="0" w:line="240" w:lineRule="auto"/>
+              <w:jc w:val="left"/>
+            </w:pPr>
+            <w:r>
+              <w:rPr>
+                <w:rFonts w:ascii="Times New Roman" w:hAnsi="Times New Roman"/>
+                <w:sz w:val="16"/>
+              </w:rPr>
+              <w:t xml:space="preserve">0.531</w:t>
+            </w:r>
+          </w:p>
+        </w:tc>
+        <w:tc>
+          <w:tcPr/>
+          <w:p>
+            <w:pPr>
+              <w:pStyle w:val="Compact"/>
+              <w:spacing w:after="0" w:line="240" w:lineRule="auto"/>
+              <w:jc w:val="left"/>
+            </w:pPr>
+            <w:r>
+              <w:rPr>
+                <w:rFonts w:ascii="Times New Roman" w:hAnsi="Times New Roman"/>
+                <w:sz w:val="16"/>
+              </w:rPr>
+              <w:t xml:space="preserve">3.70</w:t>
+            </w:r>
+          </w:p>
+        </w:tc>
+        <w:tc>
+          <w:tcPr/>
+          <w:p>
+            <w:pPr>
+              <w:pStyle w:val="Compact"/>
+              <w:spacing w:after="0" w:line="240" w:lineRule="auto"/>
+              <w:jc w:val="left"/>
+            </w:pPr>
+            <w:r>
+              <w:rPr>
+                <w:rFonts w:ascii="Times New Roman" w:hAnsi="Times New Roman"/>
+                <w:sz w:val="16"/>
+              </w:rPr>
+              <w:t xml:space="preserve">105/0/9</w:t>
+            </w:r>
+          </w:p>
+        </w:tc>
+        <w:tc>
+          <w:tcPr/>
+          <w:p>
+            <w:pPr>
+              <w:pStyle w:val="Compact"/>
+              <w:spacing w:after="0" w:line="240" w:lineRule="auto"/>
+              <w:jc w:val="left"/>
+            </w:pPr>
+            <w:r>
+              <w:rPr>
+                <w:rFonts w:ascii="Times New Roman" w:hAnsi="Times New Roman"/>
+                <w:sz w:val="16"/>
+              </w:rPr>
+              <w:t xml:space="preserve">0.97</w:t>
             </w:r>
           </w:p>
         </w:tc>
@@ -9099,109 +9173,126 @@
                 <w:rFonts w:ascii="Times New Roman" w:hAnsi="Times New Roman"/>
                 <w:sz w:val="16"/>
               </w:rPr>
-              <w:t xml:space="preserve">1.349</w:t>
-            </w:r>
-          </w:p>
-        </w:tc>
-        <w:tc>
-          <w:tcPr/>
-          <w:p>
-            <w:pPr>
-              <w:pStyle w:val="Compact"/>
-              <w:spacing w:after="0" w:line="240" w:lineRule="auto"/>
-              <w:jc w:val="left"/>
-            </w:pPr>
-            <w:r>
-              <w:rPr>
-                <w:rFonts w:ascii="Times New Roman" w:hAnsi="Times New Roman"/>
-                <w:sz w:val="16"/>
-              </w:rPr>
-              <w:t xml:space="preserve">0.173</w:t>
-            </w:r>
-          </w:p>
-        </w:tc>
-        <w:tc>
-          <w:tcPr/>
-          <w:p>
-            <w:pPr>
-              <w:pStyle w:val="Compact"/>
-              <w:spacing w:after="0" w:line="240" w:lineRule="auto"/>
-              <w:jc w:val="left"/>
-            </w:pPr>
-            <w:r>
-              <w:rPr>
-                <w:rFonts w:ascii="Times New Roman" w:hAnsi="Times New Roman"/>
-                <w:sz w:val="16"/>
-              </w:rPr>
-              <w:t xml:space="preserve">0.676</w:t>
-            </w:r>
-          </w:p>
-        </w:tc>
-        <w:tc>
-          <w:tcPr/>
-          <w:p>
-            <w:pPr>
-              <w:pStyle w:val="Compact"/>
-              <w:spacing w:after="0" w:line="240" w:lineRule="auto"/>
-              <w:jc w:val="left"/>
-            </w:pPr>
-            <w:r>
-              <w:rPr>
-                <w:rFonts w:ascii="Times New Roman" w:hAnsi="Times New Roman"/>
-                <w:sz w:val="16"/>
-              </w:rPr>
-              <w:t xml:space="preserve">0.578</w:t>
-            </w:r>
-          </w:p>
-        </w:tc>
-        <w:tc>
-          <w:tcPr/>
-          <w:p>
-            <w:pPr>
-              <w:pStyle w:val="Compact"/>
-              <w:spacing w:after="0" w:line="240" w:lineRule="auto"/>
-              <w:jc w:val="left"/>
-            </w:pPr>
-            <w:r>
-              <w:rPr>
-                <w:rFonts w:ascii="Times New Roman" w:hAnsi="Times New Roman"/>
-                <w:sz w:val="16"/>
-              </w:rPr>
-              <w:t xml:space="preserve">2.81</w:t>
-            </w:r>
-          </w:p>
-        </w:tc>
-        <w:tc>
-          <w:tcPr/>
-          <w:p>
-            <w:pPr>
-              <w:pStyle w:val="Compact"/>
-              <w:spacing w:after="0" w:line="240" w:lineRule="auto"/>
-              <w:jc w:val="left"/>
-            </w:pPr>
-            <w:r>
-              <w:rPr>
-                <w:rFonts w:ascii="Times New Roman" w:hAnsi="Times New Roman"/>
-                <w:sz w:val="16"/>
-              </w:rPr>
-              <w:t xml:space="preserve">95/0/19</w:t>
-            </w:r>
-          </w:p>
-        </w:tc>
-        <w:tc>
-          <w:tcPr/>
-          <w:p>
-            <w:pPr>
-              <w:pStyle w:val="Compact"/>
-              <w:spacing w:after="0" w:line="240" w:lineRule="auto"/>
-              <w:jc w:val="left"/>
-            </w:pPr>
-            <w:r>
-              <w:rPr>
-                <w:rFonts w:ascii="Times New Roman" w:hAnsi="Times New Roman"/>
-                <w:sz w:val="16"/>
-              </w:rPr>
-              <w:t xml:space="preserve">0.86</w:t>
+              <w:t xml:space="preserve">2.040</w:t>
+            </w:r>
+          </w:p>
+        </w:tc>
+        <w:tc>
+          <w:tcPr/>
+          <w:p>
+            <w:pPr>
+              <w:pStyle w:val="Compact"/>
+              <w:spacing w:after="0" w:line="240" w:lineRule="auto"/>
+              <w:jc w:val="left"/>
+            </w:pPr>
+            <w:r>
+              <w:rPr>
+                <w:rFonts w:ascii="Times New Roman" w:hAnsi="Times New Roman"/>
+                <w:sz w:val="16"/>
+              </w:rPr>
+              <w:t xml:space="preserve">0.636</w:t>
+            </w:r>
+          </w:p>
+        </w:tc>
+        <w:tc>
+          <w:tcPr/>
+          <w:p>
+            <w:pPr>
+              <w:pStyle w:val="Compact"/>
+              <w:spacing w:after="0" w:line="240" w:lineRule="auto"/>
+              <w:jc w:val="left"/>
+            </w:pPr>
+            <w:r>
+              <w:rPr>
+                <w:rFonts w:ascii="Times New Roman" w:hAnsi="Times New Roman"/>
+                <w:sz w:val="16"/>
+              </w:rPr>
+              <w:t xml:space="preserve">0.240</w:t>
+            </w:r>
+          </w:p>
+        </w:tc>
+        <w:tc>
+          <w:tcPr/>
+          <w:p>
+            <w:pPr>
+              <w:pStyle w:val="Compact"/>
+              <w:spacing w:after="0" w:line="240" w:lineRule="auto"/>
+              <w:jc w:val="left"/>
+            </w:pPr>
+            <w:r>
+              <w:rPr>
+                <w:rFonts w:ascii="Times New Roman" w:hAnsi="Times New Roman"/>
+                <w:sz w:val="16"/>
+              </w:rPr>
+              <w:t xml:space="preserve">0.616</w:t>
+            </w:r>
+          </w:p>
+        </w:tc>
+        <w:tc>
+          <w:tcPr/>
+          <w:p>
+            <w:pPr>
+              <w:pStyle w:val="Compact"/>
+              <w:spacing w:after="0" w:line="240" w:lineRule="auto"/>
+              <w:jc w:val="left"/>
+            </w:pPr>
+            <w:r>
+              <w:rPr>
+                <w:rFonts w:ascii="Times New Roman" w:hAnsi="Times New Roman"/>
+                <w:sz w:val="16"/>
+              </w:rPr>
+              <w:t xml:space="preserve">0.584</w:t>
+            </w:r>
+          </w:p>
+        </w:tc>
+        <w:tc>
+          <w:tcPr/>
+          <w:p>
+            <w:pPr>
+              <w:pStyle w:val="Compact"/>
+              <w:spacing w:after="0" w:line="240" w:lineRule="auto"/>
+              <w:jc w:val="left"/>
+            </w:pPr>
+            <w:r>
+              <w:rPr>
+                <w:rFonts w:ascii="Times New Roman" w:hAnsi="Times New Roman"/>
+                <w:sz w:val="16"/>
+              </w:rPr>
+              <w:t xml:space="preserve">2.97</w:t>
+            </w:r>
+          </w:p>
+        </w:tc>
+        <w:tc>
+          <w:tcPr/>
+          <w:p>
+            <w:pPr>
+              <w:pStyle w:val="Compact"/>
+              <w:spacing w:after="0" w:line="240" w:lineRule="auto"/>
+              <w:jc w:val="left"/>
+            </w:pPr>
+            <w:r>
+              <w:rPr>
+                <w:rFonts w:ascii="Times New Roman" w:hAnsi="Times New Roman"/>
+                <w:sz w:val="16"/>
+              </w:rPr>
+              <w:t xml:space="preserve">104/0/10</w:t>
+            </w:r>
+          </w:p>
+        </w:tc>
+        <w:tc>
+          <w:tcPr/>
+          <w:p>
+            <w:pPr>
+              <w:pStyle w:val="Compact"/>
+              <w:spacing w:after="0" w:line="240" w:lineRule="auto"/>
+              <w:jc w:val="left"/>
+            </w:pPr>
+            <w:r>
+              <w:rPr>
+                <w:rFonts w:ascii="Times New Roman" w:hAnsi="Times New Roman"/>
+                <w:sz w:val="16"/>
+              </w:rPr>
+              <w:t xml:space="preserve">0.94</w:t>
             </w:r>
           </w:p>
         </w:tc>
@@ -9271,58 +9362,75 @@
                 <w:rFonts w:ascii="Times New Roman" w:hAnsi="Times New Roman"/>
                 <w:sz w:val="16"/>
               </w:rPr>
-              <w:t xml:space="preserve">0.740</w:t>
-            </w:r>
-          </w:p>
-        </w:tc>
-        <w:tc>
-          <w:tcPr/>
-          <w:p>
-            <w:pPr>
-              <w:pStyle w:val="Compact"/>
-              <w:spacing w:after="0" w:line="240" w:lineRule="auto"/>
-              <w:jc w:val="left"/>
-            </w:pPr>
-            <w:r>
-              <w:rPr>
-                <w:rFonts w:ascii="Times New Roman" w:hAnsi="Times New Roman"/>
-                <w:sz w:val="16"/>
-              </w:rPr>
-              <w:t xml:space="preserve">0.169</w:t>
-            </w:r>
-          </w:p>
-        </w:tc>
-        <w:tc>
-          <w:tcPr/>
-          <w:p>
-            <w:pPr>
-              <w:pStyle w:val="Compact"/>
-              <w:spacing w:after="0" w:line="240" w:lineRule="auto"/>
-              <w:jc w:val="left"/>
-            </w:pPr>
-            <w:r>
-              <w:rPr>
-                <w:rFonts w:ascii="Times New Roman" w:hAnsi="Times New Roman"/>
-                <w:sz w:val="16"/>
-              </w:rPr>
-              <w:t xml:space="preserve">0.680</w:t>
-            </w:r>
-          </w:p>
-        </w:tc>
-        <w:tc>
-          <w:tcPr/>
-          <w:p>
-            <w:pPr>
-              <w:pStyle w:val="Compact"/>
-              <w:spacing w:after="0" w:line="240" w:lineRule="auto"/>
-              <w:jc w:val="left"/>
-            </w:pPr>
-            <w:r>
-              <w:rPr>
-                <w:rFonts w:ascii="Times New Roman" w:hAnsi="Times New Roman"/>
-                <w:sz w:val="16"/>
-              </w:rPr>
-              <w:t xml:space="preserve">0.705</w:t>
+              <w:t xml:space="preserve">0.917</w:t>
+            </w:r>
+          </w:p>
+        </w:tc>
+        <w:tc>
+          <w:tcPr/>
+          <w:p>
+            <w:pPr>
+              <w:pStyle w:val="Compact"/>
+              <w:spacing w:after="0" w:line="240" w:lineRule="auto"/>
+              <w:jc w:val="left"/>
+            </w:pPr>
+            <w:r>
+              <w:rPr>
+                <w:rFonts w:ascii="Times New Roman" w:hAnsi="Times New Roman"/>
+                <w:sz w:val="16"/>
+              </w:rPr>
+              <w:t xml:space="preserve">0.487</w:t>
+            </w:r>
+          </w:p>
+        </w:tc>
+        <w:tc>
+          <w:tcPr/>
+          <w:p>
+            <w:pPr>
+              <w:pStyle w:val="Compact"/>
+              <w:spacing w:after="0" w:line="240" w:lineRule="auto"/>
+              <w:jc w:val="left"/>
+            </w:pPr>
+            <w:r>
+              <w:rPr>
+                <w:rFonts w:ascii="Times New Roman" w:hAnsi="Times New Roman"/>
+                <w:sz w:val="16"/>
+              </w:rPr>
+              <w:t xml:space="preserve">0.179</w:t>
+            </w:r>
+          </w:p>
+        </w:tc>
+        <w:tc>
+          <w:tcPr/>
+          <w:p>
+            <w:pPr>
+              <w:pStyle w:val="Compact"/>
+              <w:spacing w:after="0" w:line="240" w:lineRule="auto"/>
+              <w:jc w:val="left"/>
+            </w:pPr>
+            <w:r>
+              <w:rPr>
+                <w:rFonts w:ascii="Times New Roman" w:hAnsi="Times New Roman"/>
+                <w:sz w:val="16"/>
+              </w:rPr>
+              <w:t xml:space="preserve">0.630</w:t>
+            </w:r>
+          </w:p>
+        </w:tc>
+        <w:tc>
+          <w:tcPr/>
+          <w:p>
+            <w:pPr>
+              <w:pStyle w:val="Compact"/>
+              <w:spacing w:after="0" w:line="240" w:lineRule="auto"/>
+              <w:jc w:val="left"/>
+            </w:pPr>
+            <w:r>
+              <w:rPr>
+                <w:rFonts w:ascii="Times New Roman" w:hAnsi="Times New Roman"/>
+                <w:sz w:val="16"/>
+              </w:rPr>
+              <w:t xml:space="preserve">0.764</w:t>
             </w:r>
           </w:p>
         </w:tc>
@@ -9356,41 +9464,41 @@
                 <w:rFonts w:ascii="Times New Roman" w:hAnsi="Times New Roman"/>
                 <w:sz w:val="16"/>
               </w:rPr>
-              <w:t xml:space="preserve">46/0/66</w:t>
-            </w:r>
-          </w:p>
-        </w:tc>
-        <w:tc>
-          <w:tcPr/>
-          <w:p>
-            <w:pPr>
-              <w:pStyle w:val="Compact"/>
-              <w:spacing w:after="0" w:line="240" w:lineRule="auto"/>
-              <w:jc w:val="left"/>
-            </w:pPr>
-            <w:r>
-              <w:rPr>
-                <w:rFonts w:ascii="Times New Roman" w:hAnsi="Times New Roman"/>
-                <w:sz w:val="16"/>
-              </w:rPr>
-              <w:t xml:space="preserve">-0.15</w:t>
-            </w:r>
-          </w:p>
-        </w:tc>
-        <w:tc>
-          <w:tcPr/>
-          <w:p>
-            <w:pPr>
-              <w:pStyle w:val="Compact"/>
-              <w:spacing w:after="0" w:line="240" w:lineRule="auto"/>
-              <w:jc w:val="left"/>
-            </w:pPr>
-            <w:r>
-              <w:rPr>
-                <w:rFonts w:ascii="Times New Roman" w:hAnsi="Times New Roman"/>
-                <w:sz w:val="16"/>
-              </w:rPr>
-              <w:t xml:space="preserve">0.181</w:t>
+              <w:t xml:space="preserve">35/0/77</w:t>
+            </w:r>
+          </w:p>
+        </w:tc>
+        <w:tc>
+          <w:tcPr/>
+          <w:p>
+            <w:pPr>
+              <w:pStyle w:val="Compact"/>
+              <w:spacing w:after="0" w:line="240" w:lineRule="auto"/>
+              <w:jc w:val="left"/>
+            </w:pPr>
+            <w:r>
+              <w:rPr>
+                <w:rFonts w:ascii="Times New Roman" w:hAnsi="Times New Roman"/>
+                <w:sz w:val="16"/>
+              </w:rPr>
+              <w:t xml:space="preserve">-0.23</w:t>
+            </w:r>
+          </w:p>
+        </w:tc>
+        <w:tc>
+          <w:tcPr/>
+          <w:p>
+            <w:pPr>
+              <w:pStyle w:val="Compact"/>
+              <w:spacing w:after="0" w:line="240" w:lineRule="auto"/>
+              <w:jc w:val="left"/>
+            </w:pPr>
+            <w:r>
+              <w:rPr>
+                <w:rFonts w:ascii="Times New Roman" w:hAnsi="Times New Roman"/>
+                <w:sz w:val="16"/>
+              </w:rPr>
+              <w:t xml:space="preserve">0.032</w:t>
             </w:r>
           </w:p>
         </w:tc>
@@ -9460,6 +9568,23 @@
                 <w:rFonts w:ascii="Times New Roman" w:hAnsi="Times New Roman"/>
                 <w:sz w:val="16"/>
               </w:rPr>
+              <w:t xml:space="preserve">0.669</w:t>
+            </w:r>
+          </w:p>
+        </w:tc>
+        <w:tc>
+          <w:tcPr/>
+          <w:p>
+            <w:pPr>
+              <w:pStyle w:val="Compact"/>
+              <w:spacing w:after="0" w:line="240" w:lineRule="auto"/>
+              <w:jc w:val="left"/>
+            </w:pPr>
+            <w:r>
+              <w:rPr>
+                <w:rFonts w:ascii="Times New Roman" w:hAnsi="Times New Roman"/>
+                <w:sz w:val="16"/>
+              </w:rPr>
               <w:t xml:space="preserve">0.283</w:t>
             </w:r>
           </w:p>
@@ -9528,7 +9653,7 @@
                 <w:rFonts w:ascii="Times New Roman" w:hAnsi="Times New Roman"/>
                 <w:sz w:val="16"/>
               </w:rPr>
-              <w:t xml:space="preserve">110/0/1</w:t>
+              <w:t xml:space="preserve">108/0/3</w:t>
             </w:r>
           </w:p>
         </w:tc>
@@ -9757,7 +9882,7 @@
         <w:t xml:space="preserve"> </w:t>
       </w:r>
       <w:r>
-        <w:t xml:space="preserve">With MultiRocket features (official split, clean and severity-3 conditions), LOOM is better than PreVal (W/D/L 42/0/2; Δ = +6.137 [+4.047, +8.291]; r_rb = 0.99; p &lt; 0.001) under corruption and not significantly different from PreVal (W/D/L 20/0/24; Δ = -0.002 [-0.009, +0.006]; r_rb = -0.06; p = 0.733) on clean data. With Hydra features the corresponding comparisons are better than PreVal (W/D/L 43/0/0; Δ = +7.913 [+1.565, +9.061]; r_rb = 1.00; p &lt; 0.001) and not significantly different from PreVal (W/D/L 22/0/21; Δ = +0.004 [-0.004, +0.009]; r_rb = 0.13; p = 0.476).</w:t>
+        <w:t xml:space="preserve">With MultiRocket features (official split, clean and severity-3 conditions), LOOM is better than PreVal (W/D/L 49/0/2; Δ = +5.203 [+3.809, +7.982]; r_rb = 0.99; p &lt; 0.001) under corruption and not significantly different from PreVal (W/D/L 21/0/30; Δ = -0.005 [-0.014, +0.004]; r_rb = -0.15; p = 0.349) on clean data. With Hydra features the corresponding comparisons are better than PreVal (W/D/L 51/0/0; Δ = +5.505 [+1.565, +9.010]; r_rb = 1.00; p &lt; 0.001) and not significantly different from PreVal (W/D/L 23/0/28; Δ = -0.002 [-0.006, +0.007]; r_rb = -0.00; p = 0.985).</w:t>
       </w:r>
     </w:p>
     <w:p>
@@ -12022,7 +12147,7 @@
       <w:r>
         <w:drawing>
           <wp:inline>
-            <wp:extent cx="3104066" cy="2523010"/>
+            <wp:extent cx="3451860" cy="2092879"/>
             <wp:effectExtent b="0" l="0" r="0" t="0"/>
             <wp:docPr descr="Fig. 8 Fit time versus number of training series (log–log, single core)" title="" id="68" name="Picture"/>
             <a:graphic>
@@ -12043,7 +12168,7 @@
                   <pic:spPr bwMode="auto">
                     <a:xfrm>
                       <a:off x="0" y="0"/>
-                      <a:ext cx="3104066" cy="2523010"/>
+                      <a:ext cx="3451860" cy="2092879"/>
                     </a:xfrm>
                     <a:prstGeom prst="rect">
                       <a:avLst/>
@@ -12227,7 +12352,7 @@
         <w:t xml:space="preserve">(Dempster et al. 2025)</w:t>
       </w:r>
       <w:r>
-        <w:t xml:space="preserve">, and our in-distribution results agree: the two are statistically indistinguishable in NLL on clean data. The difference appears when the test data move. A global scale factor keeps the confidence of a corrupted series at the level appropriate for clean data, so its NLL deteriorates quickly (median 1.728 averaged over the corruptions). LOOM uses the second exact LOO quantity, the held-out leverage, to put each prediction on the scale of its own predictive uncertainty. Its median NLL under corruption is 0.738, and its confidence separates corrupted from clean inputs better than any other readout and than QUANT (median shift AUROC 0.765 vs 0.711 for QUANT, the strongest competitor). Under corruption, QUANT, a tree ensemble on raw-series quantile features, reaches a similar NLL (0.716; not significantly different from LOOM), but at a higher clean NLL and about 4.0 times the median end-to-end fit time of LOOM including the MiniRocket transform (Tables 1 and 5). The ablation attributes the gain to the leverage moderation: PreVal with the same target smoothing remains far behind under corruption. It also shows that the exact LOO pairs matter, since fitting the same calibrator on in-sample pairs or on a hold-out split is clearly worse.</w:t>
+        <w:t xml:space="preserve">, and our in-distribution results agree: the two are statistically indistinguishable in NLL on clean data. The difference appears when the test data move. A global scale factor keeps the confidence of a corrupted series at the level appropriate for clean data, so its NLL deteriorates quickly (median 1.728 averaged over the corruptions). LOOM uses the second exact LOO quantity, the held-out leverage, to put each prediction on the scale of its own predictive uncertainty. Its median NLL under corruption is 0.738, and its confidence separates corrupted from clean inputs better than any other readout and than QUANT (median shift AUROC 0.765 vs 0.711 for QUANT, the strongest competitor). Under corruption, QUANT, a tree ensemble on raw-series quantile features, reaches a similar NLL on average (0.716; not significantly different from LOOM) and a lower NLL under the strongest corruptions (Section 6.3), but at a higher clean NLL and about 4.0 times the median end-to-end fit time of LOOM including the MiniRocket transform (Tables 1 and 5). The ablation attributes the gain to the leverage moderation: PreVal with the same target smoothing remains far behind under corruption. It also shows that the exact LOO pairs matter, since fitting the same calibrator on in-sample pairs or on a hold-out split is clearly worse.</w:t>
       </w:r>
     </w:p>
     <w:p>
@@ -12542,7 +12667,7 @@
         <w:pStyle w:val="FirstParagraph"/>
       </w:pPr>
       <w:r>
-        <w:t xml:space="preserve">We proposed LOOM, a closed-form probabilistic readout for random convolutional kernel time series classifiers. It divides ridge logits by the square root of their leverage and fits one temperature and the ridge penalty on exact leave-one-out score–leverage pairs, so it needs no held-out data, refitting or ensembles. The same identities give exact jackknife+ prediction sets. On 114 UCR datasets with five resamples, LOOM matches the best existing closed-form readout (PreVal) in-distribution in NLL, at the price of a higher ECE caused by target smoothing. Under 18 synthetic test-time corruptions it reduces the median NLL from 1.728 to 0.738, better than the other closed-form and cross-validated readouts, and its confidence detects corrupted inputs much better (median AUROC 0.765 vs 0.563). The fit costs essentially the same as the ridge readout itself. The protection is specific to shifts that move inputs away from the training feature span: under a natural cross-axis sensor shift that leaves leverage almost unchanged, its advantage over PreVal is small. Future work includes multivariate series, real deployment shifts, adaptive smoothing for many-class few-shot problems, and moderation signals that also respond to shifts that leave the feature span unchanged.</w:t>
+        <w:t xml:space="preserve">We proposed LOOM, a closed-form probabilistic readout for random convolutional kernel time series classifiers. It divides ridge logits by the square root of their leverage and fits one temperature and the ridge penalty on exact leave-one-out score–leverage pairs, so it needs no held-out data, refitting or ensembles. The same identities give exact jackknife+ prediction sets. On 114 UCR datasets with five resamples, LOOM matches the best existing closed-form readout (PreVal) in-distribution in NLL, at the price of a higher ECE caused by target smoothing. Under 18 synthetic test-time corruptions it reduces the median NLL from 1.728 to 0.738, better than the other closed-form and cross-validated readouts, and its confidence detects corrupted inputs much better (median AUROC 0.765 vs 0.563). LOOM is on par with the tree-based QUANT classifier on average but worse than it under the strongest corruptions. The fit costs essentially the same as the ridge readout itself. The protection is specific to shifts that move inputs away from the training feature span: under a natural cross-axis sensor shift that leaves leverage almost unchanged, its advantage over PreVal is small. Future work includes multivariate series, real deployment shifts, adaptive smoothing for many-class few-shot problems, and moderation signals that also respond to shifts that leave the feature span unchanged.</w:t>
       </w:r>
     </w:p>
     <w:bookmarkEnd w:id="76"/>

</xml_diff>

<commit_message>
Add Online Resources builder, cover letter and title page DOCX for JKSU-CIS and ESWA
Co-Authored-By: Claude Opus 5.5 <noreply@anthropic.com>
Claude-Session: https://claude.ai/code/session_01N37jqkuXFqBzMgdEb5bNnp
</commit_message>
<xml_diff>
--- a/Target_Journal_Submission/manuscript/Final_Manuscript.docx
+++ b/Target_Journal_Submission/manuscript/Final_Manuscript.docx
@@ -1250,7 +1250,19 @@
         <w:t xml:space="preserve"> </w:t>
       </w:r>
       <w:r>
-        <w:t xml:space="preserve">∈ ℝⁿˣᵖ denotes the centred training matrix and Y ∈ {−1, +1}ⁿˣᴷ the one-vs-rest targets. With an unpenalised intercept and penalty λ, the readout uses the augmented feature vector x̃(x) = (1, ψ(x)), where ψ(x) are the centred standardised features; with X̃ stacking the training vectors,</w:t>
+        <w:t xml:space="preserve">∈ ℝⁿˣᵖ denotes the centred training matrix and Y ∈ {−1, +1}ⁿˣᴷ the one-vs-rest targets. The readout is ridge regression</w:t>
+      </w:r>
+      <w:r>
+        <w:t xml:space="preserve"> </w:t>
+      </w:r>
+      <w:r>
+        <w:t xml:space="preserve">(Hoerl and Kennard 1970)</w:t>
+      </w:r>
+      <w:r>
+        <w:t xml:space="preserve"> </w:t>
+      </w:r>
+      <w:r>
+        <w:t xml:space="preserve">with an unpenalised intercept and penalty λ; it uses the augmented feature vector x̃(x) = (1, ψ(x)), where ψ(x) are the centred standardised features; with X̃ stacking the training vectors,</w:t>
       </w:r>
     </w:p>
     <w:p>
@@ -8261,7 +8273,7 @@
         <w:pStyle w:val="FirstParagraph"/>
       </w:pPr>
       <w:r>
-        <w:t xml:space="preserve">Table 3 compares LOOM with five-member ensembles and the two raw-series probabilistic classifiers on the official split. On clean data LOOM is worse than PreVal, 5-seed ensemble (W/D/L 31/0/83; Δ = -0.020 [-0.030, -0.012]; r_rb = -0.46; p &lt; 0.001), better than QUANT (W/D/L 69/0/43; Δ = +0.028 [+0.004, +0.062]; r_rb = 0.31; p = 0.005) and better than Arsenal (W/D/L 92/0/19; Δ = +1.404 [+0.923, +1.981]; r_rb = 0.93; p &lt; 0.001). Because the Arsenal was evaluated on clean and severity-3 data only, the corrupted-data comparison in this section uses the six severity-3 conditions for every method (a correction made after the results were first inspected, when an earlier version had averaged the other methods over all 18 conditions; Online Resource 2). Under these strongest corruptions, LOOM is better than PreVal, 5-seed ensemble (W/D/L 104/0/10; Δ = +0.654 [+0.512, +0.784]; r_rb = 0.94; p &lt; 0.001), worse than QUANT (W/D/L 35/0/77; Δ = -0.050 [-0.093, -0.030]; r_rb = -0.23; p = 0.032) and better than Arsenal (W/D/L 108/0/3; Δ = +6.249 [+5.103, +6.941]; r_rb = 1.00; p &lt; 0.001). The Arsenal’s high NLL is largely caused by its vote-based probabilities, which often assign exactly zero probability to the true class: in the Brier score, which is bounded, the clean comparison is much closer (median 0.171 vs 0.163 for LOOM; LOOM is better than Arsenal (W/D/L 67/0/44; Δ = +0.007 [+0.002, +0.018]; r_rb = 0.43; p &lt; 0.001)), while under severity-3 corruption LOOM is better than Arsenal (W/D/L 94/0/17; Δ = +0.129 [+0.107, +0.150]; r_rb = 0.83; p &lt; 0.001) in Brier score. The comparison with QUANT depends on the corruption strength: averaged over all 18 conditions and five resamples (Table 2) the two are not significantly different, but at severity 3 LOOM is worse than QUANT (W/D/L 35/0/77; Δ = -0.050 [-0.093, -0.030]; r_rb = -0.23; p = 0.032) in NLL. The overall parity with QUANT hides a dependence on the corruption type (Fig. 4): at severity 3, QUANT has the lower median NLL for baseline wander, missing segments and spikes, and LOOM for Gaussian noise, time warping and circular shifts. We did not investigate the cause of this difference; it concerns the feature representation (raw-series quantiles versus random convolutions) rather than the readout, so LOOM-style moderation of a QUANT-like model is a possible extension. Averaging five LOOM models gives a median clean NLL of 0.329 and a corrupted NLL of 1.003.</w:t>
+        <w:t xml:space="preserve">Table 3 compares LOOM with five-member ensembles and the two raw-series probabilistic classifiers on the official split. On clean data LOOM is worse than PreVal, 5-seed ensemble (W/D/L 31/0/83; Δ = -0.020 [-0.030, -0.012]; r_rb = -0.46; p &lt; 0.001), better than QUANT (W/D/L 69/0/43; Δ = +0.028 [+0.004, +0.062]; r_rb = 0.31; p = 0.005) and better than Arsenal (W/D/L 92/0/19; Δ = +1.404 [+0.923, +1.981]; r_rb = 0.93; p &lt; 0.001). Because the Arsenal was evaluated on clean and severity-3 data only, the corrupted-data comparison in this section uses the six severity-3 conditions for every method (a correction made after the results were first inspected, when an earlier version had averaged the other methods over all 18 conditions; Online Resource 2). Under these strongest corruptions, LOOM is better than PreVal, 5-seed ensemble (W/D/L 104/0/10; Δ = +0.654 [+0.512, +0.784]; r_rb = 0.94; p &lt; 0.001), worse than QUANT (W/D/L 35/0/77; Δ = -0.050 [-0.093, -0.030]; r_rb = -0.23; p = 0.032) and better than Arsenal (W/D/L 108/0/3; Δ = +6.249 [+5.103, +6.941]; r_rb = 1.00; p &lt; 0.001). The Arsenal’s high NLL is largely caused by its vote-based probabilities, which often assign exactly zero probability to the true class: in the Brier score, which is bounded, the clean comparison is much closer (median 0.171 vs 0.163 for LOOM; LOOM is better than Arsenal (W/D/L 67/0/44; Δ = +0.007 [+0.002, +0.018]; r_rb = 0.43; p &lt; 0.001)), while under severity-3 corruption LOOM is better than Arsenal (W/D/L 94/0/17; Δ = +0.129 [+0.107, +0.150]; r_rb = 0.83; p &lt; 0.001) in Brier score. The comparison with QUANT depends on the corruption strength: averaged over all 18 conditions and five resamples (Table 2) the two are not significantly different, but at severity 3 QUANT is significantly better (see above). The overall parity with QUANT hides a dependence on the corruption type (Fig. 4): at severity 3, QUANT has the lower median NLL for baseline wander, missing segments and spikes, and LOOM for Gaussian noise, time warping and circular shifts. We did not investigate the cause of this difference; it concerns the feature representation (raw-series quantiles versus random convolutions) rather than the readout, so LOOM-style moderation of a QUANT-like model is a possible extension. Averaging five LOOM models gives a median clean NLL of 0.329 and a severity-3 NLL of 1.003 (single LOOM: 0.331 and 1.020).</w:t>
       </w:r>
     </w:p>
     <w:p>
@@ -12671,7 +12683,7 @@
       </w:r>
     </w:p>
     <w:bookmarkEnd w:id="76"/>
-    <w:bookmarkStart w:id="171" w:name="references"/>
+    <w:bookmarkStart w:id="173" w:name="references"/>
     <w:p>
       <w:pPr>
         <w:pStyle w:val="Heading1"/>
@@ -12680,7 +12692,7 @@
         <w:t xml:space="preserve">References</w:t>
       </w:r>
     </w:p>
-    <w:bookmarkStart w:id="170" w:name="refs"/>
+    <w:bookmarkStart w:id="172" w:name="refs"/>
     <w:bookmarkStart w:id="78" w:name="ref-abdar2021"/>
     <w:p>
       <w:pPr>
@@ -13121,17 +13133,41 @@
       </w:r>
     </w:p>
     <w:bookmarkEnd w:id="114"/>
-    <w:bookmarkStart w:id="115" w:name="ref-holm1979"/>
+    <w:bookmarkStart w:id="116" w:name="ref-hoerl1970"/>
     <w:p>
       <w:pPr>
         <w:pStyle w:val="Bibliography"/>
       </w:pPr>
       <w:r>
+        <w:t xml:space="preserve">Hoerl AE, Kennard RW (1970)</w:t>
+      </w:r>
+      <w:r>
+        <w:t xml:space="preserve"> </w:t>
+      </w:r>
+      <w:hyperlink r:id="rId115">
+        <w:r>
+          <w:rPr>
+            <w:rStyle w:val="Hyperlink"/>
+          </w:rPr>
+          <w:t xml:space="preserve">Ridge Regression: Biased Estimation for Nonorthogonal Problems</w:t>
+        </w:r>
+      </w:hyperlink>
+      <w:r>
+        <w:t xml:space="preserve">. Technometrics 12:55–67</w:t>
+      </w:r>
+    </w:p>
+    <w:bookmarkEnd w:id="116"/>
+    <w:bookmarkStart w:id="117" w:name="ref-holm1979"/>
+    <w:p>
+      <w:pPr>
+        <w:pStyle w:val="Bibliography"/>
+      </w:pPr>
+      <w:r>
         <w:t xml:space="preserve">Holm S (1979) A simple sequentially rejective multiple test procedure. Scandinavian Journal of Statistics 6:65–70</w:t>
       </w:r>
     </w:p>
-    <w:bookmarkEnd w:id="115"/>
-    <w:bookmarkStart w:id="117" w:name="ref-ismailfawaz2019review"/>
+    <w:bookmarkEnd w:id="117"/>
+    <w:bookmarkStart w:id="119" w:name="ref-ismailfawaz2019review"/>
     <w:p>
       <w:pPr>
         <w:pStyle w:val="Bibliography"/>
@@ -13142,7 +13178,7 @@
       <w:r>
         <w:t xml:space="preserve"> </w:t>
       </w:r>
-      <w:hyperlink r:id="rId116">
+      <w:hyperlink r:id="rId118">
         <w:r>
           <w:rPr>
             <w:rStyle w:val="Hyperlink"/>
@@ -13154,8 +13190,8 @@
         <w:t xml:space="preserve">. Data Mining and Knowledge Discovery 33:917–963</w:t>
       </w:r>
     </w:p>
-    <w:bookmarkEnd w:id="117"/>
-    <w:bookmarkStart w:id="119" w:name="ref-ismailfawaz2020inception"/>
+    <w:bookmarkEnd w:id="119"/>
+    <w:bookmarkStart w:id="121" w:name="ref-ismailfawaz2020inception"/>
     <w:p>
       <w:pPr>
         <w:pStyle w:val="Bibliography"/>
@@ -13166,7 +13202,7 @@
       <w:r>
         <w:t xml:space="preserve"> </w:t>
       </w:r>
-      <w:hyperlink r:id="rId118">
+      <w:hyperlink r:id="rId120">
         <w:r>
           <w:rPr>
             <w:rStyle w:val="Hyperlink"/>
@@ -13178,8 +13214,8 @@
         <w:t xml:space="preserve">. Data Mining and Knowledge Discovery 34:1936–1962</w:t>
       </w:r>
     </w:p>
-    <w:bookmarkEnd w:id="119"/>
-    <w:bookmarkStart w:id="121" w:name="ref-iwana2021"/>
+    <w:bookmarkEnd w:id="121"/>
+    <w:bookmarkStart w:id="123" w:name="ref-iwana2021"/>
     <w:p>
       <w:pPr>
         <w:pStyle w:val="Bibliography"/>
@@ -13190,7 +13226,7 @@
       <w:r>
         <w:t xml:space="preserve"> </w:t>
       </w:r>
-      <w:hyperlink r:id="rId120">
+      <w:hyperlink r:id="rId122">
         <w:r>
           <w:rPr>
             <w:rStyle w:val="Hyperlink"/>
@@ -13202,8 +13238,8 @@
         <w:t xml:space="preserve">. PLOS ONE 16:e0254841</w:t>
       </w:r>
     </w:p>
-    <w:bookmarkEnd w:id="121"/>
-    <w:bookmarkStart w:id="123" w:name="ref-kerby2014"/>
+    <w:bookmarkEnd w:id="123"/>
+    <w:bookmarkStart w:id="125" w:name="ref-kerby2014"/>
     <w:p>
       <w:pPr>
         <w:pStyle w:val="Bibliography"/>
@@ -13214,7 +13250,7 @@
       <w:r>
         <w:t xml:space="preserve"> </w:t>
       </w:r>
-      <w:hyperlink r:id="rId122">
+      <w:hyperlink r:id="rId124">
         <w:r>
           <w:rPr>
             <w:rStyle w:val="Hyperlink"/>
@@ -13226,8 +13262,8 @@
         <w:t xml:space="preserve">. Comprehensive Psychology 3:11.IT.3.1</w:t>
       </w:r>
     </w:p>
-    <w:bookmarkEnd w:id="123"/>
-    <w:bookmarkStart w:id="124" w:name="ref-kristiadi2020"/>
+    <w:bookmarkEnd w:id="125"/>
+    <w:bookmarkStart w:id="126" w:name="ref-kristiadi2020"/>
     <w:p>
       <w:pPr>
         <w:pStyle w:val="Bibliography"/>
@@ -13236,8 +13272,8 @@
         <w:t xml:space="preserve">Kristiadi A, Hein M, Hennig P (2020) Being Bayesian, even just a bit, fixes overconfidence in ReLU networks. In: Proceedings of the 37th International Conference on Machine Learning. pp 5436–5446</w:t>
       </w:r>
     </w:p>
-    <w:bookmarkEnd w:id="124"/>
-    <w:bookmarkStart w:id="125" w:name="ref-kull2019"/>
+    <w:bookmarkEnd w:id="126"/>
+    <w:bookmarkStart w:id="127" w:name="ref-kull2019"/>
     <w:p>
       <w:pPr>
         <w:pStyle w:val="Bibliography"/>
@@ -13246,8 +13282,8 @@
         <w:t xml:space="preserve">Kull M, Perello-Nieto M, Kängsepp M, et al (2019) Beyond temperature scaling: obtaining well-calibrated multi-class probabilities with Dirichlet calibration. In: Advances in Neural Information Processing Systems</w:t>
       </w:r>
     </w:p>
-    <w:bookmarkEnd w:id="125"/>
-    <w:bookmarkStart w:id="126" w:name="ref-lakshminarayanan2017"/>
+    <w:bookmarkEnd w:id="127"/>
+    <w:bookmarkStart w:id="128" w:name="ref-lakshminarayanan2017"/>
     <w:p>
       <w:pPr>
         <w:pStyle w:val="Bibliography"/>
@@ -13256,8 +13292,8 @@
         <w:t xml:space="preserve">Lakshminarayanan B, Pritzel A, Blundell C (2017) Simple and scalable predictive uncertainty estimation using deep ensembles. In: Advances in Neural Information Processing Systems</w:t>
       </w:r>
     </w:p>
-    <w:bookmarkEnd w:id="126"/>
-    <w:bookmarkStart w:id="128" w:name="ref-lei2018"/>
+    <w:bookmarkEnd w:id="128"/>
+    <w:bookmarkStart w:id="130" w:name="ref-lei2018"/>
     <w:p>
       <w:pPr>
         <w:pStyle w:val="Bibliography"/>
@@ -13268,7 +13304,7 @@
       <w:r>
         <w:t xml:space="preserve"> </w:t>
       </w:r>
-      <w:hyperlink r:id="rId127">
+      <w:hyperlink r:id="rId129">
         <w:r>
           <w:rPr>
             <w:rStyle w:val="Hyperlink"/>
@@ -13280,8 +13316,8 @@
         <w:t xml:space="preserve">. Journal of the American Statistical Association 113:1094–1111</w:t>
       </w:r>
     </w:p>
-    <w:bookmarkEnd w:id="128"/>
-    <w:bookmarkStart w:id="129" w:name="ref-liu2020sngp"/>
+    <w:bookmarkEnd w:id="130"/>
+    <w:bookmarkStart w:id="131" w:name="ref-liu2020sngp"/>
     <w:p>
       <w:pPr>
         <w:pStyle w:val="Bibliography"/>
@@ -13290,8 +13326,8 @@
         <w:t xml:space="preserve">Liu JZ, Lin Z, Padhy S, et al (2020) Simple and principled uncertainty estimation with deterministic deep learning via distance awareness. In: Advances in Neural Information Processing Systems</w:t>
       </w:r>
     </w:p>
-    <w:bookmarkEnd w:id="129"/>
-    <w:bookmarkStart w:id="130" w:name="ref-liu2023sngp"/>
+    <w:bookmarkEnd w:id="131"/>
+    <w:bookmarkStart w:id="132" w:name="ref-liu2023sngp"/>
     <w:p>
       <w:pPr>
         <w:pStyle w:val="Bibliography"/>
@@ -13300,8 +13336,8 @@
         <w:t xml:space="preserve">Liu JZ, Padhy S, Ren J, et al (2023) A simple approach to improve single-model deep uncertainty via distance-awareness. Journal of Machine Learning Research 24:1–63</w:t>
       </w:r>
     </w:p>
-    <w:bookmarkEnd w:id="130"/>
-    <w:bookmarkStart w:id="132" w:name="ref-mackay1992"/>
+    <w:bookmarkEnd w:id="132"/>
+    <w:bookmarkStart w:id="134" w:name="ref-mackay1992"/>
     <w:p>
       <w:pPr>
         <w:pStyle w:val="Bibliography"/>
@@ -13312,7 +13348,7 @@
       <w:r>
         <w:t xml:space="preserve"> </w:t>
       </w:r>
-      <w:hyperlink r:id="rId131">
+      <w:hyperlink r:id="rId133">
         <w:r>
           <w:rPr>
             <w:rStyle w:val="Hyperlink"/>
@@ -13324,8 +13360,8 @@
         <w:t xml:space="preserve">. Neural Computation 4:720–736</w:t>
       </w:r>
     </w:p>
-    <w:bookmarkEnd w:id="132"/>
-    <w:bookmarkStart w:id="133" w:name="ref-aeon2024"/>
+    <w:bookmarkEnd w:id="134"/>
+    <w:bookmarkStart w:id="135" w:name="ref-aeon2024"/>
     <w:p>
       <w:pPr>
         <w:pStyle w:val="Bibliography"/>
@@ -13334,8 +13370,8 @@
         <w:t xml:space="preserve">Middlehurst M, Ismail-Fawaz A, Guillaume A, et al (2024a) aeon: a Python toolkit for learning from time series. Journal of Machine Learning Research 25:1–10</w:t>
       </w:r>
     </w:p>
-    <w:bookmarkEnd w:id="133"/>
-    <w:bookmarkStart w:id="135" w:name="ref-middlehurst2021hc2"/>
+    <w:bookmarkEnd w:id="135"/>
+    <w:bookmarkStart w:id="137" w:name="ref-middlehurst2021hc2"/>
     <w:p>
       <w:pPr>
         <w:pStyle w:val="Bibliography"/>
@@ -13346,7 +13382,7 @@
       <w:r>
         <w:t xml:space="preserve"> </w:t>
       </w:r>
-      <w:hyperlink r:id="rId134">
+      <w:hyperlink r:id="rId136">
         <w:r>
           <w:rPr>
             <w:rStyle w:val="Hyperlink"/>
@@ -13358,8 +13394,8 @@
         <w:t xml:space="preserve">. Machine Learning 110:3211–3243</w:t>
       </w:r>
     </w:p>
-    <w:bookmarkEnd w:id="135"/>
-    <w:bookmarkStart w:id="137" w:name="ref-middlehurst2024bakeoff"/>
+    <w:bookmarkEnd w:id="137"/>
+    <w:bookmarkStart w:id="139" w:name="ref-middlehurst2024bakeoff"/>
     <w:p>
       <w:pPr>
         <w:pStyle w:val="Bibliography"/>
@@ -13370,7 +13406,7 @@
       <w:r>
         <w:t xml:space="preserve"> </w:t>
       </w:r>
-      <w:hyperlink r:id="rId136">
+      <w:hyperlink r:id="rId138">
         <w:r>
           <w:rPr>
             <w:rStyle w:val="Hyperlink"/>
@@ -13382,8 +13418,8 @@
         <w:t xml:space="preserve">. Data Mining and Knowledge Discovery 38:1958–2031</w:t>
       </w:r>
     </w:p>
-    <w:bookmarkEnd w:id="137"/>
-    <w:bookmarkStart w:id="139" w:name="ref-niculescu2005"/>
+    <w:bookmarkEnd w:id="139"/>
+    <w:bookmarkStart w:id="141" w:name="ref-niculescu2005"/>
     <w:p>
       <w:pPr>
         <w:pStyle w:val="Bibliography"/>
@@ -13394,7 +13430,7 @@
       <w:r>
         <w:t xml:space="preserve"> </w:t>
       </w:r>
-      <w:hyperlink r:id="rId138">
+      <w:hyperlink r:id="rId140">
         <w:r>
           <w:rPr>
             <w:rStyle w:val="Hyperlink"/>
@@ -13406,8 +13442,8 @@
         <w:t xml:space="preserve">. Proceedings of the 22nd international conference on Machine learning - ICML ’05 625–632</w:t>
       </w:r>
     </w:p>
-    <w:bookmarkEnd w:id="139"/>
-    <w:bookmarkStart w:id="140" w:name="ref-nouretdinov2001"/>
+    <w:bookmarkEnd w:id="141"/>
+    <w:bookmarkStart w:id="142" w:name="ref-nouretdinov2001"/>
     <w:p>
       <w:pPr>
         <w:pStyle w:val="Bibliography"/>
@@ -13416,8 +13452,8 @@
         <w:t xml:space="preserve">Nouretdinov I, Melluish T, Vovk V (2001) Ridge regression confidence machine. In: Proceedings of the 18th International Conference on Machine Learning. Morgan Kaufmann, San Francisco, pp 385–392</w:t>
       </w:r>
     </w:p>
-    <w:bookmarkEnd w:id="140"/>
-    <w:bookmarkStart w:id="141" w:name="ref-ovadia2019"/>
+    <w:bookmarkEnd w:id="142"/>
+    <w:bookmarkStart w:id="143" w:name="ref-ovadia2019"/>
     <w:p>
       <w:pPr>
         <w:pStyle w:val="Bibliography"/>
@@ -13426,8 +13462,8 @@
         <w:t xml:space="preserve">Ovadia Y, Fertig E, Ren J, et al (2019) Can you trust your model’s uncertainty? Evaluating predictive uncertainty under dataset shift. In: Advances in Neural Information Processing Systems</w:t>
       </w:r>
     </w:p>
-    <w:bookmarkEnd w:id="141"/>
-    <w:bookmarkStart w:id="142" w:name="ref-pedregosa2011"/>
+    <w:bookmarkEnd w:id="143"/>
+    <w:bookmarkStart w:id="144" w:name="ref-pedregosa2011"/>
     <w:p>
       <w:pPr>
         <w:pStyle w:val="Bibliography"/>
@@ -13436,8 +13472,8 @@
         <w:t xml:space="preserve">Pedregosa F, Varoquaux G, Gramfort A, et al (2011) Scikit-learn: machine learning in Python. Journal of Machine Learning Research 12:2825–2830</w:t>
       </w:r>
     </w:p>
-    <w:bookmarkEnd w:id="142"/>
-    <w:bookmarkStart w:id="143" w:name="ref-platt1999"/>
+    <w:bookmarkEnd w:id="144"/>
+    <w:bookmarkStart w:id="145" w:name="ref-platt1999"/>
     <w:p>
       <w:pPr>
         <w:pStyle w:val="Bibliography"/>
@@ -13446,8 +13482,8 @@
         <w:t xml:space="preserve">Platt JC (2000) Probabilistic outputs for support vector machines and comparisons to regularized likelihood methods. In: Smola AJ, Bartlett P, Schölkopf B, Schuurmans D (eds) Advances in Large Margin Classifiers. MIT Press, Cambridge, MA, pp 61–74</w:t>
       </w:r>
     </w:p>
-    <w:bookmarkEnd w:id="143"/>
-    <w:bookmarkStart w:id="145" w:name="ref-ragab2023"/>
+    <w:bookmarkEnd w:id="145"/>
+    <w:bookmarkStart w:id="147" w:name="ref-ragab2023"/>
     <w:p>
       <w:pPr>
         <w:pStyle w:val="Bibliography"/>
@@ -13458,7 +13494,7 @@
       <w:r>
         <w:t xml:space="preserve"> </w:t>
       </w:r>
-      <w:hyperlink r:id="rId144">
+      <w:hyperlink r:id="rId146">
         <w:r>
           <w:rPr>
             <w:rStyle w:val="Hyperlink"/>
@@ -13470,8 +13506,8 @@
         <w:t xml:space="preserve">. ACM Transactions on Knowledge Discovery from Data 17:1–18</w:t>
       </w:r>
     </w:p>
-    <w:bookmarkEnd w:id="145"/>
-    <w:bookmarkStart w:id="146" w:name="ref-romano2020"/>
+    <w:bookmarkEnd w:id="147"/>
+    <w:bookmarkStart w:id="148" w:name="ref-romano2020"/>
     <w:p>
       <w:pPr>
         <w:pStyle w:val="Bibliography"/>
@@ -13480,8 +13516,8 @@
         <w:t xml:space="preserve">Romano Y, Sesia M, Candès EJ (2020) Classification with valid and adaptive coverage. In: Advances in Neural Information Processing Systems</w:t>
       </w:r>
     </w:p>
-    <w:bookmarkEnd w:id="146"/>
-    <w:bookmarkStart w:id="148" w:name="ref-ruiz2021"/>
+    <w:bookmarkEnd w:id="148"/>
+    <w:bookmarkStart w:id="150" w:name="ref-ruiz2021"/>
     <w:p>
       <w:pPr>
         <w:pStyle w:val="Bibliography"/>
@@ -13492,7 +13528,7 @@
       <w:r>
         <w:t xml:space="preserve"> </w:t>
       </w:r>
-      <w:hyperlink r:id="rId147">
+      <w:hyperlink r:id="rId149">
         <w:r>
           <w:rPr>
             <w:rStyle w:val="Hyperlink"/>
@@ -13504,8 +13540,8 @@
         <w:t xml:space="preserve">. Data Mining and Knowledge Discovery 35:401–449</w:t>
       </w:r>
     </w:p>
-    <w:bookmarkEnd w:id="148"/>
-    <w:bookmarkStart w:id="150" w:name="ref-sadinle2019"/>
+    <w:bookmarkEnd w:id="150"/>
+    <w:bookmarkStart w:id="152" w:name="ref-sadinle2019"/>
     <w:p>
       <w:pPr>
         <w:pStyle w:val="Bibliography"/>
@@ -13516,7 +13552,7 @@
       <w:r>
         <w:t xml:space="preserve"> </w:t>
       </w:r>
-      <w:hyperlink r:id="rId149">
+      <w:hyperlink r:id="rId151">
         <w:r>
           <w:rPr>
             <w:rStyle w:val="Hyperlink"/>
@@ -13528,8 +13564,8 @@
         <w:t xml:space="preserve">. Journal of the American Statistical Association 114:223–234</w:t>
       </w:r>
     </w:p>
-    <w:bookmarkEnd w:id="150"/>
-    <w:bookmarkStart w:id="152" w:name="ref-silvafilho2023"/>
+    <w:bookmarkEnd w:id="152"/>
+    <w:bookmarkStart w:id="154" w:name="ref-silvafilho2023"/>
     <w:p>
       <w:pPr>
         <w:pStyle w:val="Bibliography"/>
@@ -13540,7 +13576,7 @@
       <w:r>
         <w:t xml:space="preserve"> </w:t>
       </w:r>
-      <w:hyperlink r:id="rId151">
+      <w:hyperlink r:id="rId153">
         <w:r>
           <w:rPr>
             <w:rStyle w:val="Hyperlink"/>
@@ -13552,8 +13588,8 @@
         <w:t xml:space="preserve">. Machine Learning 112:3211–3260</w:t>
       </w:r>
     </w:p>
-    <w:bookmarkEnd w:id="152"/>
-    <w:bookmarkStart w:id="154" w:name="ref-suykens1999"/>
+    <w:bookmarkEnd w:id="154"/>
+    <w:bookmarkStart w:id="156" w:name="ref-suykens1999"/>
     <w:p>
       <w:pPr>
         <w:pStyle w:val="Bibliography"/>
@@ -13564,7 +13600,7 @@
       <w:r>
         <w:t xml:space="preserve"> </w:t>
       </w:r>
-      <w:hyperlink r:id="rId153">
+      <w:hyperlink r:id="rId155">
         <w:r>
           <w:rPr>
             <w:rStyle w:val="Hyperlink"/>
@@ -13576,8 +13612,8 @@
         <w:t xml:space="preserve">. Neural Processing Letters 9:293–300</w:t>
       </w:r>
     </w:p>
-    <w:bookmarkEnd w:id="154"/>
-    <w:bookmarkStart w:id="156" w:name="ref-tan2022multirocket"/>
+    <w:bookmarkEnd w:id="156"/>
+    <w:bookmarkStart w:id="158" w:name="ref-tan2022multirocket"/>
     <w:p>
       <w:pPr>
         <w:pStyle w:val="Bibliography"/>
@@ -13588,7 +13624,7 @@
       <w:r>
         <w:t xml:space="preserve"> </w:t>
       </w:r>
-      <w:hyperlink r:id="rId155">
+      <w:hyperlink r:id="rId157">
         <w:r>
           <w:rPr>
             <w:rStyle w:val="Hyperlink"/>
@@ -13600,8 +13636,8 @@
         <w:t xml:space="preserve">. Data Mining and Knowledge Discovery 36:1623–1646</w:t>
       </w:r>
     </w:p>
-    <w:bookmarkEnd w:id="156"/>
-    <w:bookmarkStart w:id="158" w:name="ref-tibshirani2002"/>
+    <w:bookmarkEnd w:id="158"/>
+    <w:bookmarkStart w:id="160" w:name="ref-tibshirani2002"/>
     <w:p>
       <w:pPr>
         <w:pStyle w:val="Bibliography"/>
@@ -13612,7 +13648,7 @@
       <w:r>
         <w:t xml:space="preserve"> </w:t>
       </w:r>
-      <w:hyperlink r:id="rId157">
+      <w:hyperlink r:id="rId159">
         <w:r>
           <w:rPr>
             <w:rStyle w:val="Hyperlink"/>
@@ -13624,8 +13660,8 @@
         <w:t xml:space="preserve">. Statistical Applications in Genetics and Molecular Biology 1</w:t>
       </w:r>
     </w:p>
-    <w:bookmarkEnd w:id="158"/>
-    <w:bookmarkStart w:id="160" w:name="ref-um2017"/>
+    <w:bookmarkEnd w:id="160"/>
+    <w:bookmarkStart w:id="162" w:name="ref-um2017"/>
     <w:p>
       <w:pPr>
         <w:pStyle w:val="Bibliography"/>
@@ -13636,7 +13672,7 @@
       <w:r>
         <w:t xml:space="preserve"> </w:t>
       </w:r>
-      <w:hyperlink r:id="rId159">
+      <w:hyperlink r:id="rId161">
         <w:r>
           <w:rPr>
             <w:rStyle w:val="Hyperlink"/>
@@ -13648,8 +13684,8 @@
         <w:t xml:space="preserve">. Proceedings of the 19th ACM International Conference on Multimodal Interaction 216–220</w:t>
       </w:r>
     </w:p>
-    <w:bookmarkEnd w:id="160"/>
-    <w:bookmarkStart w:id="161" w:name="ref-vanamersfoort2020"/>
+    <w:bookmarkEnd w:id="162"/>
+    <w:bookmarkStart w:id="163" w:name="ref-vanamersfoort2020"/>
     <w:p>
       <w:pPr>
         <w:pStyle w:val="Bibliography"/>
@@ -13658,8 +13694,8 @@
         <w:t xml:space="preserve">van Amersfoort J, Smith L, Teh YW, Gal Y (2020) Uncertainty estimation using a single deep deterministic neural network. In: Proceedings of the 37th International Conference on Machine Learning. pp 9690–9700</w:t>
       </w:r>
     </w:p>
-    <w:bookmarkEnd w:id="161"/>
-    <w:bookmarkStart w:id="163" w:name="ref-vovk2022"/>
+    <w:bookmarkEnd w:id="163"/>
+    <w:bookmarkStart w:id="165" w:name="ref-vovk2022"/>
     <w:p>
       <w:pPr>
         <w:pStyle w:val="Bibliography"/>
@@ -13670,7 +13706,7 @@
       <w:r>
         <w:t xml:space="preserve"> </w:t>
       </w:r>
-      <w:hyperlink r:id="rId162">
+      <w:hyperlink r:id="rId164">
         <w:r>
           <w:rPr>
             <w:rStyle w:val="Hyperlink"/>
@@ -13682,8 +13718,8 @@
         <w:t xml:space="preserve">. Springer International Publishing</w:t>
       </w:r>
     </w:p>
-    <w:bookmarkEnd w:id="163"/>
-    <w:bookmarkStart w:id="165" w:name="ref-wilcoxon1945"/>
+    <w:bookmarkEnd w:id="165"/>
+    <w:bookmarkStart w:id="167" w:name="ref-wilcoxon1945"/>
     <w:p>
       <w:pPr>
         <w:pStyle w:val="Bibliography"/>
@@ -13694,7 +13730,7 @@
       <w:r>
         <w:t xml:space="preserve"> </w:t>
       </w:r>
-      <w:hyperlink r:id="rId164">
+      <w:hyperlink r:id="rId166">
         <w:r>
           <w:rPr>
             <w:rStyle w:val="Hyperlink"/>
@@ -13706,8 +13742,8 @@
         <w:t xml:space="preserve">. Biometrics Bulletin 1:80</w:t>
       </w:r>
     </w:p>
-    <w:bookmarkEnd w:id="165"/>
-    <w:bookmarkStart w:id="167" w:name="ref-xu2023"/>
+    <w:bookmarkEnd w:id="167"/>
+    <w:bookmarkStart w:id="169" w:name="ref-xu2023"/>
     <w:p>
       <w:pPr>
         <w:pStyle w:val="Bibliography"/>
@@ -13718,7 +13754,7 @@
       <w:r>
         <w:t xml:space="preserve"> </w:t>
       </w:r>
-      <w:hyperlink r:id="rId166">
+      <w:hyperlink r:id="rId168">
         <w:r>
           <w:rPr>
             <w:rStyle w:val="Hyperlink"/>
@@ -13730,8 +13766,8 @@
         <w:t xml:space="preserve">. IEEE Transactions on Pattern Analysis and Machine Intelligence 45:11575–11587</w:t>
       </w:r>
     </w:p>
-    <w:bookmarkEnd w:id="167"/>
-    <w:bookmarkStart w:id="169" w:name="ref-zadrozny2002"/>
+    <w:bookmarkEnd w:id="169"/>
+    <w:bookmarkStart w:id="171" w:name="ref-zadrozny2002"/>
     <w:p>
       <w:pPr>
         <w:pStyle w:val="Bibliography"/>
@@ -13742,7 +13778,7 @@
       <w:r>
         <w:t xml:space="preserve"> </w:t>
       </w:r>
-      <w:hyperlink r:id="rId168">
+      <w:hyperlink r:id="rId170">
         <w:r>
           <w:rPr>
             <w:rStyle w:val="Hyperlink"/>
@@ -13754,10 +13790,10 @@
         <w:t xml:space="preserve">. Proceedings of the eighth ACM SIGKDD international conference on Knowledge discovery and data mining 694–699</w:t>
       </w:r>
     </w:p>
-    <w:bookmarkEnd w:id="169"/>
-    <w:bookmarkEnd w:id="170"/>
     <w:bookmarkEnd w:id="171"/>
-    <w:bookmarkStart w:id="172" w:name="statements-and-declarations"/>
+    <w:bookmarkEnd w:id="172"/>
+    <w:bookmarkEnd w:id="173"/>
+    <w:bookmarkStart w:id="174" w:name="statements-and-declarations"/>
     <w:p>
       <w:pPr>
         <w:pStyle w:val="Heading1"/>
@@ -13940,7 +13976,7 @@
         <w:t xml:space="preserve">Not applicable. The study uses only publicly available, de-identified benchmark data.</w:t>
       </w:r>
     </w:p>
-    <w:bookmarkEnd w:id="172"/>
+    <w:bookmarkEnd w:id="174"/>
     <w:sectPr>
       <w:footerReference w:type="default" r:id="rId9"/>
       <w:pgSz w:h="16838" w:w="11906"/>

</xml_diff>

<commit_message>
Final run complete: full analysis, final manuscript builds, Online Resources, final audit, manifest
Co-Authored-By: Claude Opus 5.5 <noreply@anthropic.com>
Claude-Session: https://claude.ai/code/session_01N37jqkuXFqBzMgdEb5bNnp
</commit_message>
<xml_diff>
--- a/Target_Journal_Submission/manuscript/Final_Manuscript.docx
+++ b/Target_Journal_Submission/manuscript/Final_Manuscript.docx
@@ -150,7 +150,16 @@
         <w:pStyle w:val="FirstParagraph"/>
       </w:pPr>
       <w:r>
-        <w:t xml:space="preserve">Consider a wearable heart monitor that classifies each short ECG recording as normal or abnormal, a factory system that labels the signal from a production sensor, or a smartwatch that recognises gestures from an accelerometer. All of these systems make many decisions per day, and nobody can check each one. The usual way to keep such a system safe is to let it decide on its own when it is sure and to pass the remaining cases to a person. For this to work, the classifier’s confidence has to mean something. It must be high when the prediction is likely to be right and low when it is not.</w:t>
+        <w:t xml:space="preserve">Consider a wearable heart monitor that classifies each short ECG recording as normal or abnormal, a factory system that labels the signal from a production sensor, or a smartwatch that recognises gestures from an accelerometer. All of these systems make many decisions per day, and nobody can check each one. The usual way to keep such a system safe is to let it decide on its own when it is sure and to pass the remaining cases to a person. For this to work, the classifier’s confidence has to mean something. It must be high when the prediction is likely to be right and low when it is not, a requirement studied broadly under the name of uncertainty quantification</w:t>
+      </w:r>
+      <w:r>
+        <w:t xml:space="preserve"> </w:t>
+      </w:r>
+      <w:r>
+        <w:t xml:space="preserve">(Abdar et al. 2021; Gawlikowski et al. 2023)</w:t>
+      </w:r>
+      <w:r>
+        <w:t xml:space="preserve">.</w:t>
       </w:r>
     </w:p>
     <w:p>
@@ -3691,7 +3700,7 @@
         <w:t xml:space="preserve"> </w:t>
       </w:r>
       <w:r>
-        <w:t xml:space="preserve">in aeon’s MiniRocket-kernel configuration on the official split only, because the default configuration was too slow for our hardware (Online Resource 2).</w:t>
+        <w:t xml:space="preserve">in aeon’s MiniRocket-kernel configuration on the official split only, because the default configuration was too slow for our hardware (Online Resource 2). Some methods cannot be applied to every dataset. The cross-validated calibrators need at least as many training series per class as folds, and the Arsenal returned undefined (NaN) probabilities on Fungi, which has a single training series per class. These methods are therefore compared on fewer datasets, as the n column of each table shows.</w:t>
       </w:r>
     </w:p>
     <w:p>
@@ -4191,7 +4200,7 @@
         <w:pStyle w:val="FirstParagraph"/>
       </w:pPr>
       <w:r>
-        <w:t xml:space="preserve">Table 1 summarises performance on the clean test sets. On clean data LOOM is as good as the best existing readouts, but not better. Its median NLL is 0.295. Compared with PreVal, LOOM is not significantly different (50 wins, 64 losses, p = 1.000), and the same holds against five-fold Platt scaling and cross-validated logistic regression (Table 1). Compared with hold-out temperature scaling, which gives up 20 % of the training data, LOOM is better on 86 of 114 datasets (p &lt; 0.001), and it is far better than the raw ridge outputs. Accuracy is essentially the same as PreVal’s (median 0.914 vs 0.914), since both use the same ridge scores.</w:t>
+        <w:t xml:space="preserve">Table 1 summarises performance on the clean test sets. On clean data LOOM is as good as the best existing readouts, but not better. Its median NLL is 0.295. Compared with PreVal, LOOM is not significantly different (49 wins, 65 losses, p = 1.000), and the same holds against five-fold Platt scaling and cross-validated logistic regression (Table 1). Compared with hold-out temperature scaling, which gives up 20 % of the training data, LOOM is better on 85 of 114 datasets (p &lt; 0.001), and it is far better than the raw ridge outputs. Accuracy is essentially the same as PreVal’s (median 0.914 vs 0.914), since both use the same ridge scores.</w:t>
       </w:r>
     </w:p>
     <w:p>
@@ -4199,7 +4208,7 @@
         <w:pStyle w:val="BodyText"/>
       </w:pPr>
       <w:r>
-        <w:t xml:space="preserve">There is one cost. LOOM’s calibration error on clean data is higher than PreVal’s (median ECE 0.075 vs 0.040; LOOM worse on 85 of 114 datasets; p &lt; 0.001). The cause is the target smoothing of Section 4.4, which makes LOOM slightly underconfident when there are few training series per class (Section 6.9).</w:t>
+        <w:t xml:space="preserve">There is one cost. LOOM’s calibration error on clean data is higher than PreVal’s (median ECE 0.075 vs 0.040; LOOM worse on 86 of 114 datasets; p &lt; 0.001). The cause is the target smoothing of Section 4.4, which makes LOOM slightly underconfident when there are few training series per class (Section 6.9).</w:t>
       </w:r>
     </w:p>
     <w:p>
@@ -4589,7 +4598,7 @@
                 <w:rFonts w:ascii="Times New Roman" w:hAnsi="Times New Roman"/>
                 <w:sz w:val="16"/>
               </w:rPr>
-              <w:t xml:space="preserve">1.94</w:t>
+              <w:t xml:space="preserve">2.28</w:t>
             </w:r>
           </w:p>
         </w:tc>
@@ -4761,41 +4770,41 @@
                 <w:rFonts w:ascii="Times New Roman" w:hAnsi="Times New Roman"/>
                 <w:sz w:val="16"/>
               </w:rPr>
-              <w:t xml:space="preserve">1.81</w:t>
-            </w:r>
-          </w:p>
-        </w:tc>
-        <w:tc>
-          <w:tcPr/>
-          <w:p>
-            <w:pPr>
-              <w:pStyle w:val="Compact"/>
-              <w:spacing w:after="0" w:line="240" w:lineRule="auto"/>
-              <w:jc w:val="left"/>
-            </w:pPr>
-            <w:r>
-              <w:rPr>
-                <w:rFonts w:ascii="Times New Roman" w:hAnsi="Times New Roman"/>
-                <w:sz w:val="16"/>
-              </w:rPr>
-              <w:t xml:space="preserve">50/0/64</w:t>
-            </w:r>
-          </w:p>
-        </w:tc>
-        <w:tc>
-          <w:tcPr/>
-          <w:p>
-            <w:pPr>
-              <w:pStyle w:val="Compact"/>
-              <w:spacing w:after="0" w:line="240" w:lineRule="auto"/>
-              <w:jc w:val="left"/>
-            </w:pPr>
-            <w:r>
-              <w:rPr>
-                <w:rFonts w:ascii="Times New Roman" w:hAnsi="Times New Roman"/>
-                <w:sz w:val="16"/>
-              </w:rPr>
-              <w:t xml:space="preserve">-0.04</w:t>
+              <w:t xml:space="preserve">2.13</w:t>
+            </w:r>
+          </w:p>
+        </w:tc>
+        <w:tc>
+          <w:tcPr/>
+          <w:p>
+            <w:pPr>
+              <w:pStyle w:val="Compact"/>
+              <w:spacing w:after="0" w:line="240" w:lineRule="auto"/>
+              <w:jc w:val="left"/>
+            </w:pPr>
+            <w:r>
+              <w:rPr>
+                <w:rFonts w:ascii="Times New Roman" w:hAnsi="Times New Roman"/>
+                <w:sz w:val="16"/>
+              </w:rPr>
+              <w:t xml:space="preserve">49/0/65</w:t>
+            </w:r>
+          </w:p>
+        </w:tc>
+        <w:tc>
+          <w:tcPr/>
+          <w:p>
+            <w:pPr>
+              <w:pStyle w:val="Compact"/>
+              <w:spacing w:after="0" w:line="240" w:lineRule="auto"/>
+              <w:jc w:val="left"/>
+            </w:pPr>
+            <w:r>
+              <w:rPr>
+                <w:rFonts w:ascii="Times New Roman" w:hAnsi="Times New Roman"/>
+                <w:sz w:val="16"/>
+              </w:rPr>
+              <w:t xml:space="preserve">-0.06</w:t>
             </w:r>
           </w:p>
         </w:tc>
@@ -4882,7 +4891,7 @@
                 <w:rFonts w:ascii="Times New Roman" w:hAnsi="Times New Roman"/>
                 <w:sz w:val="16"/>
               </w:rPr>
-              <w:t xml:space="preserve">0.053</w:t>
+              <w:t xml:space="preserve">0.052</w:t>
             </w:r>
           </w:p>
         </w:tc>
@@ -4933,41 +4942,41 @@
                 <w:rFonts w:ascii="Times New Roman" w:hAnsi="Times New Roman"/>
                 <w:sz w:val="16"/>
               </w:rPr>
-              <w:t xml:space="preserve">3.02</w:t>
-            </w:r>
-          </w:p>
-        </w:tc>
-        <w:tc>
-          <w:tcPr/>
-          <w:p>
-            <w:pPr>
-              <w:pStyle w:val="Compact"/>
-              <w:spacing w:after="0" w:line="240" w:lineRule="auto"/>
-              <w:jc w:val="left"/>
-            </w:pPr>
-            <w:r>
-              <w:rPr>
-                <w:rFonts w:ascii="Times New Roman" w:hAnsi="Times New Roman"/>
-                <w:sz w:val="16"/>
-              </w:rPr>
-              <w:t xml:space="preserve">86/0/28</w:t>
-            </w:r>
-          </w:p>
-        </w:tc>
-        <w:tc>
-          <w:tcPr/>
-          <w:p>
-            <w:pPr>
-              <w:pStyle w:val="Compact"/>
-              <w:spacing w:after="0" w:line="240" w:lineRule="auto"/>
-              <w:jc w:val="left"/>
-            </w:pPr>
-            <w:r>
-              <w:rPr>
-                <w:rFonts w:ascii="Times New Roman" w:hAnsi="Times New Roman"/>
-                <w:sz w:val="16"/>
-              </w:rPr>
-              <w:t xml:space="preserve">0.62</w:t>
+              <w:t xml:space="preserve">3.56</w:t>
+            </w:r>
+          </w:p>
+        </w:tc>
+        <w:tc>
+          <w:tcPr/>
+          <w:p>
+            <w:pPr>
+              <w:pStyle w:val="Compact"/>
+              <w:spacing w:after="0" w:line="240" w:lineRule="auto"/>
+              <w:jc w:val="left"/>
+            </w:pPr>
+            <w:r>
+              <w:rPr>
+                <w:rFonts w:ascii="Times New Roman" w:hAnsi="Times New Roman"/>
+                <w:sz w:val="16"/>
+              </w:rPr>
+              <w:t xml:space="preserve">85/0/29</w:t>
+            </w:r>
+          </w:p>
+        </w:tc>
+        <w:tc>
+          <w:tcPr/>
+          <w:p>
+            <w:pPr>
+              <w:pStyle w:val="Compact"/>
+              <w:spacing w:after="0" w:line="240" w:lineRule="auto"/>
+              <w:jc w:val="left"/>
+            </w:pPr>
+            <w:r>
+              <w:rPr>
+                <w:rFonts w:ascii="Times New Roman" w:hAnsi="Times New Roman"/>
+                <w:sz w:val="16"/>
+              </w:rPr>
+              <w:t xml:space="preserve">0.61</w:t>
             </w:r>
           </w:p>
         </w:tc>
@@ -5122,24 +5131,24 @@
                 <w:rFonts w:ascii="Times New Roman" w:hAnsi="Times New Roman"/>
                 <w:sz w:val="16"/>
               </w:rPr>
-              <w:t xml:space="preserve">54/0/56</w:t>
-            </w:r>
-          </w:p>
-        </w:tc>
-        <w:tc>
-          <w:tcPr/>
-          <w:p>
-            <w:pPr>
-              <w:pStyle w:val="Compact"/>
-              <w:spacing w:after="0" w:line="240" w:lineRule="auto"/>
-              <w:jc w:val="left"/>
-            </w:pPr>
-            <w:r>
-              <w:rPr>
-                <w:rFonts w:ascii="Times New Roman" w:hAnsi="Times New Roman"/>
-                <w:sz w:val="16"/>
-              </w:rPr>
-              <w:t xml:space="preserve">0.05</w:t>
+              <w:t xml:space="preserve">53/0/57</w:t>
+            </w:r>
+          </w:p>
+        </w:tc>
+        <w:tc>
+          <w:tcPr/>
+          <w:p>
+            <w:pPr>
+              <w:pStyle w:val="Compact"/>
+              <w:spacing w:after="0" w:line="240" w:lineRule="auto"/>
+              <w:jc w:val="left"/>
+            </w:pPr>
+            <w:r>
+              <w:rPr>
+                <w:rFonts w:ascii="Times New Roman" w:hAnsi="Times New Roman"/>
+                <w:sz w:val="16"/>
+              </w:rPr>
+              <w:t xml:space="preserve">0.03</w:t>
             </w:r>
           </w:p>
         </w:tc>
@@ -5536,109 +5545,109 @@
                 <w:rFonts w:ascii="Times New Roman" w:hAnsi="Times New Roman"/>
                 <w:sz w:val="16"/>
               </w:rPr>
-              <w:t xml:space="preserve">112</w:t>
-            </w:r>
-          </w:p>
-        </w:tc>
-        <w:tc>
-          <w:tcPr/>
-          <w:p>
-            <w:pPr>
-              <w:pStyle w:val="Compact"/>
-              <w:spacing w:after="0" w:line="240" w:lineRule="auto"/>
-              <w:jc w:val="left"/>
-            </w:pPr>
-            <w:r>
-              <w:rPr>
-                <w:rFonts w:ascii="Times New Roman" w:hAnsi="Times New Roman"/>
-                <w:sz w:val="16"/>
-              </w:rPr>
-              <w:t xml:space="preserve">0.384</w:t>
-            </w:r>
-          </w:p>
-        </w:tc>
-        <w:tc>
-          <w:tcPr/>
-          <w:p>
-            <w:pPr>
-              <w:pStyle w:val="Compact"/>
-              <w:spacing w:after="0" w:line="240" w:lineRule="auto"/>
-              <w:jc w:val="left"/>
-            </w:pPr>
-            <w:r>
-              <w:rPr>
-                <w:rFonts w:ascii="Times New Roman" w:hAnsi="Times New Roman"/>
-                <w:sz w:val="16"/>
-              </w:rPr>
-              <w:t xml:space="preserve">0.117</w:t>
-            </w:r>
-          </w:p>
-        </w:tc>
-        <w:tc>
-          <w:tcPr/>
-          <w:p>
-            <w:pPr>
-              <w:pStyle w:val="Compact"/>
-              <w:spacing w:after="0" w:line="240" w:lineRule="auto"/>
-              <w:jc w:val="left"/>
-            </w:pPr>
-            <w:r>
-              <w:rPr>
-                <w:rFonts w:ascii="Times New Roman" w:hAnsi="Times New Roman"/>
-                <w:sz w:val="16"/>
-              </w:rPr>
-              <w:t xml:space="preserve">0.207</w:t>
-            </w:r>
-          </w:p>
-        </w:tc>
-        <w:tc>
-          <w:tcPr/>
-          <w:p>
-            <w:pPr>
-              <w:pStyle w:val="Compact"/>
-              <w:spacing w:after="0" w:line="240" w:lineRule="auto"/>
-              <w:jc w:val="left"/>
-            </w:pPr>
-            <w:r>
-              <w:rPr>
-                <w:rFonts w:ascii="Times New Roman" w:hAnsi="Times New Roman"/>
-                <w:sz w:val="16"/>
-              </w:rPr>
-              <w:t xml:space="preserve">0.899</w:t>
-            </w:r>
-          </w:p>
-        </w:tc>
-        <w:tc>
-          <w:tcPr/>
-          <w:p>
-            <w:pPr>
-              <w:pStyle w:val="Compact"/>
-              <w:spacing w:after="0" w:line="240" w:lineRule="auto"/>
-              <w:jc w:val="left"/>
-            </w:pPr>
-            <w:r>
-              <w:rPr>
-                <w:rFonts w:ascii="Times New Roman" w:hAnsi="Times New Roman"/>
-                <w:sz w:val="16"/>
-              </w:rPr>
-              <w:t xml:space="preserve">–</w:t>
-            </w:r>
-          </w:p>
-        </w:tc>
-        <w:tc>
-          <w:tcPr/>
-          <w:p>
-            <w:pPr>
-              <w:pStyle w:val="Compact"/>
-              <w:spacing w:after="0" w:line="240" w:lineRule="auto"/>
-              <w:jc w:val="left"/>
-            </w:pPr>
-            <w:r>
-              <w:rPr>
-                <w:rFonts w:ascii="Times New Roman" w:hAnsi="Times New Roman"/>
-                <w:sz w:val="16"/>
-              </w:rPr>
-              <w:t xml:space="preserve">76/0/36</w:t>
+              <w:t xml:space="preserve">114</w:t>
+            </w:r>
+          </w:p>
+        </w:tc>
+        <w:tc>
+          <w:tcPr/>
+          <w:p>
+            <w:pPr>
+              <w:pStyle w:val="Compact"/>
+              <w:spacing w:after="0" w:line="240" w:lineRule="auto"/>
+              <w:jc w:val="left"/>
+            </w:pPr>
+            <w:r>
+              <w:rPr>
+                <w:rFonts w:ascii="Times New Roman" w:hAnsi="Times New Roman"/>
+                <w:sz w:val="16"/>
+              </w:rPr>
+              <w:t xml:space="preserve">0.386</w:t>
+            </w:r>
+          </w:p>
+        </w:tc>
+        <w:tc>
+          <w:tcPr/>
+          <w:p>
+            <w:pPr>
+              <w:pStyle w:val="Compact"/>
+              <w:spacing w:after="0" w:line="240" w:lineRule="auto"/>
+              <w:jc w:val="left"/>
+            </w:pPr>
+            <w:r>
+              <w:rPr>
+                <w:rFonts w:ascii="Times New Roman" w:hAnsi="Times New Roman"/>
+                <w:sz w:val="16"/>
+              </w:rPr>
+              <w:t xml:space="preserve">0.116</w:t>
+            </w:r>
+          </w:p>
+        </w:tc>
+        <w:tc>
+          <w:tcPr/>
+          <w:p>
+            <w:pPr>
+              <w:pStyle w:val="Compact"/>
+              <w:spacing w:after="0" w:line="240" w:lineRule="auto"/>
+              <w:jc w:val="left"/>
+            </w:pPr>
+            <w:r>
+              <w:rPr>
+                <w:rFonts w:ascii="Times New Roman" w:hAnsi="Times New Roman"/>
+                <w:sz w:val="16"/>
+              </w:rPr>
+              <w:t xml:space="preserve">0.210</w:t>
+            </w:r>
+          </w:p>
+        </w:tc>
+        <w:tc>
+          <w:tcPr/>
+          <w:p>
+            <w:pPr>
+              <w:pStyle w:val="Compact"/>
+              <w:spacing w:after="0" w:line="240" w:lineRule="auto"/>
+              <w:jc w:val="left"/>
+            </w:pPr>
+            <w:r>
+              <w:rPr>
+                <w:rFonts w:ascii="Times New Roman" w:hAnsi="Times New Roman"/>
+                <w:sz w:val="16"/>
+              </w:rPr>
+              <w:t xml:space="preserve">0.895</w:t>
+            </w:r>
+          </w:p>
+        </w:tc>
+        <w:tc>
+          <w:tcPr/>
+          <w:p>
+            <w:pPr>
+              <w:pStyle w:val="Compact"/>
+              <w:spacing w:after="0" w:line="240" w:lineRule="auto"/>
+              <w:jc w:val="left"/>
+            </w:pPr>
+            <w:r>
+              <w:rPr>
+                <w:rFonts w:ascii="Times New Roman" w:hAnsi="Times New Roman"/>
+                <w:sz w:val="16"/>
+              </w:rPr>
+              <w:t xml:space="preserve">3.05</w:t>
+            </w:r>
+          </w:p>
+        </w:tc>
+        <w:tc>
+          <w:tcPr/>
+          <w:p>
+            <w:pPr>
+              <w:pStyle w:val="Compact"/>
+              <w:spacing w:after="0" w:line="240" w:lineRule="auto"/>
+              <w:jc w:val="left"/>
+            </w:pPr>
+            <w:r>
+              <w:rPr>
+                <w:rFonts w:ascii="Times New Roman" w:hAnsi="Times New Roman"/>
+                <w:sz w:val="16"/>
+              </w:rPr>
+              <w:t xml:space="preserve">77/0/37</w:t>
             </w:r>
           </w:p>
         </w:tc>
@@ -5793,7 +5802,7 @@
                 <w:rFonts w:ascii="Times New Roman" w:hAnsi="Times New Roman"/>
                 <w:sz w:val="16"/>
               </w:rPr>
-              <w:t xml:space="preserve">3.71</w:t>
+              <w:t xml:space="preserve">4.57</w:t>
             </w:r>
           </w:p>
         </w:tc>
@@ -5965,7 +5974,7 @@
                 <w:rFonts w:ascii="Times New Roman" w:hAnsi="Times New Roman"/>
                 <w:sz w:val="16"/>
               </w:rPr>
-              <w:t xml:space="preserve">4.52</w:t>
+              <w:t xml:space="preserve">5.40</w:t>
             </w:r>
           </w:p>
         </w:tc>
@@ -6082,7 +6091,7 @@
         <w:t xml:space="preserve"> </w:t>
       </w:r>
       <w:r>
-        <w:t xml:space="preserve">is 1.01, so the held-out leverages computed during training are on the same scale as the leverages of new clean recordings. Under faults the ratio grows with severity: at the highest severity it reaches 30.5 for noise, 29.8 for spikes, 8.7 for a 30 % dropout, 6.3 for baseline wander and 3.5 for misalignment, but only 1.26 for speed variation (Fig. 4).</w:t>
+        <w:t xml:space="preserve">is 1.01, so the held-out leverages computed during training are on the same scale as the leverages of new clean recordings. Under faults the ratio grows with severity: at the highest severity it reaches 30.3 for noise, 29.5 for spikes, 8.6 for a 30 % dropout, 6.2 for baseline wander and 3.5 for misalignment, but only 1.26 for speed variation (Fig. 4).</w:t>
       </w:r>
     </w:p>
     <w:p>
@@ -6100,7 +6109,7 @@
         <w:t xml:space="preserve"> </w:t>
       </w:r>
       <w:r>
-        <w:t xml:space="preserve">Averaged over the 18 fault conditions (Table 2), LOOM’s median NLL is 0.738, against 1.728 for PreVal. Compared with PreVal, LOOM is better on 108 of 114 datasets (p &lt; 0.001), and it is also better than hold-out temperature scaling, Platt and isotonic calibration and logistic regression (Table 2). Fig. 5 shows how the gap opens as the faults become stronger, and Fig. 6 shows the per-dataset picture. Accuracy is unchanged, because LOOM and PreVal share the same ridge scores (median 0.694 vs 0.692). The gain comes entirely from lower confidence on the damaged recordings that are misclassified, which is visible in the reliability diagrams of Fig. 7. The same mechanism makes faulty recordings easier to spot. The median AUROC for telling faulty from clean recordings by 1 − max p̂ is 0.765 for LOOM and 0.563 for PreVal, where 0.5 means no separation at all.</w:t>
+        <w:t xml:space="preserve">Averaged over the 18 fault conditions (Table 2), LOOM’s median NLL is 0.738, against 1.728 for PreVal. Compared with PreVal, LOOM is better on 108 of 114 datasets (p &lt; 0.001), and it is also better than hold-out temperature scaling, Platt and isotonic calibration and logistic regression (Table 2). Fig. 5 shows how the gap opens as the faults become stronger, and Fig. 6 shows the per-dataset picture. Accuracy is unchanged, because LOOM and PreVal share the same ridge scores (median 0.695 vs 0.692). The gain comes entirely from lower confidence on the damaged recordings that are misclassified, which is visible in the reliability diagrams of Fig. 7. The same mechanism makes faulty recordings easier to spot. The median AUROC for telling faulty from clean recordings by 1 − max p̂ is 0.765 for LOOM and 0.563 for PreVal, where 0.5 means no separation at all.</w:t>
       </w:r>
     </w:p>
     <w:p>
@@ -6456,7 +6465,7 @@
                 <w:rFonts w:ascii="Times New Roman" w:hAnsi="Times New Roman"/>
                 <w:sz w:val="16"/>
               </w:rPr>
-              <w:t xml:space="preserve">0.694</w:t>
+              <w:t xml:space="preserve">0.695</w:t>
             </w:r>
           </w:p>
         </w:tc>
@@ -6490,7 +6499,7 @@
                 <w:rFonts w:ascii="Times New Roman" w:hAnsi="Times New Roman"/>
                 <w:sz w:val="16"/>
               </w:rPr>
-              <w:t xml:space="preserve">1.17</w:t>
+              <w:t xml:space="preserve">1.78</w:t>
             </w:r>
           </w:p>
         </w:tc>
@@ -6611,7 +6620,7 @@
                 <w:rFonts w:ascii="Times New Roman" w:hAnsi="Times New Roman"/>
                 <w:sz w:val="16"/>
               </w:rPr>
-              <w:t xml:space="preserve">0.186</w:t>
+              <w:t xml:space="preserve">0.185</w:t>
             </w:r>
           </w:p>
         </w:tc>
@@ -6662,7 +6671,7 @@
                 <w:rFonts w:ascii="Times New Roman" w:hAnsi="Times New Roman"/>
                 <w:sz w:val="16"/>
               </w:rPr>
-              <w:t xml:space="preserve">3.15</w:t>
+              <w:t xml:space="preserve">3.96</w:t>
             </w:r>
           </w:p>
         </w:tc>
@@ -6800,7 +6809,7 @@
                 <w:rFonts w:ascii="Times New Roman" w:hAnsi="Times New Roman"/>
                 <w:sz w:val="16"/>
               </w:rPr>
-              <w:t xml:space="preserve">0.663</w:t>
+              <w:t xml:space="preserve">0.676</w:t>
             </w:r>
           </w:p>
         </w:tc>
@@ -6834,7 +6843,7 @@
                 <w:rFonts w:ascii="Times New Roman" w:hAnsi="Times New Roman"/>
                 <w:sz w:val="16"/>
               </w:rPr>
-              <w:t xml:space="preserve">3.41</w:t>
+              <w:t xml:space="preserve">4.28</w:t>
             </w:r>
           </w:p>
         </w:tc>
@@ -6868,7 +6877,7 @@
                 <w:rFonts w:ascii="Times New Roman" w:hAnsi="Times New Roman"/>
                 <w:sz w:val="16"/>
               </w:rPr>
-              <w:t xml:space="preserve">0.99</w:t>
+              <w:t xml:space="preserve">0.98</w:t>
             </w:r>
           </w:p>
         </w:tc>
@@ -6955,24 +6964,24 @@
                 <w:rFonts w:ascii="Times New Roman" w:hAnsi="Times New Roman"/>
                 <w:sz w:val="16"/>
               </w:rPr>
-              <w:t xml:space="preserve">0.145</w:t>
-            </w:r>
-          </w:p>
-        </w:tc>
-        <w:tc>
-          <w:tcPr/>
-          <w:p>
-            <w:pPr>
-              <w:pStyle w:val="Compact"/>
-              <w:spacing w:after="0" w:line="240" w:lineRule="auto"/>
-              <w:jc w:val="left"/>
-            </w:pPr>
-            <w:r>
-              <w:rPr>
-                <w:rFonts w:ascii="Times New Roman" w:hAnsi="Times New Roman"/>
-                <w:sz w:val="16"/>
-              </w:rPr>
-              <w:t xml:space="preserve">0.696</w:t>
+              <w:t xml:space="preserve">0.144</w:t>
+            </w:r>
+          </w:p>
+        </w:tc>
+        <w:tc>
+          <w:tcPr/>
+          <w:p>
+            <w:pPr>
+              <w:pStyle w:val="Compact"/>
+              <w:spacing w:after="0" w:line="240" w:lineRule="auto"/>
+              <w:jc w:val="left"/>
+            </w:pPr>
+            <w:r>
+              <w:rPr>
+                <w:rFonts w:ascii="Times New Roman" w:hAnsi="Times New Roman"/>
+                <w:sz w:val="16"/>
+              </w:rPr>
+              <w:t xml:space="preserve">0.697</w:t>
             </w:r>
           </w:p>
         </w:tc>
@@ -7144,7 +7153,7 @@
                 <w:rFonts w:ascii="Times New Roman" w:hAnsi="Times New Roman"/>
                 <w:sz w:val="16"/>
               </w:rPr>
-              <w:t xml:space="preserve">0.673</w:t>
+              <w:t xml:space="preserve">0.682</w:t>
             </w:r>
           </w:p>
         </w:tc>
@@ -7437,24 +7446,24 @@
                 <w:rFonts w:ascii="Times New Roman" w:hAnsi="Times New Roman"/>
                 <w:sz w:val="16"/>
               </w:rPr>
-              <w:t xml:space="preserve">112</w:t>
-            </w:r>
-          </w:p>
-        </w:tc>
-        <w:tc>
-          <w:tcPr/>
-          <w:p>
-            <w:pPr>
-              <w:pStyle w:val="Compact"/>
-              <w:spacing w:after="0" w:line="240" w:lineRule="auto"/>
-              <w:jc w:val="left"/>
-            </w:pPr>
-            <w:r>
-              <w:rPr>
-                <w:rFonts w:ascii="Times New Roman" w:hAnsi="Times New Roman"/>
-                <w:sz w:val="16"/>
-              </w:rPr>
-              <w:t xml:space="preserve">0.716</w:t>
+              <w:t xml:space="preserve">114</w:t>
+            </w:r>
+          </w:p>
+        </w:tc>
+        <w:tc>
+          <w:tcPr/>
+          <w:p>
+            <w:pPr>
+              <w:pStyle w:val="Compact"/>
+              <w:spacing w:after="0" w:line="240" w:lineRule="auto"/>
+              <w:jc w:val="left"/>
+            </w:pPr>
+            <w:r>
+              <w:rPr>
+                <w:rFonts w:ascii="Times New Roman" w:hAnsi="Times New Roman"/>
+                <w:sz w:val="16"/>
+              </w:rPr>
+              <w:t xml:space="preserve">0.732</w:t>
             </w:r>
           </w:p>
         </w:tc>
@@ -7488,92 +7497,92 @@
                 <w:rFonts w:ascii="Times New Roman" w:hAnsi="Times New Roman"/>
                 <w:sz w:val="16"/>
               </w:rPr>
-              <w:t xml:space="preserve">0.703</w:t>
-            </w:r>
-          </w:p>
-        </w:tc>
-        <w:tc>
-          <w:tcPr/>
-          <w:p>
-            <w:pPr>
-              <w:pStyle w:val="Compact"/>
-              <w:spacing w:after="0" w:line="240" w:lineRule="auto"/>
-              <w:jc w:val="left"/>
-            </w:pPr>
-            <w:r>
-              <w:rPr>
-                <w:rFonts w:ascii="Times New Roman" w:hAnsi="Times New Roman"/>
-                <w:sz w:val="16"/>
-              </w:rPr>
-              <w:t xml:space="preserve">0.711</w:t>
-            </w:r>
-          </w:p>
-        </w:tc>
-        <w:tc>
-          <w:tcPr/>
-          <w:p>
-            <w:pPr>
-              <w:pStyle w:val="Compact"/>
-              <w:spacing w:after="0" w:line="240" w:lineRule="auto"/>
-              <w:jc w:val="left"/>
-            </w:pPr>
-            <w:r>
-              <w:rPr>
-                <w:rFonts w:ascii="Times New Roman" w:hAnsi="Times New Roman"/>
-                <w:sz w:val="16"/>
-              </w:rPr>
-              <w:t xml:space="preserve">–</w:t>
-            </w:r>
-          </w:p>
-        </w:tc>
-        <w:tc>
-          <w:tcPr/>
-          <w:p>
-            <w:pPr>
-              <w:pStyle w:val="Compact"/>
-              <w:spacing w:after="0" w:line="240" w:lineRule="auto"/>
-              <w:jc w:val="left"/>
-            </w:pPr>
-            <w:r>
-              <w:rPr>
-                <w:rFonts w:ascii="Times New Roman" w:hAnsi="Times New Roman"/>
-                <w:sz w:val="16"/>
-              </w:rPr>
-              <w:t xml:space="preserve">43/0/69</w:t>
-            </w:r>
-          </w:p>
-        </w:tc>
-        <w:tc>
-          <w:tcPr/>
-          <w:p>
-            <w:pPr>
-              <w:pStyle w:val="Compact"/>
-              <w:spacing w:after="0" w:line="240" w:lineRule="auto"/>
-              <w:jc w:val="left"/>
-            </w:pPr>
-            <w:r>
-              <w:rPr>
-                <w:rFonts w:ascii="Times New Roman" w:hAnsi="Times New Roman"/>
-                <w:sz w:val="16"/>
-              </w:rPr>
-              <w:t xml:space="preserve">-0.12</w:t>
-            </w:r>
-          </w:p>
-        </w:tc>
-        <w:tc>
-          <w:tcPr/>
-          <w:p>
-            <w:pPr>
-              <w:pStyle w:val="Compact"/>
-              <w:spacing w:after="0" w:line="240" w:lineRule="auto"/>
-              <w:jc w:val="left"/>
-            </w:pPr>
-            <w:r>
-              <w:rPr>
-                <w:rFonts w:ascii="Times New Roman" w:hAnsi="Times New Roman"/>
-                <w:sz w:val="16"/>
-              </w:rPr>
-              <w:t xml:space="preserve">0.253</w:t>
+              <w:t xml:space="preserve">0.694</w:t>
+            </w:r>
+          </w:p>
+        </w:tc>
+        <w:tc>
+          <w:tcPr/>
+          <w:p>
+            <w:pPr>
+              <w:pStyle w:val="Compact"/>
+              <w:spacing w:after="0" w:line="240" w:lineRule="auto"/>
+              <w:jc w:val="left"/>
+            </w:pPr>
+            <w:r>
+              <w:rPr>
+                <w:rFonts w:ascii="Times New Roman" w:hAnsi="Times New Roman"/>
+                <w:sz w:val="16"/>
+              </w:rPr>
+              <w:t xml:space="preserve">0.709</w:t>
+            </w:r>
+          </w:p>
+        </w:tc>
+        <w:tc>
+          <w:tcPr/>
+          <w:p>
+            <w:pPr>
+              <w:pStyle w:val="Compact"/>
+              <w:spacing w:after="0" w:line="240" w:lineRule="auto"/>
+              <w:jc w:val="left"/>
+            </w:pPr>
+            <w:r>
+              <w:rPr>
+                <w:rFonts w:ascii="Times New Roman" w:hAnsi="Times New Roman"/>
+                <w:sz w:val="16"/>
+              </w:rPr>
+              <w:t xml:space="preserve">1.83</w:t>
+            </w:r>
+          </w:p>
+        </w:tc>
+        <w:tc>
+          <w:tcPr/>
+          <w:p>
+            <w:pPr>
+              <w:pStyle w:val="Compact"/>
+              <w:spacing w:after="0" w:line="240" w:lineRule="auto"/>
+              <w:jc w:val="left"/>
+            </w:pPr>
+            <w:r>
+              <w:rPr>
+                <w:rFonts w:ascii="Times New Roman" w:hAnsi="Times New Roman"/>
+                <w:sz w:val="16"/>
+              </w:rPr>
+              <w:t xml:space="preserve">44/0/70</w:t>
+            </w:r>
+          </w:p>
+        </w:tc>
+        <w:tc>
+          <w:tcPr/>
+          <w:p>
+            <w:pPr>
+              <w:pStyle w:val="Compact"/>
+              <w:spacing w:after="0" w:line="240" w:lineRule="auto"/>
+              <w:jc w:val="left"/>
+            </w:pPr>
+            <w:r>
+              <w:rPr>
+                <w:rFonts w:ascii="Times New Roman" w:hAnsi="Times New Roman"/>
+                <w:sz w:val="16"/>
+              </w:rPr>
+              <w:t xml:space="preserve">-0.11</w:t>
+            </w:r>
+          </w:p>
+        </w:tc>
+        <w:tc>
+          <w:tcPr/>
+          <w:p>
+            <w:pPr>
+              <w:pStyle w:val="Compact"/>
+              <w:spacing w:after="0" w:line="240" w:lineRule="auto"/>
+              <w:jc w:val="left"/>
+            </w:pPr>
+            <w:r>
+              <w:rPr>
+                <w:rFonts w:ascii="Times New Roman" w:hAnsi="Times New Roman"/>
+                <w:sz w:val="16"/>
+              </w:rPr>
+              <w:t xml:space="preserve">0.291</w:t>
             </w:r>
           </w:p>
         </w:tc>
@@ -7643,24 +7652,24 @@
                 <w:rFonts w:ascii="Times New Roman" w:hAnsi="Times New Roman"/>
                 <w:sz w:val="16"/>
               </w:rPr>
-              <w:t xml:space="preserve">0.254</w:t>
-            </w:r>
-          </w:p>
-        </w:tc>
-        <w:tc>
-          <w:tcPr/>
-          <w:p>
-            <w:pPr>
-              <w:pStyle w:val="Compact"/>
-              <w:spacing w:after="0" w:line="240" w:lineRule="auto"/>
-              <w:jc w:val="left"/>
-            </w:pPr>
-            <w:r>
-              <w:rPr>
-                <w:rFonts w:ascii="Times New Roman" w:hAnsi="Times New Roman"/>
-                <w:sz w:val="16"/>
-              </w:rPr>
-              <w:t xml:space="preserve">0.690</w:t>
+              <w:t xml:space="preserve">0.256</w:t>
+            </w:r>
+          </w:p>
+        </w:tc>
+        <w:tc>
+          <w:tcPr/>
+          <w:p>
+            <w:pPr>
+              <w:pStyle w:val="Compact"/>
+              <w:spacing w:after="0" w:line="240" w:lineRule="auto"/>
+              <w:jc w:val="left"/>
+            </w:pPr>
+            <w:r>
+              <w:rPr>
+                <w:rFonts w:ascii="Times New Roman" w:hAnsi="Times New Roman"/>
+                <w:sz w:val="16"/>
+              </w:rPr>
+              <w:t xml:space="preserve">0.696</w:t>
             </w:r>
           </w:p>
         </w:tc>
@@ -7694,7 +7703,7 @@
                 <w:rFonts w:ascii="Times New Roman" w:hAnsi="Times New Roman"/>
                 <w:sz w:val="16"/>
               </w:rPr>
-              <w:t xml:space="preserve">2.29</w:t>
+              <w:t xml:space="preserve">3.16</w:t>
             </w:r>
           </w:p>
         </w:tc>
@@ -7798,41 +7807,41 @@
                 <w:rFonts w:ascii="Times New Roman" w:hAnsi="Times New Roman"/>
                 <w:sz w:val="16"/>
               </w:rPr>
-              <w:t xml:space="preserve">10.695</w:t>
-            </w:r>
-          </w:p>
-        </w:tc>
-        <w:tc>
-          <w:tcPr/>
-          <w:p>
-            <w:pPr>
-              <w:pStyle w:val="Compact"/>
-              <w:spacing w:after="0" w:line="240" w:lineRule="auto"/>
-              <w:jc w:val="left"/>
-            </w:pPr>
-            <w:r>
-              <w:rPr>
-                <w:rFonts w:ascii="Times New Roman" w:hAnsi="Times New Roman"/>
-                <w:sz w:val="16"/>
-              </w:rPr>
-              <w:t xml:space="preserve">0.310</w:t>
-            </w:r>
-          </w:p>
-        </w:tc>
-        <w:tc>
-          <w:tcPr/>
-          <w:p>
-            <w:pPr>
-              <w:pStyle w:val="Compact"/>
-              <w:spacing w:after="0" w:line="240" w:lineRule="auto"/>
-              <w:jc w:val="left"/>
-            </w:pPr>
-            <w:r>
-              <w:rPr>
-                <w:rFonts w:ascii="Times New Roman" w:hAnsi="Times New Roman"/>
-                <w:sz w:val="16"/>
-              </w:rPr>
-              <w:t xml:space="preserve">0.690</w:t>
+              <w:t xml:space="preserve">10.495</w:t>
+            </w:r>
+          </w:p>
+        </w:tc>
+        <w:tc>
+          <w:tcPr/>
+          <w:p>
+            <w:pPr>
+              <w:pStyle w:val="Compact"/>
+              <w:spacing w:after="0" w:line="240" w:lineRule="auto"/>
+              <w:jc w:val="left"/>
+            </w:pPr>
+            <w:r>
+              <w:rPr>
+                <w:rFonts w:ascii="Times New Roman" w:hAnsi="Times New Roman"/>
+                <w:sz w:val="16"/>
+              </w:rPr>
+              <w:t xml:space="preserve">0.304</w:t>
+            </w:r>
+          </w:p>
+        </w:tc>
+        <w:tc>
+          <w:tcPr/>
+          <w:p>
+            <w:pPr>
+              <w:pStyle w:val="Compact"/>
+              <w:spacing w:after="0" w:line="240" w:lineRule="auto"/>
+              <w:jc w:val="left"/>
+            </w:pPr>
+            <w:r>
+              <w:rPr>
+                <w:rFonts w:ascii="Times New Roman" w:hAnsi="Times New Roman"/>
+                <w:sz w:val="16"/>
+              </w:rPr>
+              <w:t xml:space="preserve">0.696</w:t>
             </w:r>
           </w:p>
         </w:tc>
@@ -7866,7 +7875,7 @@
                 <w:rFonts w:ascii="Times New Roman" w:hAnsi="Times New Roman"/>
                 <w:sz w:val="16"/>
               </w:rPr>
-              <w:t xml:space="preserve">4.99</w:t>
+              <w:t xml:space="preserve">5.99</w:t>
             </w:r>
           </w:p>
         </w:tc>
@@ -8210,7 +8219,7 @@
         <w:pStyle w:val="BodyText"/>
       </w:pPr>
       <w:r>
-        <w:t xml:space="preserve">On clean data a five-seed PreVal ensemble is slightly better than a single LOOM model (LOOM worse on 83 of 114 datasets; p &lt; 0.001), while LOOM beats QUANT (LOOM better on 69 of 112 datasets; p = 0.005) and the Arsenal. Under the strongest faults LOOM beats the PreVal ensemble (LOOM better on 104 of 114 datasets; p &lt; 0.001) and the Arsenal, but QUANT does better than LOOM (LOOM worse on 77 of 112 datasets; p = 0.032). Averaged over all 18 conditions and five resamples, LOOM and QUANT do not differ significantly (Table 2). Which one is better depends on the type of fault (Fig. 5): at the highest severity QUANT has the lower median NLL for baseline wander, dropouts and spikes, and LOOM for noise, speed variation and misalignment. We did not investigate the reason. It concerns the features (quantiles of the raw series versus random convolutions) rather than the readout, so applying a LOOM-style correction to a QUANT-like model is a natural next step.</w:t>
+        <w:t xml:space="preserve">On clean data a five-seed PreVal ensemble is slightly better than a single LOOM model (LOOM worse on 83 of 114 datasets; p &lt; 0.001), while LOOM beats QUANT (LOOM better on 70 of 114 datasets; p = 0.004) and the Arsenal. Under the strongest faults LOOM beats the PreVal ensemble (LOOM better on 104 of 114 datasets; p &lt; 0.001) and the Arsenal, but QUANT does better than LOOM (LOOM worse on 78 of 114 datasets; p = 0.042). Averaged over all 18 conditions and five resamples, LOOM and QUANT do not differ significantly (Table 2). Which one is better depends on the type of fault (Fig. 5): at the highest severity QUANT has the lower median NLL for baseline wander, dropouts and spikes, and LOOM for noise, speed variation and misalignment. We did not investigate the reason. It concerns the features (quantiles of the raw series versus random convolutions) rather than the readout, so applying a LOOM-style correction to a QUANT-like model is a natural next step.</w:t>
       </w:r>
     </w:p>
     <w:p>
@@ -8218,7 +8227,7 @@
         <w:pStyle w:val="BodyText"/>
       </w:pPr>
       <w:r>
-        <w:t xml:space="preserve">The Arsenal’s poor NLL deserves a comment. Its probabilities are weighted votes of its members, and they often give exactly zero probability to the true class, which the logarithm in the NLL punishes without limit. The bounded Brier score gives a fairer picture. On clean data the gap is small (median 0.171 vs 0.163 for LOOM), while under strong faults LOOM is still clearly ahead (LOOM better on 94 of 111 datasets; p &lt; 0.001). Averaging five LOOM models helps only a little (median severity-3 NLL 1.003 vs 1.020 for a single model).</w:t>
+        <w:t xml:space="preserve">The Arsenal’s poor NLL deserves a comment. Its probabilities are weighted votes of its members, and they often give exactly zero probability to the true class, which the logarithm in the NLL punishes without limit. The bounded Brier score gives a fairer picture. On clean data the gap is small (median 0.173 vs 0.163 for LOOM), while under strong faults LOOM is still clearly ahead (LOOM better on 96 of 113 datasets; p &lt; 0.001). Averaging five LOOM models helps only a little (median severity-3 NLL 1.003 vs 1.020 for a single model).</w:t>
       </w:r>
     </w:p>
     <w:p>
@@ -8648,7 +8657,7 @@
                 <w:rFonts w:ascii="Times New Roman" w:hAnsi="Times New Roman"/>
                 <w:sz w:val="16"/>
               </w:rPr>
-              <w:t xml:space="preserve">1.83</w:t>
+              <w:t xml:space="preserve">2.52</w:t>
             </w:r>
           </w:p>
         </w:tc>
@@ -8837,7 +8846,7 @@
                 <w:rFonts w:ascii="Times New Roman" w:hAnsi="Times New Roman"/>
                 <w:sz w:val="16"/>
               </w:rPr>
-              <w:t xml:space="preserve">1.49</w:t>
+              <w:t xml:space="preserve">2.15</w:t>
             </w:r>
           </w:p>
         </w:tc>
@@ -9026,7 +9035,7 @@
                 <w:rFonts w:ascii="Times New Roman" w:hAnsi="Times New Roman"/>
                 <w:sz w:val="16"/>
               </w:rPr>
-              <w:t xml:space="preserve">3.70</w:t>
+              <w:t xml:space="preserve">4.57</w:t>
             </w:r>
           </w:p>
         </w:tc>
@@ -9215,7 +9224,7 @@
                 <w:rFonts w:ascii="Times New Roman" w:hAnsi="Times New Roman"/>
                 <w:sz w:val="16"/>
               </w:rPr>
-              <w:t xml:space="preserve">2.97</w:t>
+              <w:t xml:space="preserve">3.81</w:t>
             </w:r>
           </w:p>
         </w:tc>
@@ -9302,41 +9311,41 @@
                 <w:rFonts w:ascii="Times New Roman" w:hAnsi="Times New Roman"/>
                 <w:sz w:val="16"/>
               </w:rPr>
-              <w:t xml:space="preserve">112</w:t>
-            </w:r>
-          </w:p>
-        </w:tc>
-        <w:tc>
-          <w:tcPr/>
-          <w:p>
-            <w:pPr>
-              <w:pStyle w:val="Compact"/>
-              <w:spacing w:after="0" w:line="240" w:lineRule="auto"/>
-              <w:jc w:val="left"/>
-            </w:pPr>
-            <w:r>
-              <w:rPr>
-                <w:rFonts w:ascii="Times New Roman" w:hAnsi="Times New Roman"/>
-                <w:sz w:val="16"/>
-              </w:rPr>
-              <w:t xml:space="preserve">0.917</w:t>
-            </w:r>
-          </w:p>
-        </w:tc>
-        <w:tc>
-          <w:tcPr/>
-          <w:p>
-            <w:pPr>
-              <w:pStyle w:val="Compact"/>
-              <w:spacing w:after="0" w:line="240" w:lineRule="auto"/>
-              <w:jc w:val="left"/>
-            </w:pPr>
-            <w:r>
-              <w:rPr>
-                <w:rFonts w:ascii="Times New Roman" w:hAnsi="Times New Roman"/>
-                <w:sz w:val="16"/>
-              </w:rPr>
-              <w:t xml:space="preserve">0.487</w:t>
+              <w:t xml:space="preserve">114</w:t>
+            </w:r>
+          </w:p>
+        </w:tc>
+        <w:tc>
+          <w:tcPr/>
+          <w:p>
+            <w:pPr>
+              <w:pStyle w:val="Compact"/>
+              <w:spacing w:after="0" w:line="240" w:lineRule="auto"/>
+              <w:jc w:val="left"/>
+            </w:pPr>
+            <w:r>
+              <w:rPr>
+                <w:rFonts w:ascii="Times New Roman" w:hAnsi="Times New Roman"/>
+                <w:sz w:val="16"/>
+              </w:rPr>
+              <w:t xml:space="preserve">0.931</w:t>
+            </w:r>
+          </w:p>
+        </w:tc>
+        <w:tc>
+          <w:tcPr/>
+          <w:p>
+            <w:pPr>
+              <w:pStyle w:val="Compact"/>
+              <w:spacing w:after="0" w:line="240" w:lineRule="auto"/>
+              <w:jc w:val="left"/>
+            </w:pPr>
+            <w:r>
+              <w:rPr>
+                <w:rFonts w:ascii="Times New Roman" w:hAnsi="Times New Roman"/>
+                <w:sz w:val="16"/>
+              </w:rPr>
+              <w:t xml:space="preserve">0.489</w:t>
             </w:r>
           </w:p>
         </w:tc>
@@ -9370,92 +9379,92 @@
                 <w:rFonts w:ascii="Times New Roman" w:hAnsi="Times New Roman"/>
                 <w:sz w:val="16"/>
               </w:rPr>
-              <w:t xml:space="preserve">0.630</w:t>
-            </w:r>
-          </w:p>
-        </w:tc>
-        <w:tc>
-          <w:tcPr/>
-          <w:p>
-            <w:pPr>
-              <w:pStyle w:val="Compact"/>
-              <w:spacing w:after="0" w:line="240" w:lineRule="auto"/>
-              <w:jc w:val="left"/>
-            </w:pPr>
-            <w:r>
-              <w:rPr>
-                <w:rFonts w:ascii="Times New Roman" w:hAnsi="Times New Roman"/>
-                <w:sz w:val="16"/>
-              </w:rPr>
-              <w:t xml:space="preserve">0.764</w:t>
-            </w:r>
-          </w:p>
-        </w:tc>
-        <w:tc>
-          <w:tcPr/>
-          <w:p>
-            <w:pPr>
-              <w:pStyle w:val="Compact"/>
-              <w:spacing w:after="0" w:line="240" w:lineRule="auto"/>
-              <w:jc w:val="left"/>
-            </w:pPr>
-            <w:r>
-              <w:rPr>
-                <w:rFonts w:ascii="Times New Roman" w:hAnsi="Times New Roman"/>
-                <w:sz w:val="16"/>
-              </w:rPr>
-              <w:t xml:space="preserve">–</w:t>
-            </w:r>
-          </w:p>
-        </w:tc>
-        <w:tc>
-          <w:tcPr/>
-          <w:p>
-            <w:pPr>
-              <w:pStyle w:val="Compact"/>
-              <w:spacing w:after="0" w:line="240" w:lineRule="auto"/>
-              <w:jc w:val="left"/>
-            </w:pPr>
-            <w:r>
-              <w:rPr>
-                <w:rFonts w:ascii="Times New Roman" w:hAnsi="Times New Roman"/>
-                <w:sz w:val="16"/>
-              </w:rPr>
-              <w:t xml:space="preserve">35/0/77</w:t>
-            </w:r>
-          </w:p>
-        </w:tc>
-        <w:tc>
-          <w:tcPr/>
-          <w:p>
-            <w:pPr>
-              <w:pStyle w:val="Compact"/>
-              <w:spacing w:after="0" w:line="240" w:lineRule="auto"/>
-              <w:jc w:val="left"/>
-            </w:pPr>
-            <w:r>
-              <w:rPr>
-                <w:rFonts w:ascii="Times New Roman" w:hAnsi="Times New Roman"/>
-                <w:sz w:val="16"/>
-              </w:rPr>
-              <w:t xml:space="preserve">-0.23</w:t>
-            </w:r>
-          </w:p>
-        </w:tc>
-        <w:tc>
-          <w:tcPr/>
-          <w:p>
-            <w:pPr>
-              <w:pStyle w:val="Compact"/>
-              <w:spacing w:after="0" w:line="240" w:lineRule="auto"/>
-              <w:jc w:val="left"/>
-            </w:pPr>
-            <w:r>
-              <w:rPr>
-                <w:rFonts w:ascii="Times New Roman" w:hAnsi="Times New Roman"/>
-                <w:sz w:val="16"/>
-              </w:rPr>
-              <w:t xml:space="preserve">0.032</w:t>
+              <w:t xml:space="preserve">0.621</w:t>
+            </w:r>
+          </w:p>
+        </w:tc>
+        <w:tc>
+          <w:tcPr/>
+          <w:p>
+            <w:pPr>
+              <w:pStyle w:val="Compact"/>
+              <w:spacing w:after="0" w:line="240" w:lineRule="auto"/>
+              <w:jc w:val="left"/>
+            </w:pPr>
+            <w:r>
+              <w:rPr>
+                <w:rFonts w:ascii="Times New Roman" w:hAnsi="Times New Roman"/>
+                <w:sz w:val="16"/>
+              </w:rPr>
+              <w:t xml:space="preserve">0.760</w:t>
+            </w:r>
+          </w:p>
+        </w:tc>
+        <w:tc>
+          <w:tcPr/>
+          <w:p>
+            <w:pPr>
+              <w:pStyle w:val="Compact"/>
+              <w:spacing w:after="0" w:line="240" w:lineRule="auto"/>
+              <w:jc w:val="left"/>
+            </w:pPr>
+            <w:r>
+              <w:rPr>
+                <w:rFonts w:ascii="Times New Roman" w:hAnsi="Times New Roman"/>
+                <w:sz w:val="16"/>
+              </w:rPr>
+              <w:t xml:space="preserve">1.96</w:t>
+            </w:r>
+          </w:p>
+        </w:tc>
+        <w:tc>
+          <w:tcPr/>
+          <w:p>
+            <w:pPr>
+              <w:pStyle w:val="Compact"/>
+              <w:spacing w:after="0" w:line="240" w:lineRule="auto"/>
+              <w:jc w:val="left"/>
+            </w:pPr>
+            <w:r>
+              <w:rPr>
+                <w:rFonts w:ascii="Times New Roman" w:hAnsi="Times New Roman"/>
+                <w:sz w:val="16"/>
+              </w:rPr>
+              <w:t xml:space="preserve">36/0/78</w:t>
+            </w:r>
+          </w:p>
+        </w:tc>
+        <w:tc>
+          <w:tcPr/>
+          <w:p>
+            <w:pPr>
+              <w:pStyle w:val="Compact"/>
+              <w:spacing w:after="0" w:line="240" w:lineRule="auto"/>
+              <w:jc w:val="left"/>
+            </w:pPr>
+            <w:r>
+              <w:rPr>
+                <w:rFonts w:ascii="Times New Roman" w:hAnsi="Times New Roman"/>
+                <w:sz w:val="16"/>
+              </w:rPr>
+              <w:t xml:space="preserve">-0.22</w:t>
+            </w:r>
+          </w:p>
+        </w:tc>
+        <w:tc>
+          <w:tcPr/>
+          <w:p>
+            <w:pPr>
+              <w:pStyle w:val="Compact"/>
+              <w:spacing w:after="0" w:line="240" w:lineRule="auto"/>
+              <w:jc w:val="left"/>
+            </w:pPr>
+            <w:r>
+              <w:rPr>
+                <w:rFonts w:ascii="Times New Roman" w:hAnsi="Times New Roman"/>
+                <w:sz w:val="16"/>
+              </w:rPr>
+              <w:t xml:space="preserve">0.042</w:t>
             </w:r>
           </w:p>
         </w:tc>
@@ -9491,41 +9500,41 @@
                 <w:rFonts w:ascii="Times New Roman" w:hAnsi="Times New Roman"/>
                 <w:sz w:val="16"/>
               </w:rPr>
-              <w:t xml:space="preserve">111</w:t>
-            </w:r>
-          </w:p>
-        </w:tc>
-        <w:tc>
-          <w:tcPr/>
-          <w:p>
-            <w:pPr>
-              <w:pStyle w:val="Compact"/>
-              <w:spacing w:after="0" w:line="240" w:lineRule="auto"/>
-              <w:jc w:val="left"/>
-            </w:pPr>
-            <w:r>
-              <w:rPr>
-                <w:rFonts w:ascii="Times New Roman" w:hAnsi="Times New Roman"/>
-                <w:sz w:val="16"/>
-              </w:rPr>
-              <w:t xml:space="preserve">6.933</w:t>
-            </w:r>
-          </w:p>
-        </w:tc>
-        <w:tc>
-          <w:tcPr/>
-          <w:p>
-            <w:pPr>
-              <w:pStyle w:val="Compact"/>
-              <w:spacing w:after="0" w:line="240" w:lineRule="auto"/>
-              <w:jc w:val="left"/>
-            </w:pPr>
-            <w:r>
-              <w:rPr>
-                <w:rFonts w:ascii="Times New Roman" w:hAnsi="Times New Roman"/>
-                <w:sz w:val="16"/>
-              </w:rPr>
-              <w:t xml:space="preserve">0.669</w:t>
+              <w:t xml:space="preserve">113</w:t>
+            </w:r>
+          </w:p>
+        </w:tc>
+        <w:tc>
+          <w:tcPr/>
+          <w:p>
+            <w:pPr>
+              <w:pStyle w:val="Compact"/>
+              <w:spacing w:after="0" w:line="240" w:lineRule="auto"/>
+              <w:jc w:val="left"/>
+            </w:pPr>
+            <w:r>
+              <w:rPr>
+                <w:rFonts w:ascii="Times New Roman" w:hAnsi="Times New Roman"/>
+                <w:sz w:val="16"/>
+              </w:rPr>
+              <w:t xml:space="preserve">7.024</w:t>
+            </w:r>
+          </w:p>
+        </w:tc>
+        <w:tc>
+          <w:tcPr/>
+          <w:p>
+            <w:pPr>
+              <w:pStyle w:val="Compact"/>
+              <w:spacing w:after="0" w:line="240" w:lineRule="auto"/>
+              <w:jc w:val="left"/>
+            </w:pPr>
+            <w:r>
+              <w:rPr>
+                <w:rFonts w:ascii="Times New Roman" w:hAnsi="Times New Roman"/>
+                <w:sz w:val="16"/>
+              </w:rPr>
+              <w:t xml:space="preserve">0.672</w:t>
             </w:r>
           </w:p>
         </w:tc>
@@ -9559,24 +9568,24 @@
                 <w:rFonts w:ascii="Times New Roman" w:hAnsi="Times New Roman"/>
                 <w:sz w:val="16"/>
               </w:rPr>
-              <w:t xml:space="preserve">0.611</w:t>
-            </w:r>
-          </w:p>
-        </w:tc>
-        <w:tc>
-          <w:tcPr/>
-          <w:p>
-            <w:pPr>
-              <w:pStyle w:val="Compact"/>
-              <w:spacing w:after="0" w:line="240" w:lineRule="auto"/>
-              <w:jc w:val="left"/>
-            </w:pPr>
-            <w:r>
-              <w:rPr>
-                <w:rFonts w:ascii="Times New Roman" w:hAnsi="Times New Roman"/>
-                <w:sz w:val="16"/>
-              </w:rPr>
-              <w:t xml:space="preserve">0.675</w:t>
+              <w:t xml:space="preserve">0.600</w:t>
+            </w:r>
+          </w:p>
+        </w:tc>
+        <w:tc>
+          <w:tcPr/>
+          <w:p>
+            <w:pPr>
+              <w:pStyle w:val="Compact"/>
+              <w:spacing w:after="0" w:line="240" w:lineRule="auto"/>
+              <w:jc w:val="left"/>
+            </w:pPr>
+            <w:r>
+              <w:rPr>
+                <w:rFonts w:ascii="Times New Roman" w:hAnsi="Times New Roman"/>
+                <w:sz w:val="16"/>
+              </w:rPr>
+              <w:t xml:space="preserve">0.676</w:t>
             </w:r>
           </w:p>
         </w:tc>
@@ -9610,7 +9619,7 @@
                 <w:rFonts w:ascii="Times New Roman" w:hAnsi="Times New Roman"/>
                 <w:sz w:val="16"/>
               </w:rPr>
-              <w:t xml:space="preserve">108/0/3</w:t>
+              <w:t xml:space="preserve">110/0/3</w:t>
             </w:r>
           </w:p>
         </w:tc>
@@ -9683,7 +9692,7 @@
         <w:t xml:space="preserve"> </w:t>
       </w:r>
       <w:r>
-        <w:t xml:space="preserve">PreVal with the same target smoothing, which is LOOM without leverage, is much worse on damaged data (median NLL 1.190 vs 0.738; LOOM better on 94 of 114 datasets; p &lt; 0.001). On clean data, LOOM compared with it is not significantly different (40 wins, 74 losses, p = 0.084), so the scaling costs at most a small amount of clean-data NLL.</w:t>
+        <w:t xml:space="preserve">PreVal with the same target smoothing, which is LOOM without leverage, is much worse on damaged data (median NLL 1.172 vs 0.738; LOOM better on 94 of 114 datasets; p &lt; 0.001). On clean data, LOOM compared with it is worse on 75 of 114 datasets (p = 0.038), so the scaling costs at most a small amount of clean-data NLL.</w:t>
       </w:r>
     </w:p>
     <w:p>
@@ -9701,7 +9710,7 @@
         <w:t xml:space="preserve"> </w:t>
       </w:r>
       <w:r>
-        <w:t xml:space="preserve">Fitting the same calibration on in-sample pairs instead of LOO pairs gives a median clean NLL of 0.986, because in-sample scores are overconfident. Using an 80/20 split gives 0.441, because the ridge is then trained on less data. Both variants are also worse under faults.</w:t>
+        <w:t xml:space="preserve">Fitting the same calibration on in-sample pairs instead of LOO pairs gives a median clean NLL of 0.978, because in-sample scores are overconfident. Using an 80/20 split gives 0.441, because the ridge is then trained on less data. Both variants are also worse under faults.</w:t>
       </w:r>
     </w:p>
     <w:p>
@@ -9893,7 +9902,7 @@
         <w:pStyle w:val="FirstParagraph"/>
       </w:pPr>
       <w:r>
-        <w:t xml:space="preserve">Table 4 reports coverage and set size at α = 0.1, that is, for a target coverage of 90 %. On clean data LOOM’s closed-form jackknife+ sets contain the true label for 89.7 % of the test series on average, with 1.55 labels per set, while split conformal prediction reaches 92.7 % with 2.49 labels. Under faults, coverage drops for every method, because damaged recordings are no longer exchangeable with the training data. Here the choice of score matters. With the LAC score, LOOM’s flattened probabilities produce empty sets for 25.0 % of the damaged recordings. With the APS score, flat probabilities instead produce larger sets, which keeps coverage at 90.5 % with only 1.5 % empty sets. For a triage system, a large set is a useful signal in itself.</w:t>
+        <w:t xml:space="preserve">Table 4 reports coverage and set size at α = 0.1, that is, for a target coverage of 90 %. On clean data LOOM’s closed-form jackknife+ sets contain the true label for 89.8 % of the test series on average, with 1.55 labels per set, while split conformal prediction reaches 92.8 % with 2.49 labels. Under faults, coverage drops for every method, because damaged recordings are no longer exchangeable with the training data. Here the choice of score matters. With the LAC score, LOOM’s flattened probabilities produce empty sets for 25.0 % of the damaged recordings. With the APS score, flat probabilities instead produce larger sets, which keeps coverage at 90.5 % with only 1.5 % empty sets. For a triage system, a large set is a useful signal in itself.</w:t>
       </w:r>
     </w:p>
     <w:p>
@@ -10129,7 +10138,7 @@
                 <w:rFonts w:ascii="Times New Roman" w:hAnsi="Times New Roman"/>
                 <w:sz w:val="16"/>
               </w:rPr>
-              <w:t xml:space="preserve">0.897 / 0.861</w:t>
+              <w:t xml:space="preserve">0.898 / 0.861</w:t>
             </w:r>
           </w:p>
         </w:tc>
@@ -10301,7 +10310,7 @@
                 <w:rFonts w:ascii="Times New Roman" w:hAnsi="Times New Roman"/>
                 <w:sz w:val="16"/>
               </w:rPr>
-              <w:t xml:space="preserve">0.638</w:t>
+              <w:t xml:space="preserve">0.639</w:t>
             </w:r>
           </w:p>
         </w:tc>
@@ -10335,7 +10344,7 @@
                 <w:rFonts w:ascii="Times New Roman" w:hAnsi="Times New Roman"/>
                 <w:sz w:val="16"/>
               </w:rPr>
-              <w:t xml:space="preserve">24.9 %</w:t>
+              <w:t xml:space="preserve">24.8 %</w:t>
             </w:r>
           </w:p>
         </w:tc>
@@ -10388,7 +10397,7 @@
                 <w:rFonts w:ascii="Times New Roman" w:hAnsi="Times New Roman"/>
                 <w:sz w:val="16"/>
               </w:rPr>
-              <w:t xml:space="preserve">5.23</w:t>
+              <w:t xml:space="preserve">5.22</w:t>
             </w:r>
           </w:p>
         </w:tc>
@@ -10492,7 +10501,7 @@
                 <w:rFonts w:ascii="Times New Roman" w:hAnsi="Times New Roman"/>
                 <w:sz w:val="16"/>
               </w:rPr>
-              <w:t xml:space="preserve">0.907 / 0.871</w:t>
+              <w:t xml:space="preserve">0.908 / 0.871</w:t>
             </w:r>
           </w:p>
         </w:tc>
@@ -10526,24 +10535,24 @@
                 <w:rFonts w:ascii="Times New Roman" w:hAnsi="Times New Roman"/>
                 <w:sz w:val="16"/>
               </w:rPr>
-              <w:t xml:space="preserve">3.4 %</w:t>
-            </w:r>
-          </w:p>
-        </w:tc>
-        <w:tc>
-          <w:tcPr/>
-          <w:p>
-            <w:pPr>
-              <w:pStyle w:val="Compact"/>
-              <w:spacing w:after="0" w:line="240" w:lineRule="auto"/>
-              <w:jc w:val="left"/>
-            </w:pPr>
-            <w:r>
-              <w:rPr>
-                <w:rFonts w:ascii="Times New Roman" w:hAnsi="Times New Roman"/>
-                <w:sz w:val="16"/>
-              </w:rPr>
-              <w:t xml:space="preserve">0.695</w:t>
+              <w:t xml:space="preserve">3.3 %</w:t>
+            </w:r>
+          </w:p>
+        </w:tc>
+        <w:tc>
+          <w:tcPr/>
+          <w:p>
+            <w:pPr>
+              <w:pStyle w:val="Compact"/>
+              <w:spacing w:after="0" w:line="240" w:lineRule="auto"/>
+              <w:jc w:val="left"/>
+            </w:pPr>
+            <w:r>
+              <w:rPr>
+                <w:rFonts w:ascii="Times New Roman" w:hAnsi="Times New Roman"/>
+                <w:sz w:val="16"/>
+              </w:rPr>
+              <w:t xml:space="preserve">0.696</w:t>
             </w:r>
           </w:p>
         </w:tc>
@@ -10664,7 +10673,7 @@
                 <w:rFonts w:ascii="Times New Roman" w:hAnsi="Times New Roman"/>
                 <w:sz w:val="16"/>
               </w:rPr>
-              <w:t xml:space="preserve">0.816</w:t>
+              <w:t xml:space="preserve">0.817</w:t>
             </w:r>
           </w:p>
         </w:tc>
@@ -10734,7 +10743,7 @@
                 <w:rFonts w:ascii="Times New Roman" w:hAnsi="Times New Roman"/>
                 <w:sz w:val="16"/>
               </w:rPr>
-              <w:t xml:space="preserve">0.927 / 0.871</w:t>
+              <w:t xml:space="preserve">0.928 / 0.871</w:t>
             </w:r>
           </w:p>
         </w:tc>
@@ -10785,7 +10794,7 @@
                 <w:rFonts w:ascii="Times New Roman" w:hAnsi="Times New Roman"/>
                 <w:sz w:val="16"/>
               </w:rPr>
-              <w:t xml:space="preserve">0.762</w:t>
+              <w:t xml:space="preserve">0.763</w:t>
             </w:r>
           </w:p>
         </w:tc>
@@ -10923,7 +10932,7 @@
                 <w:rFonts w:ascii="Times New Roman" w:hAnsi="Times New Roman"/>
                 <w:sz w:val="16"/>
               </w:rPr>
-              <w:t xml:space="preserve">5.42</w:t>
+              <w:t xml:space="preserve">5.41</w:t>
             </w:r>
           </w:p>
         </w:tc>
@@ -11160,7 +11169,7 @@
                 <w:rFonts w:ascii="Times New Roman" w:hAnsi="Times New Roman"/>
                 <w:sz w:val="16"/>
               </w:rPr>
-              <w:t xml:space="preserve">1.36</w:t>
+              <w:t xml:space="preserve">1.14</w:t>
             </w:r>
           </w:p>
         </w:tc>
@@ -11247,24 +11256,24 @@
                 <w:rFonts w:ascii="Times New Roman" w:hAnsi="Times New Roman"/>
                 <w:sz w:val="16"/>
               </w:rPr>
-              <w:t xml:space="preserve">4.01</w:t>
-            </w:r>
-          </w:p>
-        </w:tc>
-        <w:tc>
-          <w:tcPr/>
-          <w:p>
-            <w:pPr>
-              <w:pStyle w:val="Compact"/>
-              <w:spacing w:after="0" w:line="240" w:lineRule="auto"/>
-              <w:jc w:val="left"/>
-            </w:pPr>
-            <w:r>
-              <w:rPr>
-                <w:rFonts w:ascii="Times New Roman" w:hAnsi="Times New Roman"/>
-                <w:sz w:val="16"/>
-              </w:rPr>
-              <w:t xml:space="preserve">0.13</w:t>
+              <w:t xml:space="preserve">3.33</w:t>
+            </w:r>
+          </w:p>
+        </w:tc>
+        <w:tc>
+          <w:tcPr/>
+          <w:p>
+            <w:pPr>
+              <w:pStyle w:val="Compact"/>
+              <w:spacing w:after="0" w:line="240" w:lineRule="auto"/>
+              <w:jc w:val="left"/>
+            </w:pPr>
+            <w:r>
+              <w:rPr>
+                <w:rFonts w:ascii="Times New Roman" w:hAnsi="Times New Roman"/>
+                <w:sz w:val="16"/>
+              </w:rPr>
+              <w:t xml:space="preserve">0.11</w:t>
             </w:r>
           </w:p>
         </w:tc>
@@ -11334,24 +11343,24 @@
                 <w:rFonts w:ascii="Times New Roman" w:hAnsi="Times New Roman"/>
                 <w:sz w:val="16"/>
               </w:rPr>
-              <w:t xml:space="preserve">4.34</w:t>
-            </w:r>
-          </w:p>
-        </w:tc>
-        <w:tc>
-          <w:tcPr/>
-          <w:p>
-            <w:pPr>
-              <w:pStyle w:val="Compact"/>
-              <w:spacing w:after="0" w:line="240" w:lineRule="auto"/>
-              <w:jc w:val="left"/>
-            </w:pPr>
-            <w:r>
-              <w:rPr>
-                <w:rFonts w:ascii="Times New Roman" w:hAnsi="Times New Roman"/>
-                <w:sz w:val="16"/>
-              </w:rPr>
-              <w:t xml:space="preserve">0.14</w:t>
+              <w:t xml:space="preserve">3.63</w:t>
+            </w:r>
+          </w:p>
+        </w:tc>
+        <w:tc>
+          <w:tcPr/>
+          <w:p>
+            <w:pPr>
+              <w:pStyle w:val="Compact"/>
+              <w:spacing w:after="0" w:line="240" w:lineRule="auto"/>
+              <w:jc w:val="left"/>
+            </w:pPr>
+            <w:r>
+              <w:rPr>
+                <w:rFonts w:ascii="Times New Roman" w:hAnsi="Times New Roman"/>
+                <w:sz w:val="16"/>
+              </w:rPr>
+              <w:t xml:space="preserve">0.11</w:t>
             </w:r>
           </w:p>
         </w:tc>
@@ -11421,24 +11430,24 @@
                 <w:rFonts w:ascii="Times New Roman" w:hAnsi="Times New Roman"/>
                 <w:sz w:val="16"/>
               </w:rPr>
-              <w:t xml:space="preserve">4.33</w:t>
-            </w:r>
-          </w:p>
-        </w:tc>
-        <w:tc>
-          <w:tcPr/>
-          <w:p>
-            <w:pPr>
-              <w:pStyle w:val="Compact"/>
-              <w:spacing w:after="0" w:line="240" w:lineRule="auto"/>
-              <w:jc w:val="left"/>
-            </w:pPr>
-            <w:r>
-              <w:rPr>
-                <w:rFonts w:ascii="Times New Roman" w:hAnsi="Times New Roman"/>
-                <w:sz w:val="16"/>
-              </w:rPr>
-              <w:t xml:space="preserve">0.14</w:t>
+              <w:t xml:space="preserve">3.61</w:t>
+            </w:r>
+          </w:p>
+        </w:tc>
+        <w:tc>
+          <w:tcPr/>
+          <w:p>
+            <w:pPr>
+              <w:pStyle w:val="Compact"/>
+              <w:spacing w:after="0" w:line="240" w:lineRule="auto"/>
+              <w:jc w:val="left"/>
+            </w:pPr>
+            <w:r>
+              <w:rPr>
+                <w:rFonts w:ascii="Times New Roman" w:hAnsi="Times New Roman"/>
+                <w:sz w:val="16"/>
+              </w:rPr>
+              <w:t xml:space="preserve">0.11</w:t>
             </w:r>
           </w:p>
         </w:tc>
@@ -11508,24 +11517,24 @@
                 <w:rFonts w:ascii="Times New Roman" w:hAnsi="Times New Roman"/>
                 <w:sz w:val="16"/>
               </w:rPr>
-              <w:t xml:space="preserve">2.41</w:t>
-            </w:r>
-          </w:p>
-        </w:tc>
-        <w:tc>
-          <w:tcPr/>
-          <w:p>
-            <w:pPr>
-              <w:pStyle w:val="Compact"/>
-              <w:spacing w:after="0" w:line="240" w:lineRule="auto"/>
-              <w:jc w:val="left"/>
-            </w:pPr>
-            <w:r>
-              <w:rPr>
-                <w:rFonts w:ascii="Times New Roman" w:hAnsi="Times New Roman"/>
-                <w:sz w:val="16"/>
-              </w:rPr>
-              <w:t xml:space="preserve">0.08</w:t>
+              <w:t xml:space="preserve">2.03</w:t>
+            </w:r>
+          </w:p>
+        </w:tc>
+        <w:tc>
+          <w:tcPr/>
+          <w:p>
+            <w:pPr>
+              <w:pStyle w:val="Compact"/>
+              <w:spacing w:after="0" w:line="240" w:lineRule="auto"/>
+              <w:jc w:val="left"/>
+            </w:pPr>
+            <w:r>
+              <w:rPr>
+                <w:rFonts w:ascii="Times New Roman" w:hAnsi="Times New Roman"/>
+                <w:sz w:val="16"/>
+              </w:rPr>
+              <w:t xml:space="preserve">0.06</w:t>
             </w:r>
           </w:p>
         </w:tc>
@@ -11595,24 +11604,24 @@
                 <w:rFonts w:ascii="Times New Roman" w:hAnsi="Times New Roman"/>
                 <w:sz w:val="16"/>
               </w:rPr>
-              <w:t xml:space="preserve">15.14</w:t>
-            </w:r>
-          </w:p>
-        </w:tc>
-        <w:tc>
-          <w:tcPr/>
-          <w:p>
-            <w:pPr>
-              <w:pStyle w:val="Compact"/>
-              <w:spacing w:after="0" w:line="240" w:lineRule="auto"/>
-              <w:jc w:val="left"/>
-            </w:pPr>
-            <w:r>
-              <w:rPr>
-                <w:rFonts w:ascii="Times New Roman" w:hAnsi="Times New Roman"/>
-                <w:sz w:val="16"/>
-              </w:rPr>
-              <w:t xml:space="preserve">0.46</w:t>
+              <w:t xml:space="preserve">12.78</w:t>
+            </w:r>
+          </w:p>
+        </w:tc>
+        <w:tc>
+          <w:tcPr/>
+          <w:p>
+            <w:pPr>
+              <w:pStyle w:val="Compact"/>
+              <w:spacing w:after="0" w:line="240" w:lineRule="auto"/>
+              <w:jc w:val="left"/>
+            </w:pPr>
+            <w:r>
+              <w:rPr>
+                <w:rFonts w:ascii="Times New Roman" w:hAnsi="Times New Roman"/>
+                <w:sz w:val="16"/>
+              </w:rPr>
+              <w:t xml:space="preserve">0.39</w:t>
             </w:r>
           </w:p>
         </w:tc>
@@ -11682,24 +11691,24 @@
                 <w:rFonts w:ascii="Times New Roman" w:hAnsi="Times New Roman"/>
                 <w:sz w:val="16"/>
               </w:rPr>
-              <w:t xml:space="preserve">15.08</w:t>
-            </w:r>
-          </w:p>
-        </w:tc>
-        <w:tc>
-          <w:tcPr/>
-          <w:p>
-            <w:pPr>
-              <w:pStyle w:val="Compact"/>
-              <w:spacing w:after="0" w:line="240" w:lineRule="auto"/>
-              <w:jc w:val="left"/>
-            </w:pPr>
-            <w:r>
-              <w:rPr>
-                <w:rFonts w:ascii="Times New Roman" w:hAnsi="Times New Roman"/>
-                <w:sz w:val="16"/>
-              </w:rPr>
-              <w:t xml:space="preserve">0.46</w:t>
+              <w:t xml:space="preserve">12.87</w:t>
+            </w:r>
+          </w:p>
+        </w:tc>
+        <w:tc>
+          <w:tcPr/>
+          <w:p>
+            <w:pPr>
+              <w:pStyle w:val="Compact"/>
+              <w:spacing w:after="0" w:line="240" w:lineRule="auto"/>
+              <w:jc w:val="left"/>
+            </w:pPr>
+            <w:r>
+              <w:rPr>
+                <w:rFonts w:ascii="Times New Roman" w:hAnsi="Times New Roman"/>
+                <w:sz w:val="16"/>
+              </w:rPr>
+              <w:t xml:space="preserve">0.39</w:t>
             </w:r>
           </w:p>
         </w:tc>
@@ -11926,41 +11935,41 @@
                 <w:rFonts w:ascii="Times New Roman" w:hAnsi="Times New Roman"/>
                 <w:sz w:val="16"/>
               </w:rPr>
-              <w:t xml:space="preserve">1.228</w:t>
-            </w:r>
-          </w:p>
-        </w:tc>
-        <w:tc>
-          <w:tcPr/>
-          <w:p>
-            <w:pPr>
-              <w:pStyle w:val="Compact"/>
-              <w:spacing w:after="0" w:line="240" w:lineRule="auto"/>
-              <w:jc w:val="left"/>
-            </w:pPr>
-            <w:r>
-              <w:rPr>
-                <w:rFonts w:ascii="Times New Roman" w:hAnsi="Times New Roman"/>
-                <w:sz w:val="16"/>
-              </w:rPr>
-              <w:t xml:space="preserve">5.51</w:t>
-            </w:r>
-          </w:p>
-        </w:tc>
-        <w:tc>
-          <w:tcPr/>
-          <w:p>
-            <w:pPr>
-              <w:pStyle w:val="Compact"/>
-              <w:spacing w:after="0" w:line="240" w:lineRule="auto"/>
-              <w:jc w:val="left"/>
-            </w:pPr>
-            <w:r>
-              <w:rPr>
-                <w:rFonts w:ascii="Times New Roman" w:hAnsi="Times New Roman"/>
-                <w:sz w:val="16"/>
-              </w:rPr>
-              <w:t xml:space="preserve">0.17</w:t>
+              <w:t xml:space="preserve">1.298</w:t>
+            </w:r>
+          </w:p>
+        </w:tc>
+        <w:tc>
+          <w:tcPr/>
+          <w:p>
+            <w:pPr>
+              <w:pStyle w:val="Compact"/>
+              <w:spacing w:after="0" w:line="240" w:lineRule="auto"/>
+              <w:jc w:val="left"/>
+            </w:pPr>
+            <w:r>
+              <w:rPr>
+                <w:rFonts w:ascii="Times New Roman" w:hAnsi="Times New Roman"/>
+                <w:sz w:val="16"/>
+              </w:rPr>
+              <w:t xml:space="preserve">5.72</w:t>
+            </w:r>
+          </w:p>
+        </w:tc>
+        <w:tc>
+          <w:tcPr/>
+          <w:p>
+            <w:pPr>
+              <w:pStyle w:val="Compact"/>
+              <w:spacing w:after="0" w:line="240" w:lineRule="auto"/>
+              <w:jc w:val="left"/>
+            </w:pPr>
+            <w:r>
+              <w:rPr>
+                <w:rFonts w:ascii="Times New Roman" w:hAnsi="Times New Roman"/>
+                <w:sz w:val="16"/>
+              </w:rPr>
+              <w:t xml:space="preserve">0.18</w:t>
             </w:r>
           </w:p>
         </w:tc>
@@ -12013,58 +12022,58 @@
                 <w:rFonts w:ascii="Times New Roman" w:hAnsi="Times New Roman"/>
                 <w:sz w:val="16"/>
               </w:rPr>
-              <w:t xml:space="preserve">4.463</w:t>
-            </w:r>
-          </w:p>
-        </w:tc>
-        <w:tc>
-          <w:tcPr/>
-          <w:p>
-            <w:pPr>
-              <w:pStyle w:val="Compact"/>
-              <w:spacing w:after="0" w:line="240" w:lineRule="auto"/>
-              <w:jc w:val="left"/>
-            </w:pPr>
-            <w:r>
-              <w:rPr>
-                <w:rFonts w:ascii="Times New Roman" w:hAnsi="Times New Roman"/>
-                <w:sz w:val="16"/>
-              </w:rPr>
-              <w:t xml:space="preserve">14.09</w:t>
-            </w:r>
-          </w:p>
-        </w:tc>
-        <w:tc>
-          <w:tcPr/>
-          <w:p>
-            <w:pPr>
-              <w:pStyle w:val="Compact"/>
-              <w:spacing w:after="0" w:line="240" w:lineRule="auto"/>
-              <w:jc w:val="left"/>
-            </w:pPr>
-            <w:r>
-              <w:rPr>
-                <w:rFonts w:ascii="Times New Roman" w:hAnsi="Times New Roman"/>
-                <w:sz w:val="16"/>
-              </w:rPr>
-              <w:t xml:space="preserve">0.43</w:t>
-            </w:r>
-          </w:p>
-        </w:tc>
-        <w:tc>
-          <w:tcPr/>
-          <w:p>
-            <w:pPr>
-              <w:pStyle w:val="Compact"/>
-              <w:spacing w:after="0" w:line="240" w:lineRule="auto"/>
-              <w:jc w:val="left"/>
-            </w:pPr>
-            <w:r>
-              <w:rPr>
-                <w:rFonts w:ascii="Times New Roman" w:hAnsi="Times New Roman"/>
-                <w:sz w:val="16"/>
-              </w:rPr>
-              <w:t xml:space="preserve">21.23</w:t>
+              <w:t xml:space="preserve">4.475</w:t>
+            </w:r>
+          </w:p>
+        </w:tc>
+        <w:tc>
+          <w:tcPr/>
+          <w:p>
+            <w:pPr>
+              <w:pStyle w:val="Compact"/>
+              <w:spacing w:after="0" w:line="240" w:lineRule="auto"/>
+              <w:jc w:val="left"/>
+            </w:pPr>
+            <w:r>
+              <w:rPr>
+                <w:rFonts w:ascii="Times New Roman" w:hAnsi="Times New Roman"/>
+                <w:sz w:val="16"/>
+              </w:rPr>
+              <w:t xml:space="preserve">22.98</w:t>
+            </w:r>
+          </w:p>
+        </w:tc>
+        <w:tc>
+          <w:tcPr/>
+          <w:p>
+            <w:pPr>
+              <w:pStyle w:val="Compact"/>
+              <w:spacing w:after="0" w:line="240" w:lineRule="auto"/>
+              <w:jc w:val="left"/>
+            </w:pPr>
+            <w:r>
+              <w:rPr>
+                <w:rFonts w:ascii="Times New Roman" w:hAnsi="Times New Roman"/>
+                <w:sz w:val="16"/>
+              </w:rPr>
+              <w:t xml:space="preserve">0.72</w:t>
+            </w:r>
+          </w:p>
+        </w:tc>
+        <w:tc>
+          <w:tcPr/>
+          <w:p>
+            <w:pPr>
+              <w:pStyle w:val="Compact"/>
+              <w:spacing w:after="0" w:line="240" w:lineRule="auto"/>
+              <w:jc w:val="left"/>
+            </w:pPr>
+            <w:r>
+              <w:rPr>
+                <w:rFonts w:ascii="Times New Roman" w:hAnsi="Times New Roman"/>
+                <w:sz w:val="16"/>
+              </w:rPr>
+              <w:t xml:space="preserve">20.45</w:t>
             </w:r>
           </w:p>
         </w:tc>
@@ -12075,7 +12084,7 @@
         <w:pStyle w:val="BodyText"/>
       </w:pPr>
       <w:r>
-        <w:t xml:space="preserve">LOOM costs the same to fit as PreVal (median 0.14 s vs 0.14 s on top of the shared MiniRocket transform, which takes a median of 0.17 s; Table 5 and Fig. 9). From raw data to a fitted model, a single LOOM model takes about 0.31 s, compared with 1.23 s for QUANT, 2.25 s for a five-seed ensemble and 4.46 s for the Arsenal. Prediction is slower than for plain ridge because each new series is projected onto the singular vectors (Section 4.6), but it remains a fraction of a second per dataset.</w:t>
+        <w:t xml:space="preserve">LOOM costs the same to fit as PreVal (median 0.14 s vs 0.14 s on top of the shared MiniRocket transform, which takes a median of 0.17 s; Table 5 and Fig. 9). From raw data to a fitted model, a single LOOM model takes about 0.31 s, compared with 1.30 s for QUANT, 2.25 s for a five-seed ensemble and 4.47 s for the Arsenal. Prediction is slower than for plain ridge because each new series is projected onto the singular vectors (Section 4.6), but it remains a fraction of a second per dataset.</w:t>
       </w:r>
     </w:p>
     <w:p>
@@ -12083,7 +12092,7 @@
         <w:pStyle w:val="BodyText"/>
       </w:pPr>
       <w:r>
-        <w:t xml:space="preserve">The moderation strength was discussed in Section 6.5. For the prediction sets, the clean coverage of LOOM’s jackknife+ is 95.0 % at α = 0.05 and 79.5 % at α = 0.2. We also checked whether the logistic-regression baseline was trained long enough. On 12 random datasets, ten times more iterations and a tighter tolerance changed its median NLL from 0.2707 to 0.2711, but improved it by 0.161 on ShapesAll, a dataset with many classes. The clean-data comparison with logistic regression should therefore be read as approximate for such datasets (Online Resource 3).</w:t>
+        <w:t xml:space="preserve">The moderation strength was discussed in Section 6.5. For the prediction sets, the clean coverage of LOOM’s jackknife+ is 95.1 % at α = 0.05 and 79.6 % at α = 0.2. We also checked whether the logistic-regression baseline was trained long enough. On 12 random datasets, ten times more iterations and a tighter tolerance changed its median NLL from 0.2707 to 0.2711, but improved it by 0.161 on ShapesAll, a dataset with many classes. The clean-data comparison with logistic regression should therefore be read as approximate for such datasets (Online Resource 3).</w:t>
       </w:r>
     </w:p>
     <w:p>
@@ -12167,7 +12176,7 @@
         <w:pStyle w:val="FirstParagraph"/>
       </w:pPr>
       <w:r>
-        <w:t xml:space="preserve">LOOM helps most where faults increase leverage the most. Across datasets, its gain over PreVal under faults rises with the increase in leverage that the faults cause (Spearman ρ = 0.61, p &lt; 0.001, n = 114), which is the mechanism we designed it for. The share of datasets on which LOOM beats PreVal grows with severity for every fault type except speed variation. At the highest severity it is 95 % for noise, 89 % for spikes, 89 % for dropouts, 87 % for baseline wander and 74 % for misalignment, but only 53 % for speed variation, whose median leverage ratio stays at 1.26. A smooth change of speed of up to ±20 % leaves the pooled MiniRocket features largely where they were. Leverage then carries no signal, and LOOM behaves like an ordinary temperature-scaled ridge. Mild faults are also hard to tell apart from normal variation: at severity 1 the win rates of the other fault types are only 48 %–64 %.</w:t>
+        <w:t xml:space="preserve">LOOM helps most where faults increase leverage the most. Across datasets, its gain over PreVal under faults rises with the increase in leverage that the faults cause (Spearman ρ = 0.61, p &lt; 0.001, n = 114), which is the mechanism we designed it for. The share of datasets on which LOOM beats PreVal grows with severity for every fault type except speed variation. At the highest severity it is 95 % for noise, 89 % for spikes, 89 % for dropouts, 87 % for baseline wander and 73 % for misalignment, but only 53 % for speed variation, whose median leverage ratio stays at 1.26. A smooth change of speed of up to ±20 % leaves the pooled MiniRocket features largely where they were. Leverage then carries no signal, and LOOM behaves like an ordinary temperature-scaled ridge. Mild faults are also hard to tell apart from normal variation: at severity 1 the win rates of the other fault types are only 47 %–64 %.</w:t>
       </w:r>
     </w:p>
     <w:p>
@@ -12209,7 +12218,7 @@
         <w:t xml:space="preserve">many classes with very few training series each</w:t>
       </w:r>
       <w:r>
-        <w:t xml:space="preserve">. On clean data, the gain over PreVal shrinks as the number of classes grows (ρ = -0.37, p &lt; 0.001). The four largest clean losses occur on PigArtPressure, Symbols, ShapesAll and PigAirwayPressure, which have only 2 to 10 training series per class on average. With so few examples, the smoothed targets give the true class only (n_k + 1)/(n_k + 2) of the probability mass, and the fitted model ends up underconfident. Smoothing is also what raises LOOM’s clean ECE (Section 6.2). Without it, the median clean ECE is 0.041, the same level as PreVal’s 0.040, but the NLL under faults is significantly worse (Section 6.5).</w:t>
+        <w:t xml:space="preserve">. On clean data, the gain over PreVal shrinks as the number of classes grows (ρ = -0.39, p &lt; 0.001). The four largest clean losses occur on PigArtPressure, Symbols, ShapesAll and PigAirwayPressure, which have only 2 to 10 training series per class on average. With so few examples, the smoothed targets give the true class only (n_k + 1)/(n_k + 2) of the probability mass, and the fitted model ends up underconfident. Smoothing is also what raises LOOM’s clean ECE (Section 6.2). Without it, the median clean ECE is 0.041, the same level as PreVal’s 0.040, but the NLL under faults is significantly worse (Section 6.5).</w:t>
       </w:r>
     </w:p>
     <w:bookmarkEnd w:id="76"/>
@@ -12247,7 +12256,7 @@
         <w:t xml:space="preserve">(Dempster et al. 2025)</w:t>
       </w:r>
       <w:r>
-        <w:t xml:space="preserve">, and our clean-data results agree: the two cannot be told apart in NLL. They part ways when the recordings are damaged. A single scale factor keeps the confidence of a faulty recording at the level that suits clean data, and its NLL grows quickly (median 1.728 over the fault conditions). LOOM uses a second quantity that the LOO algebra provides for free, the held-out leverage, to put each prediction on the scale of its own uncertainty. Its median NLL under faults is 0.738, and its confidence separates faulty from clean recordings better than any of the competing methods, including QUANT (median AUROC 0.765 vs 0.711). The ablation confirms that this comes from the leverage scaling and that the exact LOO pairs are needed to calibrate it.</w:t>
+        <w:t xml:space="preserve">, and our clean-data results agree: the two cannot be told apart in NLL. They part ways when the recordings are damaged. A single scale factor keeps the confidence of a faulty recording at the level that suits clean data, and its NLL grows quickly (median 1.728 over the fault conditions). LOOM uses a second quantity that the LOO algebra provides for free, the held-out leverage, to put each prediction on the scale of its own uncertainty. Its median NLL under faults is 0.738, and its confidence separates faulty from clean recordings better than any of the competing methods, including QUANT (median AUROC 0.765 vs 0.709). The ablation confirms that this comes from the leverage scaling and that the exact LOO pairs are needed to calibrate it.</w:t>
       </w:r>
     </w:p>
     <w:p>
@@ -12292,7 +12301,7 @@
         <w:t xml:space="preserve">(Kristiadi et al. 2020; Liu et al. 2020; van Amersfoort et al. 2020)</w:t>
       </w:r>
       <w:r>
-        <w:t xml:space="preserve">. For a linear readout on fixed random features, such distance awareness is available in closed form through the leverage, and it can be calibrated without held-out data. A nearest-neighbour distance used in the same role gave a similar NLL but detected faults worse. Leverage measures distance in the same regularised geometry that the classifier uses, and it comes from the decomposition that is computed anyway. QUANT, a tree ensemble on raw-series quantiles, reached a similar NLL under faults on average and a lower one under the strongest faults, at a higher clean NLL and about 4.0 times LOOM’s end-to-end training time. The two approaches have different strengths, and combining them is a promising direction.</w:t>
+        <w:t xml:space="preserve">. For a linear readout on fixed random features, such distance awareness is available in closed form through the leverage, and it can be calibrated without held-out data. A nearest-neighbour distance used in the same role gave a similar NLL but detected faults worse. Leverage measures distance in the same regularised geometry that the classifier uses, and it comes from the decomposition that is computed anyway. QUANT, a tree ensemble on raw-series quantiles, reached a similar NLL under faults on average and a lower one under the strongest faults, at a higher clean NLL and about 4.2 times LOOM’s end-to-end training time. The two approaches have different strengths, and combining them is a promising direction.</w:t>
       </w:r>
     </w:p>
     <w:p>
@@ -12597,7 +12606,7 @@
       </w:r>
     </w:p>
     <w:bookmarkEnd w:id="80"/>
-    <w:bookmarkStart w:id="173" w:name="references"/>
+    <w:bookmarkStart w:id="177" w:name="references"/>
     <w:p>
       <w:pPr>
         <w:pStyle w:val="Heading1"/>
@@ -12606,19 +12615,43 @@
         <w:t xml:space="preserve">References</w:t>
       </w:r>
     </w:p>
-    <w:bookmarkStart w:id="172" w:name="refs"/>
-    <w:bookmarkStart w:id="82" w:name="ref-allen1974"/>
+    <w:bookmarkStart w:id="176" w:name="refs"/>
+    <w:bookmarkStart w:id="82" w:name="ref-abdar2021"/>
     <w:p>
       <w:pPr>
         <w:pStyle w:val="Bibliography"/>
       </w:pPr>
       <w:r>
+        <w:t xml:space="preserve">Abdar M, Pourpanah F, Hussain S, et al (2021)</w:t>
+      </w:r>
+      <w:r>
+        <w:t xml:space="preserve"> </w:t>
+      </w:r>
+      <w:hyperlink r:id="rId81">
+        <w:r>
+          <w:rPr>
+            <w:rStyle w:val="Hyperlink"/>
+          </w:rPr>
+          <w:t xml:space="preserve">A review of uncertainty quantification in deep learning: Techniques, applications and challenges</w:t>
+        </w:r>
+      </w:hyperlink>
+      <w:r>
+        <w:t xml:space="preserve">. Information Fusion 76:243–297</w:t>
+      </w:r>
+    </w:p>
+    <w:bookmarkEnd w:id="82"/>
+    <w:bookmarkStart w:id="84" w:name="ref-allen1974"/>
+    <w:p>
+      <w:pPr>
+        <w:pStyle w:val="Bibliography"/>
+      </w:pPr>
+      <w:r>
         <w:t xml:space="preserve">Allen DM (1974)</w:t>
       </w:r>
       <w:r>
         <w:t xml:space="preserve"> </w:t>
       </w:r>
-      <w:hyperlink r:id="rId81">
+      <w:hyperlink r:id="rId83">
         <w:r>
           <w:rPr>
             <w:rStyle w:val="Hyperlink"/>
@@ -12630,8 +12663,8 @@
         <w:t xml:space="preserve">. Technometrics 16:125–127</w:t>
       </w:r>
     </w:p>
-    <w:bookmarkEnd w:id="82"/>
-    <w:bookmarkStart w:id="84" w:name="ref-angelopoulos2023"/>
+    <w:bookmarkEnd w:id="84"/>
+    <w:bookmarkStart w:id="86" w:name="ref-angelopoulos2023"/>
     <w:p>
       <w:pPr>
         <w:pStyle w:val="Bibliography"/>
@@ -12642,7 +12675,7 @@
       <w:r>
         <w:t xml:space="preserve"> </w:t>
       </w:r>
-      <w:hyperlink r:id="rId83">
+      <w:hyperlink r:id="rId85">
         <w:r>
           <w:rPr>
             <w:rStyle w:val="Hyperlink"/>
@@ -12654,8 +12687,8 @@
         <w:t xml:space="preserve">. Foundations and Trends® in Machine Learning 16:494–591</w:t>
       </w:r>
     </w:p>
-    <w:bookmarkEnd w:id="84"/>
-    <w:bookmarkStart w:id="85" w:name="ref-angelopoulos2021raps"/>
+    <w:bookmarkEnd w:id="86"/>
+    <w:bookmarkStart w:id="87" w:name="ref-angelopoulos2021raps"/>
     <w:p>
       <w:pPr>
         <w:pStyle w:val="Bibliography"/>
@@ -12664,8 +12697,8 @@
         <w:t xml:space="preserve">Angelopoulos AN, Bates S, Malik J, Jordan MI (2021) Uncertainty sets for image classifiers using conformal prediction. In: International Conference on Learning Representations</w:t>
       </w:r>
     </w:p>
-    <w:bookmarkEnd w:id="85"/>
-    <w:bookmarkStart w:id="87" w:name="ref-bagnall2017bakeoff"/>
+    <w:bookmarkEnd w:id="87"/>
+    <w:bookmarkStart w:id="89" w:name="ref-bagnall2017bakeoff"/>
     <w:p>
       <w:pPr>
         <w:pStyle w:val="Bibliography"/>
@@ -12676,7 +12709,7 @@
       <w:r>
         <w:t xml:space="preserve"> </w:t>
       </w:r>
-      <w:hyperlink r:id="rId86">
+      <w:hyperlink r:id="rId88">
         <w:r>
           <w:rPr>
             <w:rStyle w:val="Hyperlink"/>
@@ -12688,8 +12721,8 @@
         <w:t xml:space="preserve">. Data Mining and Knowledge Discovery 31:606–660</w:t>
       </w:r>
     </w:p>
-    <w:bookmarkEnd w:id="87"/>
-    <w:bookmarkStart w:id="89" w:name="ref-barber2021"/>
+    <w:bookmarkEnd w:id="89"/>
+    <w:bookmarkStart w:id="91" w:name="ref-barber2021"/>
     <w:p>
       <w:pPr>
         <w:pStyle w:val="Bibliography"/>
@@ -12700,7 +12733,7 @@
       <w:r>
         <w:t xml:space="preserve"> </w:t>
       </w:r>
-      <w:hyperlink r:id="rId88">
+      <w:hyperlink r:id="rId90">
         <w:r>
           <w:rPr>
             <w:rStyle w:val="Hyperlink"/>
@@ -12712,8 +12745,8 @@
         <w:t xml:space="preserve">. The Annals of Statistics 49:486–507</w:t>
       </w:r>
     </w:p>
-    <w:bookmarkEnd w:id="89"/>
-    <w:bookmarkStart w:id="90" w:name="ref-benavoli2016"/>
+    <w:bookmarkEnd w:id="91"/>
+    <w:bookmarkStart w:id="92" w:name="ref-benavoli2016"/>
     <w:p>
       <w:pPr>
         <w:pStyle w:val="Bibliography"/>
@@ -12722,8 +12755,8 @@
         <w:t xml:space="preserve">Benavoli A, Corani G, Mangili F (2016) Should we really use post-hoc tests based on mean-ranks? Journal of Machine Learning Research 17:1–10</w:t>
       </w:r>
     </w:p>
-    <w:bookmarkEnd w:id="90"/>
-    <w:bookmarkStart w:id="91" w:name="ref-burnaev2014"/>
+    <w:bookmarkEnd w:id="92"/>
+    <w:bookmarkStart w:id="93" w:name="ref-burnaev2014"/>
     <w:p>
       <w:pPr>
         <w:pStyle w:val="Bibliography"/>
@@ -12732,8 +12765,8 @@
         <w:t xml:space="preserve">Burnaev E, Vovk V (2014) Efficiency of conformalized ridge regression. In: Proceedings of the 27th Conference on Learning Theory. pp 605–622</w:t>
       </w:r>
     </w:p>
-    <w:bookmarkEnd w:id="91"/>
-    <w:bookmarkStart w:id="93" w:name="ref-cawley2004"/>
+    <w:bookmarkEnd w:id="93"/>
+    <w:bookmarkStart w:id="95" w:name="ref-cawley2004"/>
     <w:p>
       <w:pPr>
         <w:pStyle w:val="Bibliography"/>
@@ -12744,7 +12777,7 @@
       <w:r>
         <w:t xml:space="preserve"> </w:t>
       </w:r>
-      <w:hyperlink r:id="rId92">
+      <w:hyperlink r:id="rId94">
         <w:r>
           <w:rPr>
             <w:rStyle w:val="Hyperlink"/>
@@ -12756,8 +12789,8 @@
         <w:t xml:space="preserve">. Neural Networks 17:1467–1475</w:t>
       </w:r>
     </w:p>
-    <w:bookmarkEnd w:id="93"/>
-    <w:bookmarkStart w:id="95" w:name="ref-dau2019ucr"/>
+    <w:bookmarkEnd w:id="95"/>
+    <w:bookmarkStart w:id="97" w:name="ref-dau2019ucr"/>
     <w:p>
       <w:pPr>
         <w:pStyle w:val="Bibliography"/>
@@ -12768,7 +12801,7 @@
       <w:r>
         <w:t xml:space="preserve"> </w:t>
       </w:r>
-      <w:hyperlink r:id="rId94">
+      <w:hyperlink r:id="rId96">
         <w:r>
           <w:rPr>
             <w:rStyle w:val="Hyperlink"/>
@@ -12780,8 +12813,8 @@
         <w:t xml:space="preserve">. IEEE/CAA Journal of Automatica Sinica 6:1293–1305</w:t>
       </w:r>
     </w:p>
-    <w:bookmarkEnd w:id="95"/>
-    <w:bookmarkStart w:id="97" w:name="ref-dempster2020rocket"/>
+    <w:bookmarkEnd w:id="97"/>
+    <w:bookmarkStart w:id="99" w:name="ref-dempster2020rocket"/>
     <w:p>
       <w:pPr>
         <w:pStyle w:val="Bibliography"/>
@@ -12792,7 +12825,7 @@
       <w:r>
         <w:t xml:space="preserve"> </w:t>
       </w:r>
-      <w:hyperlink r:id="rId96">
+      <w:hyperlink r:id="rId98">
         <w:r>
           <w:rPr>
             <w:rStyle w:val="Hyperlink"/>
@@ -12804,8 +12837,8 @@
         <w:t xml:space="preserve">. Data Mining and Knowledge Discovery 34:1454–1495</w:t>
       </w:r>
     </w:p>
-    <w:bookmarkEnd w:id="97"/>
-    <w:bookmarkStart w:id="99" w:name="ref-dempster2021minirocket"/>
+    <w:bookmarkEnd w:id="99"/>
+    <w:bookmarkStart w:id="101" w:name="ref-dempster2021minirocket"/>
     <w:p>
       <w:pPr>
         <w:pStyle w:val="Bibliography"/>
@@ -12816,7 +12849,7 @@
       <w:r>
         <w:t xml:space="preserve"> </w:t>
       </w:r>
-      <w:hyperlink r:id="rId98">
+      <w:hyperlink r:id="rId100">
         <w:r>
           <w:rPr>
             <w:rStyle w:val="Hyperlink"/>
@@ -12828,8 +12861,8 @@
         <w:t xml:space="preserve">. Proceedings of the 27th ACM SIGKDD Conference on Knowledge Discovery &amp;amp; Data Mining 248–257</w:t>
       </w:r>
     </w:p>
-    <w:bookmarkEnd w:id="99"/>
-    <w:bookmarkStart w:id="101" w:name="ref-dempster2023hydra"/>
+    <w:bookmarkEnd w:id="101"/>
+    <w:bookmarkStart w:id="103" w:name="ref-dempster2023hydra"/>
     <w:p>
       <w:pPr>
         <w:pStyle w:val="Bibliography"/>
@@ -12840,7 +12873,7 @@
       <w:r>
         <w:t xml:space="preserve"> </w:t>
       </w:r>
-      <w:hyperlink r:id="rId100">
+      <w:hyperlink r:id="rId102">
         <w:r>
           <w:rPr>
             <w:rStyle w:val="Hyperlink"/>
@@ -12852,8 +12885,8 @@
         <w:t xml:space="preserve">. Data Mining and Knowledge Discovery 37:1779–1805</w:t>
       </w:r>
     </w:p>
-    <w:bookmarkEnd w:id="101"/>
-    <w:bookmarkStart w:id="103" w:name="ref-dempster2024quant"/>
+    <w:bookmarkEnd w:id="103"/>
+    <w:bookmarkStart w:id="105" w:name="ref-dempster2024quant"/>
     <w:p>
       <w:pPr>
         <w:pStyle w:val="Bibliography"/>
@@ -12864,7 +12897,7 @@
       <w:r>
         <w:t xml:space="preserve"> </w:t>
       </w:r>
-      <w:hyperlink r:id="rId102">
+      <w:hyperlink r:id="rId104">
         <w:r>
           <w:rPr>
             <w:rStyle w:val="Hyperlink"/>
@@ -12876,8 +12909,8 @@
         <w:t xml:space="preserve">. Data Mining and Knowledge Discovery 38:2377–2402</w:t>
       </w:r>
     </w:p>
-    <w:bookmarkEnd w:id="103"/>
-    <w:bookmarkStart w:id="105" w:name="ref-dempster2025preval"/>
+    <w:bookmarkEnd w:id="105"/>
+    <w:bookmarkStart w:id="107" w:name="ref-dempster2025preval"/>
     <w:p>
       <w:pPr>
         <w:pStyle w:val="Bibliography"/>
@@ -12888,7 +12921,7 @@
       <w:r>
         <w:t xml:space="preserve"> </w:t>
       </w:r>
-      <w:hyperlink r:id="rId104">
+      <w:hyperlink r:id="rId106">
         <w:r>
           <w:rPr>
             <w:rStyle w:val="Hyperlink"/>
@@ -12900,8 +12933,8 @@
         <w:t xml:space="preserve">. arXiv preprint arXiv:2401.15610 (version 2)</w:t>
       </w:r>
     </w:p>
-    <w:bookmarkEnd w:id="105"/>
-    <w:bookmarkStart w:id="106" w:name="ref-demsar2006"/>
+    <w:bookmarkEnd w:id="107"/>
+    <w:bookmarkStart w:id="108" w:name="ref-demsar2006"/>
     <w:p>
       <w:pPr>
         <w:pStyle w:val="Bibliography"/>
@@ -12910,18 +12943,42 @@
         <w:t xml:space="preserve">Demšar J (2006) Statistical comparisons of classifiers over multiple data sets. Journal of Machine Learning Research 7:1–30</w:t>
       </w:r>
     </w:p>
-    <w:bookmarkEnd w:id="106"/>
-    <w:bookmarkStart w:id="107" w:name="ref-geifman2017"/>
+    <w:bookmarkEnd w:id="108"/>
+    <w:bookmarkStart w:id="110" w:name="ref-gawlikowski2023"/>
     <w:p>
       <w:pPr>
         <w:pStyle w:val="Bibliography"/>
       </w:pPr>
       <w:r>
+        <w:t xml:space="preserve">Gawlikowski J, Tassi CRN, Ali M, et al (2023)</w:t>
+      </w:r>
+      <w:r>
+        <w:t xml:space="preserve"> </w:t>
+      </w:r>
+      <w:hyperlink r:id="rId109">
+        <w:r>
+          <w:rPr>
+            <w:rStyle w:val="Hyperlink"/>
+          </w:rPr>
+          <w:t xml:space="preserve">A survey of uncertainty in deep neural networks</w:t>
+        </w:r>
+      </w:hyperlink>
+      <w:r>
+        <w:t xml:space="preserve">. Artificial Intelligence Review 56:1513–1589</w:t>
+      </w:r>
+    </w:p>
+    <w:bookmarkEnd w:id="110"/>
+    <w:bookmarkStart w:id="111" w:name="ref-geifman2017"/>
+    <w:p>
+      <w:pPr>
+        <w:pStyle w:val="Bibliography"/>
+      </w:pPr>
+      <w:r>
         <w:t xml:space="preserve">Geifman Y, El-Yaniv R (2017) Selective classification for deep neural networks. In: Advances in Neural Information Processing Systems</w:t>
       </w:r>
     </w:p>
-    <w:bookmarkEnd w:id="107"/>
-    <w:bookmarkStart w:id="109" w:name="ref-golub1979"/>
+    <w:bookmarkEnd w:id="111"/>
+    <w:bookmarkStart w:id="113" w:name="ref-golub1979"/>
     <w:p>
       <w:pPr>
         <w:pStyle w:val="Bibliography"/>
@@ -12932,7 +12989,7 @@
       <w:r>
         <w:t xml:space="preserve"> </w:t>
       </w:r>
-      <w:hyperlink r:id="rId108">
+      <w:hyperlink r:id="rId112">
         <w:r>
           <w:rPr>
             <w:rStyle w:val="Hyperlink"/>
@@ -12944,8 +13001,8 @@
         <w:t xml:space="preserve">. Technometrics 21:215–223</w:t>
       </w:r>
     </w:p>
-    <w:bookmarkEnd w:id="109"/>
-    <w:bookmarkStart w:id="110" w:name="ref-guo2017"/>
+    <w:bookmarkEnd w:id="113"/>
+    <w:bookmarkStart w:id="114" w:name="ref-guo2017"/>
     <w:p>
       <w:pPr>
         <w:pStyle w:val="Bibliography"/>
@@ -12954,8 +13011,8 @@
         <w:t xml:space="preserve">Guo C, Pleiss G, Sun Y, Weinberger KQ (2017) On calibration of modern neural networks. In: Proceedings of the 34th International Conference on Machine Learning. pp 1321–1330</w:t>
       </w:r>
     </w:p>
-    <w:bookmarkEnd w:id="110"/>
-    <w:bookmarkStart w:id="111" w:name="ref-hendrycks2019"/>
+    <w:bookmarkEnd w:id="114"/>
+    <w:bookmarkStart w:id="115" w:name="ref-hendrycks2019"/>
     <w:p>
       <w:pPr>
         <w:pStyle w:val="Bibliography"/>
@@ -12964,8 +13021,8 @@
         <w:t xml:space="preserve">Hendrycks D, Dietterich T (2019) Benchmarking neural network robustness to common corruptions and perturbations. In: International Conference on Learning Representations</w:t>
       </w:r>
     </w:p>
-    <w:bookmarkEnd w:id="111"/>
-    <w:bookmarkStart w:id="112" w:name="ref-hendrycks2017"/>
+    <w:bookmarkEnd w:id="115"/>
+    <w:bookmarkStart w:id="116" w:name="ref-hendrycks2017"/>
     <w:p>
       <w:pPr>
         <w:pStyle w:val="Bibliography"/>
@@ -12974,8 +13031,8 @@
         <w:t xml:space="preserve">Hendrycks D, Gimpel K (2017) A baseline for detecting misclassified and out-of-distribution examples in neural networks. In: International Conference on Learning Representations</w:t>
       </w:r>
     </w:p>
-    <w:bookmarkEnd w:id="112"/>
-    <w:bookmarkStart w:id="114" w:name="ref-hoaglin1978"/>
+    <w:bookmarkEnd w:id="116"/>
+    <w:bookmarkStart w:id="118" w:name="ref-hoaglin1978"/>
     <w:p>
       <w:pPr>
         <w:pStyle w:val="Bibliography"/>
@@ -12986,7 +13043,7 @@
       <w:r>
         <w:t xml:space="preserve"> </w:t>
       </w:r>
-      <w:hyperlink r:id="rId113">
+      <w:hyperlink r:id="rId117">
         <w:r>
           <w:rPr>
             <w:rStyle w:val="Hyperlink"/>
@@ -12998,8 +13055,8 @@
         <w:t xml:space="preserve">. The American Statistician 32:17–22</w:t>
       </w:r>
     </w:p>
-    <w:bookmarkEnd w:id="114"/>
-    <w:bookmarkStart w:id="116" w:name="ref-hoerl1970"/>
+    <w:bookmarkEnd w:id="118"/>
+    <w:bookmarkStart w:id="120" w:name="ref-hoerl1970"/>
     <w:p>
       <w:pPr>
         <w:pStyle w:val="Bibliography"/>
@@ -13010,7 +13067,7 @@
       <w:r>
         <w:t xml:space="preserve"> </w:t>
       </w:r>
-      <w:hyperlink r:id="rId115">
+      <w:hyperlink r:id="rId119">
         <w:r>
           <w:rPr>
             <w:rStyle w:val="Hyperlink"/>
@@ -13022,8 +13079,8 @@
         <w:t xml:space="preserve">. Technometrics 12:55–67</w:t>
       </w:r>
     </w:p>
-    <w:bookmarkEnd w:id="116"/>
-    <w:bookmarkStart w:id="117" w:name="ref-holm1979"/>
+    <w:bookmarkEnd w:id="120"/>
+    <w:bookmarkStart w:id="121" w:name="ref-holm1979"/>
     <w:p>
       <w:pPr>
         <w:pStyle w:val="Bibliography"/>
@@ -13032,8 +13089,8 @@
         <w:t xml:space="preserve">Holm S (1979) A simple sequentially rejective multiple test procedure. Scandinavian Journal of Statistics 6:65–70</w:t>
       </w:r>
     </w:p>
-    <w:bookmarkEnd w:id="117"/>
-    <w:bookmarkStart w:id="119" w:name="ref-ismailfawaz2019review"/>
+    <w:bookmarkEnd w:id="121"/>
+    <w:bookmarkStart w:id="123" w:name="ref-ismailfawaz2019review"/>
     <w:p>
       <w:pPr>
         <w:pStyle w:val="Bibliography"/>
@@ -13044,7 +13101,7 @@
       <w:r>
         <w:t xml:space="preserve"> </w:t>
       </w:r>
-      <w:hyperlink r:id="rId118">
+      <w:hyperlink r:id="rId122">
         <w:r>
           <w:rPr>
             <w:rStyle w:val="Hyperlink"/>
@@ -13056,8 +13113,8 @@
         <w:t xml:space="preserve">. Data Mining and Knowledge Discovery 33:917–963</w:t>
       </w:r>
     </w:p>
-    <w:bookmarkEnd w:id="119"/>
-    <w:bookmarkStart w:id="121" w:name="ref-ismailfawaz2020inception"/>
+    <w:bookmarkEnd w:id="123"/>
+    <w:bookmarkStart w:id="125" w:name="ref-ismailfawaz2020inception"/>
     <w:p>
       <w:pPr>
         <w:pStyle w:val="Bibliography"/>
@@ -13068,7 +13125,7 @@
       <w:r>
         <w:t xml:space="preserve"> </w:t>
       </w:r>
-      <w:hyperlink r:id="rId120">
+      <w:hyperlink r:id="rId124">
         <w:r>
           <w:rPr>
             <w:rStyle w:val="Hyperlink"/>
@@ -13080,8 +13137,8 @@
         <w:t xml:space="preserve">. Data Mining and Knowledge Discovery 34:1936–1962</w:t>
       </w:r>
     </w:p>
-    <w:bookmarkEnd w:id="121"/>
-    <w:bookmarkStart w:id="123" w:name="ref-iwana2021"/>
+    <w:bookmarkEnd w:id="125"/>
+    <w:bookmarkStart w:id="127" w:name="ref-iwana2021"/>
     <w:p>
       <w:pPr>
         <w:pStyle w:val="Bibliography"/>
@@ -13092,7 +13149,7 @@
       <w:r>
         <w:t xml:space="preserve"> </w:t>
       </w:r>
-      <w:hyperlink r:id="rId122">
+      <w:hyperlink r:id="rId126">
         <w:r>
           <w:rPr>
             <w:rStyle w:val="Hyperlink"/>
@@ -13104,8 +13161,8 @@
         <w:t xml:space="preserve">. PLOS ONE 16:e0254841</w:t>
       </w:r>
     </w:p>
-    <w:bookmarkEnd w:id="123"/>
-    <w:bookmarkStart w:id="125" w:name="ref-kerby2014"/>
+    <w:bookmarkEnd w:id="127"/>
+    <w:bookmarkStart w:id="129" w:name="ref-kerby2014"/>
     <w:p>
       <w:pPr>
         <w:pStyle w:val="Bibliography"/>
@@ -13116,7 +13173,7 @@
       <w:r>
         <w:t xml:space="preserve"> </w:t>
       </w:r>
-      <w:hyperlink r:id="rId124">
+      <w:hyperlink r:id="rId128">
         <w:r>
           <w:rPr>
             <w:rStyle w:val="Hyperlink"/>
@@ -13128,8 +13185,8 @@
         <w:t xml:space="preserve">. Comprehensive Psychology 3:11.IT.3.1</w:t>
       </w:r>
     </w:p>
-    <w:bookmarkEnd w:id="125"/>
-    <w:bookmarkStart w:id="126" w:name="ref-kristiadi2020"/>
+    <w:bookmarkEnd w:id="129"/>
+    <w:bookmarkStart w:id="130" w:name="ref-kristiadi2020"/>
     <w:p>
       <w:pPr>
         <w:pStyle w:val="Bibliography"/>
@@ -13138,8 +13195,8 @@
         <w:t xml:space="preserve">Kristiadi A, Hein M, Hennig P (2020) Being Bayesian, even just a bit, fixes overconfidence in ReLU networks. In: Proceedings of the 37th International Conference on Machine Learning. pp 5436–5446</w:t>
       </w:r>
     </w:p>
-    <w:bookmarkEnd w:id="126"/>
-    <w:bookmarkStart w:id="127" w:name="ref-kull2019"/>
+    <w:bookmarkEnd w:id="130"/>
+    <w:bookmarkStart w:id="131" w:name="ref-kull2019"/>
     <w:p>
       <w:pPr>
         <w:pStyle w:val="Bibliography"/>
@@ -13148,8 +13205,8 @@
         <w:t xml:space="preserve">Kull M, Perello-Nieto M, Kängsepp M, et al (2019) Beyond temperature scaling: obtaining well-calibrated multi-class probabilities with Dirichlet calibration. In: Advances in Neural Information Processing Systems</w:t>
       </w:r>
     </w:p>
-    <w:bookmarkEnd w:id="127"/>
-    <w:bookmarkStart w:id="128" w:name="ref-lakshminarayanan2017"/>
+    <w:bookmarkEnd w:id="131"/>
+    <w:bookmarkStart w:id="132" w:name="ref-lakshminarayanan2017"/>
     <w:p>
       <w:pPr>
         <w:pStyle w:val="Bibliography"/>
@@ -13158,8 +13215,8 @@
         <w:t xml:space="preserve">Lakshminarayanan B, Pritzel A, Blundell C (2017) Simple and scalable predictive uncertainty estimation using deep ensembles. In: Advances in Neural Information Processing Systems</w:t>
       </w:r>
     </w:p>
-    <w:bookmarkEnd w:id="128"/>
-    <w:bookmarkStart w:id="130" w:name="ref-lei2018"/>
+    <w:bookmarkEnd w:id="132"/>
+    <w:bookmarkStart w:id="134" w:name="ref-lei2018"/>
     <w:p>
       <w:pPr>
         <w:pStyle w:val="Bibliography"/>
@@ -13170,7 +13227,7 @@
       <w:r>
         <w:t xml:space="preserve"> </w:t>
       </w:r>
-      <w:hyperlink r:id="rId129">
+      <w:hyperlink r:id="rId133">
         <w:r>
           <w:rPr>
             <w:rStyle w:val="Hyperlink"/>
@@ -13182,8 +13239,8 @@
         <w:t xml:space="preserve">. Journal of the American Statistical Association 113:1094–1111</w:t>
       </w:r>
     </w:p>
-    <w:bookmarkEnd w:id="130"/>
-    <w:bookmarkStart w:id="131" w:name="ref-liu2020sngp"/>
+    <w:bookmarkEnd w:id="134"/>
+    <w:bookmarkStart w:id="135" w:name="ref-liu2020sngp"/>
     <w:p>
       <w:pPr>
         <w:pStyle w:val="Bibliography"/>
@@ -13192,8 +13249,8 @@
         <w:t xml:space="preserve">Liu JZ, Lin Z, Padhy S, et al (2020) Simple and principled uncertainty estimation with deterministic deep learning via distance awareness. In: Advances in Neural Information Processing Systems</w:t>
       </w:r>
     </w:p>
-    <w:bookmarkEnd w:id="131"/>
-    <w:bookmarkStart w:id="132" w:name="ref-liu2023sngp"/>
+    <w:bookmarkEnd w:id="135"/>
+    <w:bookmarkStart w:id="136" w:name="ref-liu2023sngp"/>
     <w:p>
       <w:pPr>
         <w:pStyle w:val="Bibliography"/>
@@ -13202,8 +13259,8 @@
         <w:t xml:space="preserve">Liu JZ, Padhy S, Ren J, et al (2023) A simple approach to improve single-model deep uncertainty via distance-awareness. Journal of Machine Learning Research 24:1–63</w:t>
       </w:r>
     </w:p>
-    <w:bookmarkEnd w:id="132"/>
-    <w:bookmarkStart w:id="134" w:name="ref-mackay1992"/>
+    <w:bookmarkEnd w:id="136"/>
+    <w:bookmarkStart w:id="138" w:name="ref-mackay1992"/>
     <w:p>
       <w:pPr>
         <w:pStyle w:val="Bibliography"/>
@@ -13214,7 +13271,7 @@
       <w:r>
         <w:t xml:space="preserve"> </w:t>
       </w:r>
-      <w:hyperlink r:id="rId133">
+      <w:hyperlink r:id="rId137">
         <w:r>
           <w:rPr>
             <w:rStyle w:val="Hyperlink"/>
@@ -13226,8 +13283,8 @@
         <w:t xml:space="preserve">. Neural Computation 4:720–736</w:t>
       </w:r>
     </w:p>
-    <w:bookmarkEnd w:id="134"/>
-    <w:bookmarkStart w:id="135" w:name="ref-aeon2024"/>
+    <w:bookmarkEnd w:id="138"/>
+    <w:bookmarkStart w:id="139" w:name="ref-aeon2024"/>
     <w:p>
       <w:pPr>
         <w:pStyle w:val="Bibliography"/>
@@ -13236,8 +13293,8 @@
         <w:t xml:space="preserve">Middlehurst M, Ismail-Fawaz A, Guillaume A, et al (2024a) aeon: a Python toolkit for learning from time series. Journal of Machine Learning Research 25:1–10</w:t>
       </w:r>
     </w:p>
-    <w:bookmarkEnd w:id="135"/>
-    <w:bookmarkStart w:id="137" w:name="ref-middlehurst2021hc2"/>
+    <w:bookmarkEnd w:id="139"/>
+    <w:bookmarkStart w:id="141" w:name="ref-middlehurst2021hc2"/>
     <w:p>
       <w:pPr>
         <w:pStyle w:val="Bibliography"/>
@@ -13248,7 +13305,7 @@
       <w:r>
         <w:t xml:space="preserve"> </w:t>
       </w:r>
-      <w:hyperlink r:id="rId136">
+      <w:hyperlink r:id="rId140">
         <w:r>
           <w:rPr>
             <w:rStyle w:val="Hyperlink"/>
@@ -13260,8 +13317,8 @@
         <w:t xml:space="preserve">. Machine Learning 110:3211–3243</w:t>
       </w:r>
     </w:p>
-    <w:bookmarkEnd w:id="137"/>
-    <w:bookmarkStart w:id="139" w:name="ref-middlehurst2024bakeoff"/>
+    <w:bookmarkEnd w:id="141"/>
+    <w:bookmarkStart w:id="143" w:name="ref-middlehurst2024bakeoff"/>
     <w:p>
       <w:pPr>
         <w:pStyle w:val="Bibliography"/>
@@ -13272,7 +13329,7 @@
       <w:r>
         <w:t xml:space="preserve"> </w:t>
       </w:r>
-      <w:hyperlink r:id="rId138">
+      <w:hyperlink r:id="rId142">
         <w:r>
           <w:rPr>
             <w:rStyle w:val="Hyperlink"/>
@@ -13284,8 +13341,8 @@
         <w:t xml:space="preserve">. Data Mining and Knowledge Discovery 38:1958–2031</w:t>
       </w:r>
     </w:p>
-    <w:bookmarkEnd w:id="139"/>
-    <w:bookmarkStart w:id="141" w:name="ref-niculescu2005"/>
+    <w:bookmarkEnd w:id="143"/>
+    <w:bookmarkStart w:id="145" w:name="ref-niculescu2005"/>
     <w:p>
       <w:pPr>
         <w:pStyle w:val="Bibliography"/>
@@ -13296,7 +13353,7 @@
       <w:r>
         <w:t xml:space="preserve"> </w:t>
       </w:r>
-      <w:hyperlink r:id="rId140">
+      <w:hyperlink r:id="rId144">
         <w:r>
           <w:rPr>
             <w:rStyle w:val="Hyperlink"/>
@@ -13308,8 +13365,8 @@
         <w:t xml:space="preserve">. Proceedings of the 22nd international conference on Machine learning - ICML ’05 625–632</w:t>
       </w:r>
     </w:p>
-    <w:bookmarkEnd w:id="141"/>
-    <w:bookmarkStart w:id="142" w:name="ref-nouretdinov2001"/>
+    <w:bookmarkEnd w:id="145"/>
+    <w:bookmarkStart w:id="146" w:name="ref-nouretdinov2001"/>
     <w:p>
       <w:pPr>
         <w:pStyle w:val="Bibliography"/>
@@ -13318,8 +13375,8 @@
         <w:t xml:space="preserve">Nouretdinov I, Melluish T, Vovk V (2001) Ridge regression confidence machine. In: Proceedings of the 18th International Conference on Machine Learning. Morgan Kaufmann, San Francisco, pp 385–392</w:t>
       </w:r>
     </w:p>
-    <w:bookmarkEnd w:id="142"/>
-    <w:bookmarkStart w:id="143" w:name="ref-ovadia2019"/>
+    <w:bookmarkEnd w:id="146"/>
+    <w:bookmarkStart w:id="147" w:name="ref-ovadia2019"/>
     <w:p>
       <w:pPr>
         <w:pStyle w:val="Bibliography"/>
@@ -13328,8 +13385,8 @@
         <w:t xml:space="preserve">Ovadia Y, Fertig E, Ren J, et al (2019) Can you trust your model’s uncertainty? Evaluating predictive uncertainty under dataset shift. In: Advances in Neural Information Processing Systems</w:t>
       </w:r>
     </w:p>
-    <w:bookmarkEnd w:id="143"/>
-    <w:bookmarkStart w:id="144" w:name="ref-pedregosa2011"/>
+    <w:bookmarkEnd w:id="147"/>
+    <w:bookmarkStart w:id="148" w:name="ref-pedregosa2011"/>
     <w:p>
       <w:pPr>
         <w:pStyle w:val="Bibliography"/>
@@ -13338,8 +13395,8 @@
         <w:t xml:space="preserve">Pedregosa F, Varoquaux G, Gramfort A, et al (2011) Scikit-learn: machine learning in Python. Journal of Machine Learning Research 12:2825–2830</w:t>
       </w:r>
     </w:p>
-    <w:bookmarkEnd w:id="144"/>
-    <w:bookmarkStart w:id="145" w:name="ref-platt1999"/>
+    <w:bookmarkEnd w:id="148"/>
+    <w:bookmarkStart w:id="149" w:name="ref-platt1999"/>
     <w:p>
       <w:pPr>
         <w:pStyle w:val="Bibliography"/>
@@ -13348,8 +13405,8 @@
         <w:t xml:space="preserve">Platt JC (2000) Probabilistic outputs for support vector machines and comparisons to regularized likelihood methods. In: Smola AJ, Bartlett P, Schölkopf B, Schuurmans D (eds) Advances in Large Margin Classifiers. MIT Press, Cambridge, MA, pp 61–74</w:t>
       </w:r>
     </w:p>
-    <w:bookmarkEnd w:id="145"/>
-    <w:bookmarkStart w:id="147" w:name="ref-ragab2023"/>
+    <w:bookmarkEnd w:id="149"/>
+    <w:bookmarkStart w:id="151" w:name="ref-ragab2023"/>
     <w:p>
       <w:pPr>
         <w:pStyle w:val="Bibliography"/>
@@ -13360,7 +13417,7 @@
       <w:r>
         <w:t xml:space="preserve"> </w:t>
       </w:r>
-      <w:hyperlink r:id="rId146">
+      <w:hyperlink r:id="rId150">
         <w:r>
           <w:rPr>
             <w:rStyle w:val="Hyperlink"/>
@@ -13372,8 +13429,8 @@
         <w:t xml:space="preserve">. ACM Transactions on Knowledge Discovery from Data 17:1–18</w:t>
       </w:r>
     </w:p>
-    <w:bookmarkEnd w:id="147"/>
-    <w:bookmarkStart w:id="148" w:name="ref-romano2020"/>
+    <w:bookmarkEnd w:id="151"/>
+    <w:bookmarkStart w:id="152" w:name="ref-romano2020"/>
     <w:p>
       <w:pPr>
         <w:pStyle w:val="Bibliography"/>
@@ -13382,8 +13439,8 @@
         <w:t xml:space="preserve">Romano Y, Sesia M, Candès EJ (2020) Classification with valid and adaptive coverage. In: Advances in Neural Information Processing Systems</w:t>
       </w:r>
     </w:p>
-    <w:bookmarkEnd w:id="148"/>
-    <w:bookmarkStart w:id="150" w:name="ref-ruiz2021"/>
+    <w:bookmarkEnd w:id="152"/>
+    <w:bookmarkStart w:id="154" w:name="ref-ruiz2021"/>
     <w:p>
       <w:pPr>
         <w:pStyle w:val="Bibliography"/>
@@ -13394,7 +13451,7 @@
       <w:r>
         <w:t xml:space="preserve"> </w:t>
       </w:r>
-      <w:hyperlink r:id="rId149">
+      <w:hyperlink r:id="rId153">
         <w:r>
           <w:rPr>
             <w:rStyle w:val="Hyperlink"/>
@@ -13406,8 +13463,8 @@
         <w:t xml:space="preserve">. Data Mining and Knowledge Discovery 35:401–449</w:t>
       </w:r>
     </w:p>
-    <w:bookmarkEnd w:id="150"/>
-    <w:bookmarkStart w:id="152" w:name="ref-sadinle2019"/>
+    <w:bookmarkEnd w:id="154"/>
+    <w:bookmarkStart w:id="156" w:name="ref-sadinle2019"/>
     <w:p>
       <w:pPr>
         <w:pStyle w:val="Bibliography"/>
@@ -13418,7 +13475,7 @@
       <w:r>
         <w:t xml:space="preserve"> </w:t>
       </w:r>
-      <w:hyperlink r:id="rId151">
+      <w:hyperlink r:id="rId155">
         <w:r>
           <w:rPr>
             <w:rStyle w:val="Hyperlink"/>
@@ -13430,8 +13487,8 @@
         <w:t xml:space="preserve">. Journal of the American Statistical Association 114:223–234</w:t>
       </w:r>
     </w:p>
-    <w:bookmarkEnd w:id="152"/>
-    <w:bookmarkStart w:id="154" w:name="ref-silvafilho2023"/>
+    <w:bookmarkEnd w:id="156"/>
+    <w:bookmarkStart w:id="158" w:name="ref-silvafilho2023"/>
     <w:p>
       <w:pPr>
         <w:pStyle w:val="Bibliography"/>
@@ -13442,7 +13499,7 @@
       <w:r>
         <w:t xml:space="preserve"> </w:t>
       </w:r>
-      <w:hyperlink r:id="rId153">
+      <w:hyperlink r:id="rId157">
         <w:r>
           <w:rPr>
             <w:rStyle w:val="Hyperlink"/>
@@ -13454,8 +13511,8 @@
         <w:t xml:space="preserve">. Machine Learning 112:3211–3260</w:t>
       </w:r>
     </w:p>
-    <w:bookmarkEnd w:id="154"/>
-    <w:bookmarkStart w:id="156" w:name="ref-suykens1999"/>
+    <w:bookmarkEnd w:id="158"/>
+    <w:bookmarkStart w:id="160" w:name="ref-suykens1999"/>
     <w:p>
       <w:pPr>
         <w:pStyle w:val="Bibliography"/>
@@ -13466,7 +13523,7 @@
       <w:r>
         <w:t xml:space="preserve"> </w:t>
       </w:r>
-      <w:hyperlink r:id="rId155">
+      <w:hyperlink r:id="rId159">
         <w:r>
           <w:rPr>
             <w:rStyle w:val="Hyperlink"/>
@@ -13478,8 +13535,8 @@
         <w:t xml:space="preserve">. Neural Processing Letters 9:293–300</w:t>
       </w:r>
     </w:p>
-    <w:bookmarkEnd w:id="156"/>
-    <w:bookmarkStart w:id="158" w:name="ref-tan2022multirocket"/>
+    <w:bookmarkEnd w:id="160"/>
+    <w:bookmarkStart w:id="162" w:name="ref-tan2022multirocket"/>
     <w:p>
       <w:pPr>
         <w:pStyle w:val="Bibliography"/>
@@ -13490,7 +13547,7 @@
       <w:r>
         <w:t xml:space="preserve"> </w:t>
       </w:r>
-      <w:hyperlink r:id="rId157">
+      <w:hyperlink r:id="rId161">
         <w:r>
           <w:rPr>
             <w:rStyle w:val="Hyperlink"/>
@@ -13502,8 +13559,8 @@
         <w:t xml:space="preserve">. Data Mining and Knowledge Discovery 36:1623–1646</w:t>
       </w:r>
     </w:p>
-    <w:bookmarkEnd w:id="158"/>
-    <w:bookmarkStart w:id="160" w:name="ref-tibshirani2002"/>
+    <w:bookmarkEnd w:id="162"/>
+    <w:bookmarkStart w:id="164" w:name="ref-tibshirani2002"/>
     <w:p>
       <w:pPr>
         <w:pStyle w:val="Bibliography"/>
@@ -13514,7 +13571,7 @@
       <w:r>
         <w:t xml:space="preserve"> </w:t>
       </w:r>
-      <w:hyperlink r:id="rId159">
+      <w:hyperlink r:id="rId163">
         <w:r>
           <w:rPr>
             <w:rStyle w:val="Hyperlink"/>
@@ -13526,8 +13583,8 @@
         <w:t xml:space="preserve">. Statistical Applications in Genetics and Molecular Biology 1</w:t>
       </w:r>
     </w:p>
-    <w:bookmarkEnd w:id="160"/>
-    <w:bookmarkStart w:id="162" w:name="ref-um2017"/>
+    <w:bookmarkEnd w:id="164"/>
+    <w:bookmarkStart w:id="166" w:name="ref-um2017"/>
     <w:p>
       <w:pPr>
         <w:pStyle w:val="Bibliography"/>
@@ -13538,7 +13595,7 @@
       <w:r>
         <w:t xml:space="preserve"> </w:t>
       </w:r>
-      <w:hyperlink r:id="rId161">
+      <w:hyperlink r:id="rId165">
         <w:r>
           <w:rPr>
             <w:rStyle w:val="Hyperlink"/>
@@ -13550,8 +13607,8 @@
         <w:t xml:space="preserve">. Proceedings of the 19th ACM International Conference on Multimodal Interaction 216–220</w:t>
       </w:r>
     </w:p>
-    <w:bookmarkEnd w:id="162"/>
-    <w:bookmarkStart w:id="163" w:name="ref-vanamersfoort2020"/>
+    <w:bookmarkEnd w:id="166"/>
+    <w:bookmarkStart w:id="167" w:name="ref-vanamersfoort2020"/>
     <w:p>
       <w:pPr>
         <w:pStyle w:val="Bibliography"/>
@@ -13560,8 +13617,8 @@
         <w:t xml:space="preserve">van Amersfoort J, Smith L, Teh YW, Gal Y (2020) Uncertainty estimation using a single deep deterministic neural network. In: Proceedings of the 37th International Conference on Machine Learning. pp 9690–9700</w:t>
       </w:r>
     </w:p>
-    <w:bookmarkEnd w:id="163"/>
-    <w:bookmarkStart w:id="165" w:name="ref-vovk2022"/>
+    <w:bookmarkEnd w:id="167"/>
+    <w:bookmarkStart w:id="169" w:name="ref-vovk2022"/>
     <w:p>
       <w:pPr>
         <w:pStyle w:val="Bibliography"/>
@@ -13572,7 +13629,7 @@
       <w:r>
         <w:t xml:space="preserve"> </w:t>
       </w:r>
-      <w:hyperlink r:id="rId164">
+      <w:hyperlink r:id="rId168">
         <w:r>
           <w:rPr>
             <w:rStyle w:val="Hyperlink"/>
@@ -13584,8 +13641,8 @@
         <w:t xml:space="preserve">. Springer International Publishing</w:t>
       </w:r>
     </w:p>
-    <w:bookmarkEnd w:id="165"/>
-    <w:bookmarkStart w:id="167" w:name="ref-wilcoxon1945"/>
+    <w:bookmarkEnd w:id="169"/>
+    <w:bookmarkStart w:id="171" w:name="ref-wilcoxon1945"/>
     <w:p>
       <w:pPr>
         <w:pStyle w:val="Bibliography"/>
@@ -13596,7 +13653,7 @@
       <w:r>
         <w:t xml:space="preserve"> </w:t>
       </w:r>
-      <w:hyperlink r:id="rId166">
+      <w:hyperlink r:id="rId170">
         <w:r>
           <w:rPr>
             <w:rStyle w:val="Hyperlink"/>
@@ -13608,8 +13665,8 @@
         <w:t xml:space="preserve">. Biometrics Bulletin 1:80</w:t>
       </w:r>
     </w:p>
-    <w:bookmarkEnd w:id="167"/>
-    <w:bookmarkStart w:id="169" w:name="ref-xu2023"/>
+    <w:bookmarkEnd w:id="171"/>
+    <w:bookmarkStart w:id="173" w:name="ref-xu2023"/>
     <w:p>
       <w:pPr>
         <w:pStyle w:val="Bibliography"/>
@@ -13620,7 +13677,7 @@
       <w:r>
         <w:t xml:space="preserve"> </w:t>
       </w:r>
-      <w:hyperlink r:id="rId168">
+      <w:hyperlink r:id="rId172">
         <w:r>
           <w:rPr>
             <w:rStyle w:val="Hyperlink"/>
@@ -13632,8 +13689,8 @@
         <w:t xml:space="preserve">. IEEE Transactions on Pattern Analysis and Machine Intelligence 45:11575–11587</w:t>
       </w:r>
     </w:p>
-    <w:bookmarkEnd w:id="169"/>
-    <w:bookmarkStart w:id="171" w:name="ref-zadrozny2002"/>
+    <w:bookmarkEnd w:id="173"/>
+    <w:bookmarkStart w:id="175" w:name="ref-zadrozny2002"/>
     <w:p>
       <w:pPr>
         <w:pStyle w:val="Bibliography"/>
@@ -13644,7 +13701,7 @@
       <w:r>
         <w:t xml:space="preserve"> </w:t>
       </w:r>
-      <w:hyperlink r:id="rId170">
+      <w:hyperlink r:id="rId174">
         <w:r>
           <w:rPr>
             <w:rStyle w:val="Hyperlink"/>
@@ -13656,10 +13713,10 @@
         <w:t xml:space="preserve">. Proceedings of the eighth ACM SIGKDD international conference on Knowledge discovery and data mining 694–699</w:t>
       </w:r>
     </w:p>
-    <w:bookmarkEnd w:id="171"/>
-    <w:bookmarkEnd w:id="172"/>
-    <w:bookmarkEnd w:id="173"/>
-    <w:bookmarkStart w:id="174" w:name="statements-and-declarations"/>
+    <w:bookmarkEnd w:id="175"/>
+    <w:bookmarkEnd w:id="176"/>
+    <w:bookmarkEnd w:id="177"/>
+    <w:bookmarkStart w:id="178" w:name="statements-and-declarations"/>
     <w:p>
       <w:pPr>
         <w:pStyle w:val="Heading1"/>
@@ -13842,7 +13899,7 @@
         <w:t xml:space="preserve">Not applicable. The study uses only publicly available, de-identified benchmark data.</w:t>
       </w:r>
     </w:p>
-    <w:bookmarkEnd w:id="174"/>
+    <w:bookmarkEnd w:id="178"/>
     <w:sectPr>
       <w:footerReference w:type="default" r:id="rId9"/>
       <w:pgSz w:h="16838" w:w="11906"/>

</xml_diff>